<commit_message>
Paper v2 (review fixes)
Co-Authored-By: Claude Sonnet 5.5 <noreply@anthropic.com>
Claude-Session: https://claude.ai/code/session_013MWEbKStV7gCMmHJrttV1T
</commit_message>
<xml_diff>
--- a/paper/paper.docx
+++ b/paper/paper.docx
@@ -101,7 +101,7 @@
           <w:sz w:val="18"/>
           <w:szCs w:val="18"/>
         </w:rPr>
-        <w:t xml:space="preserve">Industrial IoT (IIoT) networks need continuous, per-request verification, but placing a blockchain on the authentication path adds seconds of latency and saturates ledger capacity. We propose BC-ZTA, a three-tier blockchain-assisted zero-trust architecture in which edge policy enforcement points decide from cached, Merkle-verified ledger state, while identity, trust and audit updates are written asynchronously to a permissioned Hyperledger Besu (IBFT 2.0) network through four Solidity contracts. We implemented the policy enforcement point and five baselines, including real Keycloak and OpenLDAP services, and measured them end to end on a four-validator Besu network (five repetitions, seven cloud VMs). At 50 devices BC-ZTA answers in 5.4 ms on average, compared with 49.1 ms for a centralised directory with an injected 40 ms network delay and 1382 ms when every request is an on-chain transaction; the synchronous design answers only 40% of the requests at 200 devices, whereas BC-ZTA served 200 devices with no failures and about one on-chain write per second, and kept deciding while one of the four validators was stopped. Event-driven cache invalidation enforces a revocation in 1.3 s on average, and all 1750 forged, replayed, stale, unregistered, tampered or policy-violating requests were rejected. Merkle batch anchoring cuts audit gas per record by about 1351×. Against real Keycloak and OpenLDAP services, BC-ZTA decides 8× faster at 100 devices and keeps granting access when they are down, but revokes in 1.3 s rather than about 84 ms, and its ledger-independent latency (P95 ≤ 8 ms) holds when the ledger is flooded up to 1,200 tx/s. Limitations are the single cloud zone with injected network delay, single-node IAM products, a single-process PEP and the emulated device population.</w:t>
+        <w:t xml:space="preserve">Industrial IoT (IIoT) networks need continuous, per-request verification, but placing a blockchain on the authentication path adds seconds of latency and saturates ledger capacity. We propose BC-ZTA, a three-tier blockchain-assisted zero-trust architecture in which edge policy enforcement points decide from cached, Merkle-verified ledger state, while identity, trust and audit updates are written asynchronously to a permissioned Hyperledger Besu (IBFT 2.0) network through four Solidity contracts. We implemented the policy enforcement point and five baselines, including real Keycloak and OpenLDAP services, and measured them end to end on a four-validator Besu network (five repetitions, seven cloud VMs). At 50 devices BC-ZTA answers in 5.4 ms on average, compared with 49.1 ms for a centralised directory with an injected 40 ms network delay and 1382 ms when every request is an on-chain transaction; the synchronous design answers only 40% of the requests at 200 devices, whereas BC-ZTA served 200 devices with no failures and about one on-chain write per second, and kept deciding while one of the four validators was stopped. Event-driven cache invalidation enforces a revocation in 1.3 s on average, and all 1750 forged, replayed, stale, unregistered, tampered or policy-violating requests were rejected. Merkle batch anchoring cuts audit gas per record by 68× to 1351× for batches of 50 to 1,000 records. Against real Keycloak and OpenLDAP services, BC-ZTA decides 8× faster at 100 devices and keeps granting access when they are down, but revokes in 1.3 s rather than about 84 ms, and its ledger-independent latency (P95 ≤ 8 ms) holds when the ledger is flooded up to 1,200 tx/s. Limitations are the single cloud zone with injected network delay, single-node IAM products, a single-process PEP and the emulated device population.</w:t>
       </w:r>
     </w:p>
     <w:p>
@@ -793,7 +793,7 @@
           <w:sz w:val="20"/>
           <w:szCs w:val="20"/>
         </w:rPr>
-        <w:t xml:space="preserve">We aim to (O1) design a blockchain-assisted ZTA whose per-request decisions do not wait for consensus; (O2) bound the resulting staleness of revocation and trust state; (O3) make audit anchoring cost sub-linear in the event rate; and (O4) evaluate latency, on-chain load, gas cost and revocation delay against three baselines.</w:t>
+        <w:t xml:space="preserve">We aim to (O1) design a blockchain-assisted ZTA whose per-request decisions do not wait for consensus; (O2) bound the resulting staleness of revocation and trust state; (O3) make audit anchoring cost sub-linear in the event rate; and (O4) evaluate latency, on-chain load, gas cost and revocation delay against five baselines, two of them real identity products.</w:t>
       </w:r>
     </w:p>
     <w:p>
@@ -927,7 +927,7 @@
           <w:sz w:val="20"/>
           <w:szCs w:val="20"/>
         </w:rPr>
-        <w:t xml:space="preserve"> A running PEP/PDP service, three baselines (centralised PKI-IAM, local ABAC, blockchain-synchronous) and a load generator, evaluated on a seven-VM Google Cloud deployment with a four-validator Hyperledger Besu IBFT 2.0 network in five repetitions: latency and goodput up to 200 devices, revocation delay, security tests, a validator-failure test and gas (Sections 5–6).</w:t>
+        <w:t xml:space="preserve"> A running PEP/PDP service, five baselines (a centralised directory, local ABAC, a synchronous blockchain, and real Keycloak and OpenLDAP services, the latter two with and without PEP-side caching) and a load generator, evaluated on a seven-VM Google Cloud deployment with a four-validator Hyperledger Besu IBFT 2.0 network in five repetitions: latency and goodput up to 200 devices, revocation delay, security tests, a validator-failure test, a central-service outage test, a ledger-flood sweep and gas (Sections 5–6).</w:t>
       </w:r>
     </w:p>
     <w:p>
@@ -952,6 +952,39 @@
           <w:sz w:val="20"/>
           <w:szCs w:val="20"/>
         </w:rPr>
+        <w:t xml:space="preserve">Security analysis and limits.</w:t>
+      </w:r>
+      <w:r>
+        <w:rPr>
+          <w:rFonts w:ascii="Times New Roman" w:cs="Times New Roman" w:eastAsia="Times New Roman" w:hAnsi="Times New Roman"/>
+          <w:sz w:val="20"/>
+          <w:szCs w:val="20"/>
+        </w:rPr>
+        <w:t xml:space="preserve"> A property-by-property argument under explicit assumptions, with the residual risks we found (replay across gateways, trust in a single ledger node, audit completeness; Section IV-F), and a measured comparison that shows where the ledger does and does not help (Section VI-H).</w:t>
+      </w:r>
+    </w:p>
+    <w:p>
+      <w:pPr>
+        <w:spacing w:after="30" w:before="0" w:line="228"/>
+        <w:ind w:left="200" w:hanging="200"/>
+        <w:jc w:val="both"/>
+      </w:pPr>
+      <w:r>
+        <w:rPr>
+          <w:rFonts w:ascii="Times New Roman" w:cs="Times New Roman" w:eastAsia="Times New Roman" w:hAnsi="Times New Roman"/>
+          <w:sz w:val="20"/>
+          <w:szCs w:val="20"/>
+        </w:rPr>
+        <w:t xml:space="preserve">•  </w:t>
+      </w:r>
+      <w:r>
+        <w:rPr>
+          <w:rFonts w:ascii="Times New Roman" w:cs="Times New Roman" w:eastAsia="Times New Roman" w:hAnsi="Times New Roman"/>
+          <w:b/>
+          <w:bCs/>
+          <w:sz w:val="20"/>
+          <w:szCs w:val="20"/>
+        </w:rPr>
         <w:t xml:space="preserve">Bounded-staleness analysis.</w:t>
       </w:r>
       <w:r>
@@ -1627,7 +1660,214 @@
           <w:sz w:val="20"/>
           <w:szCs w:val="20"/>
         </w:rPr>
-        <w:t xml:space="preserve">D. Comparative Analysis</w:t>
+        <w:t xml:space="preserve">D. Non-Blockchain Foundations and Alternatives</w:t>
+      </w:r>
+    </w:p>
+    <w:p>
+      <w:pPr>
+        <w:spacing w:after="60" w:before="0" w:line="228"/>
+        <w:jc w:val="both"/>
+      </w:pPr>
+      <w:r>
+        <w:rPr>
+          <w:rFonts w:ascii="Times New Roman" w:cs="Times New Roman" w:eastAsia="Times New Roman" w:hAnsi="Times New Roman"/>
+          <w:sz w:val="20"/>
+          <w:szCs w:val="20"/>
+        </w:rPr>
+        <w:t xml:space="preserve">Several mechanisms used here, and several competing designs, do not need a blockchain. Revocation on the web is handled by CRLs </w:t>
+      </w:r>
+      <w:r>
+        <w:rPr>
+          <w:rFonts w:ascii="Times New Roman" w:cs="Times New Roman" w:eastAsia="Times New Roman" w:hAnsi="Times New Roman"/>
+          <w:sz w:val="20"/>
+          <w:szCs w:val="20"/>
+        </w:rPr>
+        <w:t xml:space="preserve">[31]</w:t>
+      </w:r>
+      <w:r>
+        <w:rPr>
+          <w:rFonts w:ascii="Times New Roman" w:cs="Times New Roman" w:eastAsia="Times New Roman" w:hAnsi="Times New Roman"/>
+          <w:sz w:val="20"/>
+          <w:szCs w:val="20"/>
+        </w:rPr>
+        <w:t xml:space="preserve"> and OCSP </w:t>
+      </w:r>
+      <w:r>
+        <w:rPr>
+          <w:rFonts w:ascii="Times New Roman" w:cs="Times New Roman" w:eastAsia="Times New Roman" w:hAnsi="Times New Roman"/>
+          <w:sz w:val="20"/>
+          <w:szCs w:val="20"/>
+        </w:rPr>
+        <w:t xml:space="preserve">[32]</w:t>
+      </w:r>
+      <w:r>
+        <w:rPr>
+          <w:rFonts w:ascii="Times New Roman" w:cs="Times New Roman" w:eastAsia="Times New Roman" w:hAnsi="Times New Roman"/>
+          <w:sz w:val="20"/>
+          <w:szCs w:val="20"/>
+        </w:rPr>
+        <w:t xml:space="preserve">, where a server can staple a signed status response to the handshake </w:t>
+      </w:r>
+      <w:r>
+        <w:rPr>
+          <w:rFonts w:ascii="Times New Roman" w:cs="Times New Roman" w:eastAsia="Times New Roman" w:hAnsi="Times New Roman"/>
+          <w:sz w:val="20"/>
+          <w:szCs w:val="20"/>
+        </w:rPr>
+        <w:t xml:space="preserve">[33]</w:t>
+      </w:r>
+      <w:r>
+        <w:rPr>
+          <w:rFonts w:ascii="Times New Roman" w:cs="Times New Roman" w:eastAsia="Times New Roman" w:hAnsi="Times New Roman"/>
+          <w:sz w:val="20"/>
+          <w:szCs w:val="20"/>
+        </w:rPr>
+        <w:t xml:space="preserve">; a central authority that pushes signed revocations to edge enforcement points is therefore a natural alternative to event-driven invalidation from a ledger. Audit logs that can be checked by third parties are provided by Merkle-tree transparency logs such as Certificate Transparency </w:t>
+      </w:r>
+      <w:r>
+        <w:rPr>
+          <w:rFonts w:ascii="Times New Roman" w:cs="Times New Roman" w:eastAsia="Times New Roman" w:hAnsi="Times New Roman"/>
+          <w:sz w:val="20"/>
+          <w:szCs w:val="20"/>
+        </w:rPr>
+        <w:t xml:space="preserve">[34]</w:t>
+      </w:r>
+      <w:r>
+        <w:rPr>
+          <w:rFonts w:ascii="Times New Roman" w:cs="Times New Roman" w:eastAsia="Times New Roman" w:hAnsi="Times New Roman"/>
+          <w:sz w:val="20"/>
+          <w:szCs w:val="20"/>
+        </w:rPr>
+        <w:t xml:space="preserve">, which rely on log operators and monitors rather than a consensus protocol. Decentralised identifiers (DIDs) </w:t>
+      </w:r>
+      <w:r>
+        <w:rPr>
+          <w:rFonts w:ascii="Times New Roman" w:cs="Times New Roman" w:eastAsia="Times New Roman" w:hAnsi="Times New Roman"/>
+          <w:sz w:val="20"/>
+          <w:szCs w:val="20"/>
+        </w:rPr>
+        <w:t xml:space="preserve">[35]</w:t>
+      </w:r>
+      <w:r>
+        <w:rPr>
+          <w:rFonts w:ascii="Times New Roman" w:cs="Times New Roman" w:eastAsia="Times New Roman" w:hAnsi="Times New Roman"/>
+          <w:sz w:val="20"/>
+          <w:szCs w:val="20"/>
+        </w:rPr>
+        <w:t xml:space="preserve"> define identifiers whose control is separated from any registry operator, and blockchain-based access control for IoT, from FairAccess </w:t>
+      </w:r>
+      <w:r>
+        <w:rPr>
+          <w:rFonts w:ascii="Times New Roman" w:cs="Times New Roman" w:eastAsia="Times New Roman" w:hAnsi="Times New Roman"/>
+          <w:sz w:val="20"/>
+          <w:szCs w:val="20"/>
+        </w:rPr>
+        <w:t xml:space="preserve">[36]</w:t>
+      </w:r>
+      <w:r>
+        <w:rPr>
+          <w:rFonts w:ascii="Times New Roman" w:cs="Times New Roman" w:eastAsia="Times New Roman" w:hAnsi="Times New Roman"/>
+          <w:sz w:val="20"/>
+          <w:szCs w:val="20"/>
+        </w:rPr>
+        <w:t xml:space="preserve"> to scalable management architectures </w:t>
+      </w:r>
+      <w:r>
+        <w:rPr>
+          <w:rFonts w:ascii="Times New Roman" w:cs="Times New Roman" w:eastAsia="Times New Roman" w:hAnsi="Times New Roman"/>
+          <w:sz w:val="20"/>
+          <w:szCs w:val="20"/>
+        </w:rPr>
+        <w:t xml:space="preserve">[37]</w:t>
+      </w:r>
+      <w:r>
+        <w:rPr>
+          <w:rFonts w:ascii="Times New Roman" w:cs="Times New Roman" w:eastAsia="Times New Roman" w:hAnsi="Times New Roman"/>
+          <w:sz w:val="20"/>
+          <w:szCs w:val="20"/>
+        </w:rPr>
+        <w:t xml:space="preserve">, places the policy decision or the policy store on the ledger. For the ledger itself, permissioned platforms offer either execute-order-validate (Hyperledger Fabric </w:t>
+      </w:r>
+      <w:r>
+        <w:rPr>
+          <w:rFonts w:ascii="Times New Roman" w:cs="Times New Roman" w:eastAsia="Times New Roman" w:hAnsi="Times New Roman"/>
+          <w:sz w:val="20"/>
+          <w:szCs w:val="20"/>
+        </w:rPr>
+        <w:t xml:space="preserve">[38]</w:t>
+      </w:r>
+      <w:r>
+        <w:rPr>
+          <w:rFonts w:ascii="Times New Roman" w:cs="Times New Roman" w:eastAsia="Times New Roman" w:hAnsi="Times New Roman"/>
+          <w:sz w:val="20"/>
+          <w:szCs w:val="20"/>
+        </w:rPr>
+        <w:t xml:space="preserve">) or EVM-based Istanbul BFT </w:t>
+      </w:r>
+      <w:r>
+        <w:rPr>
+          <w:rFonts w:ascii="Times New Roman" w:cs="Times New Roman" w:eastAsia="Times New Roman" w:hAnsi="Times New Roman"/>
+          <w:sz w:val="20"/>
+          <w:szCs w:val="20"/>
+        </w:rPr>
+        <w:t xml:space="preserve">[39]</w:t>
+      </w:r>
+      <w:r>
+        <w:rPr>
+          <w:rFonts w:ascii="Times New Roman" w:cs="Times New Roman" w:eastAsia="Times New Roman" w:hAnsi="Times New Roman"/>
+          <w:sz w:val="20"/>
+          <w:szCs w:val="20"/>
+        </w:rPr>
+        <w:t xml:space="preserve"> on which we build; both derive from classical Byzantine agreement </w:t>
+      </w:r>
+      <w:r>
+        <w:rPr>
+          <w:rFonts w:ascii="Times New Roman" w:cs="Times New Roman" w:eastAsia="Times New Roman" w:hAnsi="Times New Roman"/>
+          <w:sz w:val="20"/>
+          <w:szCs w:val="20"/>
+        </w:rPr>
+        <w:t xml:space="preserve">[40]</w:t>
+      </w:r>
+      <w:r>
+        <w:rPr>
+          <w:rFonts w:ascii="Times New Roman" w:cs="Times New Roman" w:eastAsia="Times New Roman" w:hAnsi="Times New Roman"/>
+          <w:sz w:val="20"/>
+          <w:szCs w:val="20"/>
+        </w:rPr>
+        <w:t xml:space="preserve">. On the IIoT side, large-scale measurements of OPC UA deployments found many with missing or weak authentication </w:t>
+      </w:r>
+      <w:r>
+        <w:rPr>
+          <w:rFonts w:ascii="Times New Roman" w:cs="Times New Roman" w:eastAsia="Times New Roman" w:hAnsi="Times New Roman"/>
+          <w:sz w:val="20"/>
+          <w:szCs w:val="20"/>
+        </w:rPr>
+        <w:t xml:space="preserve">[41]</w:t>
+      </w:r>
+      <w:r>
+        <w:rPr>
+          <w:rFonts w:ascii="Times New Roman" w:cs="Times New Roman" w:eastAsia="Times New Roman" w:hAnsi="Times New Roman"/>
+          <w:sz w:val="20"/>
+          <w:szCs w:val="20"/>
+        </w:rPr>
+        <w:t xml:space="preserve">, which motivates per-device cryptographic identity (R1). We compare against central directories, real Keycloak and OpenLDAP services and, where noted, a central directory with push revocation, to test whether the ledger improves anything that such designs cannot.</w:t>
+      </w:r>
+    </w:p>
+    <w:p>
+      <w:pPr>
+        <w:keepNext/>
+        <w:spacing w:after="30" w:before="60"/>
+        <w:jc w:val="left"/>
+      </w:pPr>
+      <w:r>
+        <w:rPr>
+          <w:rFonts w:ascii="Times New Roman" w:cs="Times New Roman" w:eastAsia="Times New Roman" w:hAnsi="Times New Roman"/>
+          <w:i/>
+          <w:iCs/>
+          <w:sz w:val="20"/>
+          <w:szCs w:val="20"/>
+        </w:rPr>
+        <w:t xml:space="preserve">E. Comparative Analysis</w:t>
       </w:r>
     </w:p>
     <w:p>
@@ -3900,7 +4140,7 @@
           <w:sz w:val="20"/>
           <w:szCs w:val="20"/>
         </w:rPr>
-        <w:t xml:space="preserve">E. Research Gap</w:t>
+        <w:t xml:space="preserve">F. Research Gap</w:t>
       </w:r>
     </w:p>
     <w:p>
@@ -3914,7 +4154,7 @@
           <w:sz w:val="20"/>
           <w:szCs w:val="20"/>
         </w:rPr>
-        <w:t xml:space="preserve">No surveyed work simultaneously (a) keeps the ledger off the per-request path, (b) quantifies the revocation-staleness this causes and how to bound it, and (c) amortises audit cost via Merkle anchoring for an IIoT workload. This paper targets that combination.</w:t>
+        <w:t xml:space="preserve">No work in our (non-systematic) survey simultaneously (a) keeps the ledger off the per-request path, (b) quantifies the revocation-staleness this causes and how to bound it, and (c) amortises audit cost via Merkle anchoring for an IIoT workload. This paper targets that combination.</w:t>
       </w:r>
     </w:p>
     <w:p>
@@ -3988,7 +4228,7 @@
           <w:sz w:val="20"/>
           <w:szCs w:val="20"/>
         </w:rPr>
-        <w:t xml:space="preserve"> no single trusted party for identity, policy or logs; </w:t>
+        <w:t xml:space="preserve"> no single party that can change identity records, policy or logs without detection (a plant authority still enrols devices, Section IV-B); </w:t>
       </w:r>
       <w:r>
         <w:rPr>
@@ -4042,7 +4282,7 @@
           <w:sz w:val="20"/>
           <w:szCs w:val="20"/>
         </w:rPr>
-        <w:t xml:space="preserve"> compatibility with constrained devices (ECDSA signatures, hash proofs only).</w:t>
+        <w:t xml:space="preserve"> a device-side workload of one ECDSA signature per request and one stored Merkle path (device-side cost was not measured, Section VI-K).</w:t>
       </w:r>
     </w:p>
     <w:p>
@@ -5424,7 +5664,7 @@
           <w:sz w:val="20"/>
           <w:szCs w:val="20"/>
         </w:rPr>
-        <w:t xml:space="preserve"> has not been seen within Δ, which bounds replay; (ii) the DID is active in the cached registry, proved by a Merkle path against the latest committed epoch root or by a direct chain read on a cache miss; (iii) σ verifies under the public key whose hash is registered; and (iv) the PDP finds the trust score and policy satisfied. Otherwise the request is denied and an anomaly event is queued. As a fail-closed rule, a gateway whose cached state is older than 2·</w:t>
+        <w:t xml:space="preserve"> has not been seen within Δ, which bounds replay; (ii) the DID is active in the cached registry, proved by a Merkle path against the latest committed epoch root or by a direct chain read on a cache miss; (iii) σ verifies under the public key whose hash is registered; and (iv) the PDP finds the trust score and policy satisfied. Otherwise the request is denied and an anomaly event is queued. As a fail-closed rule, a gateway that cannot read the ledger keeps using a cached entry after its TTL for at most </w:t>
       </w:r>
       <w:r>
         <w:rPr>
@@ -5434,6 +5674,24 @@
           <w:sz w:val="20"/>
           <w:szCs w:val="20"/>
         </w:rPr>
+        <w:t xml:space="preserve">k</w:t>
+      </w:r>
+      <w:r>
+        <w:rPr>
+          <w:rFonts w:ascii="Times New Roman" w:cs="Times New Roman" w:eastAsia="Times New Roman" w:hAnsi="Times New Roman"/>
+          <w:sz w:val="20"/>
+          <w:szCs w:val="20"/>
+        </w:rPr>
+        <w:t xml:space="preserve">·</w:t>
+      </w:r>
+      <w:r>
+        <w:rPr>
+          <w:rFonts w:ascii="Times New Roman" w:cs="Times New Roman" w:eastAsia="Times New Roman" w:hAnsi="Times New Roman"/>
+          <w:i/>
+          <w:iCs/>
+          <w:sz w:val="20"/>
+          <w:szCs w:val="20"/>
+        </w:rPr>
         <w:t xml:space="preserve">TTL</w:t>
       </w:r>
       <w:r>
@@ -5442,7 +5700,200 @@
           <w:sz w:val="20"/>
           <w:szCs w:val="20"/>
         </w:rPr>
-        <w:t xml:space="preserve"> because it lost contact with the ledger refuses new sessions, while existing sessions run to their own expiry.</w:t>
+        <w:t xml:space="preserve"> after the entry was last read (</w:t>
+      </w:r>
+      <w:r>
+        <w:rPr>
+          <w:rFonts w:ascii="Times New Roman" w:cs="Times New Roman" w:eastAsia="Times New Roman" w:hAnsi="Times New Roman"/>
+          <w:i/>
+          <w:iCs/>
+          <w:sz w:val="20"/>
+          <w:szCs w:val="20"/>
+        </w:rPr>
+        <w:t xml:space="preserve">k</w:t>
+      </w:r>
+      <w:r>
+        <w:rPr>
+          <w:rFonts w:ascii="Times New Roman" w:cs="Times New Roman" w:eastAsia="Times New Roman" w:hAnsi="Times New Roman"/>
+          <w:sz w:val="20"/>
+          <w:szCs w:val="20"/>
+        </w:rPr>
+        <w:t xml:space="preserve"> = 2 by default, configuration parameter STALE_FACTOR) and denies every request that needs older state (reason “unavailable”) until the ledger is reachable again; </w:t>
+      </w:r>
+      <w:r>
+        <w:rPr>
+          <w:rFonts w:ascii="Times New Roman" w:cs="Times New Roman" w:eastAsia="Times New Roman" w:hAnsi="Times New Roman"/>
+          <w:i/>
+          <w:iCs/>
+          <w:sz w:val="20"/>
+          <w:szCs w:val="20"/>
+        </w:rPr>
+        <w:t xml:space="preserve">k</w:t>
+      </w:r>
+      <w:r>
+        <w:rPr>
+          <w:rFonts w:ascii="Times New Roman" w:cs="Times New Roman" w:eastAsia="Times New Roman" w:hAnsi="Times New Roman"/>
+          <w:sz w:val="20"/>
+          <w:szCs w:val="20"/>
+        </w:rPr>
+        <w:t xml:space="preserve"> = 1 gives strict fail-closed behaviour. A circuit breaker avoids waiting for the read timeout on every request while the source is down. The first cloud experiments (Sections 6.1–6.9) ran a prototype that denied as soon as a failed read followed TTL expiry (</w:t>
+      </w:r>
+      <w:r>
+        <w:rPr>
+          <w:rFonts w:ascii="Times New Roman" w:cs="Times New Roman" w:eastAsia="Times New Roman" w:hAnsi="Times New Roman"/>
+          <w:i/>
+          <w:iCs/>
+          <w:sz w:val="20"/>
+          <w:szCs w:val="20"/>
+        </w:rPr>
+        <w:t xml:space="preserve">k</w:t>
+      </w:r>
+      <w:r>
+        <w:rPr>
+          <w:rFonts w:ascii="Times New Roman" w:cs="Times New Roman" w:eastAsia="Times New Roman" w:hAnsi="Times New Roman"/>
+          <w:sz w:val="20"/>
+          <w:szCs w:val="20"/>
+        </w:rPr>
+        <w:t xml:space="preserve"> = 1); the </w:t>
+      </w:r>
+      <w:r>
+        <w:rPr>
+          <w:rFonts w:ascii="Times New Roman" w:cs="Times New Roman" w:eastAsia="Times New Roman" w:hAnsi="Times New Roman"/>
+          <w:i/>
+          <w:iCs/>
+          <w:sz w:val="20"/>
+          <w:szCs w:val="20"/>
+        </w:rPr>
+        <w:t xml:space="preserve">k</w:t>
+      </w:r>
+      <w:r>
+        <w:rPr>
+          <w:rFonts w:ascii="Times New Roman" w:cs="Times New Roman" w:eastAsia="Times New Roman" w:hAnsi="Times New Roman"/>
+          <w:sz w:val="20"/>
+          <w:szCs w:val="20"/>
+        </w:rPr>
+        <w:t xml:space="preserve"> = 2 rule is the one described here, and the </w:t>
+      </w:r>
+      <w:r>
+        <w:rPr>
+          <w:rFonts w:ascii="Times New Roman" w:cs="Times New Roman" w:eastAsia="Times New Roman" w:hAnsi="Times New Roman"/>
+          <w:i/>
+          <w:iCs/>
+          <w:sz w:val="20"/>
+          <w:szCs w:val="20"/>
+        </w:rPr>
+        <w:t xml:space="preserve">k</w:t>
+      </w:r>
+      <w:r>
+        <w:rPr>
+          <w:rFonts w:ascii="Times New Roman" w:cs="Times New Roman" w:eastAsia="Times New Roman" w:hAnsi="Times New Roman"/>
+          <w:sz w:val="20"/>
+          <w:szCs w:val="20"/>
+        </w:rPr>
+        <w:t xml:space="preserve"> = 2 rule is described here but was not evaluated in this version of the paper.</w:t>
+      </w:r>
+    </w:p>
+    <w:p>
+      <w:pPr>
+        <w:keepNext/>
+        <w:spacing w:after="30" w:before="60"/>
+        <w:jc w:val="left"/>
+      </w:pPr>
+      <w:r>
+        <w:rPr>
+          <w:rFonts w:ascii="Times New Roman" w:cs="Times New Roman" w:eastAsia="Times New Roman" w:hAnsi="Times New Roman"/>
+          <w:i/>
+          <w:iCs/>
+          <w:sz w:val="20"/>
+          <w:szCs w:val="20"/>
+        </w:rPr>
+        <w:t xml:space="preserve">K. Ledger Access, Revocation and Read Quorum</w:t>
+      </w:r>
+    </w:p>
+    <w:p>
+      <w:pPr>
+        <w:spacing w:after="60" w:before="0" w:line="228"/>
+        <w:jc w:val="both"/>
+      </w:pPr>
+      <w:r>
+        <w:rPr>
+          <w:rFonts w:ascii="Times New Roman" w:cs="Times New Roman" w:eastAsia="Times New Roman" w:hAnsi="Times New Roman"/>
+          <w:sz w:val="20"/>
+          <w:szCs w:val="20"/>
+        </w:rPr>
+        <w:t xml:space="preserve">A Merkle membership proof against an epoch root shows that a DID was enrolled in that epoch; it stays valid after the device is revoked and therefore says nothing about freshness. Revocation is enforced through the registry record (revoked flag), which the gateway reads on a cache miss and which the </w:t>
+      </w:r>
+      <w:r>
+        <w:rPr>
+          <w:rFonts w:ascii="Times New Roman" w:cs="Times New Roman" w:eastAsia="Times New Roman" w:hAnsi="Times New Roman"/>
+          <w:i/>
+          <w:iCs/>
+          <w:sz w:val="20"/>
+          <w:szCs w:val="20"/>
+        </w:rPr>
+        <w:t xml:space="preserve">DIDRevoked</w:t>
+      </w:r>
+      <w:r>
+        <w:rPr>
+          <w:rFonts w:ascii="Times New Roman" w:cs="Times New Roman" w:eastAsia="Times New Roman" w:hAnsi="Times New Roman"/>
+          <w:sz w:val="20"/>
+          <w:szCs w:val="20"/>
+        </w:rPr>
+        <w:t xml:space="preserve"> event invalidates. A gateway also trusts the Besu node it reads from: a compromised node could return stale or forged state. Deployments that do not run a validator at the gateway can read from </w:t>
+      </w:r>
+      <w:r>
+        <w:rPr>
+          <w:rFonts w:ascii="Times New Roman" w:cs="Times New Roman" w:eastAsia="Times New Roman" w:hAnsi="Times New Roman"/>
+          <w:i/>
+          <w:iCs/>
+          <w:sz w:val="20"/>
+          <w:szCs w:val="20"/>
+        </w:rPr>
+        <w:t xml:space="preserve">f</w:t>
+      </w:r>
+      <w:r>
+        <w:rPr>
+          <w:rFonts w:ascii="Times New Roman" w:cs="Times New Roman" w:eastAsia="Times New Roman" w:hAnsi="Times New Roman"/>
+          <w:sz w:val="20"/>
+          <w:szCs w:val="20"/>
+        </w:rPr>
+        <w:t xml:space="preserve"> + 1 nodes pinned to the same block height and accept a state only if all answers agree; any </w:t>
+      </w:r>
+      <w:r>
+        <w:rPr>
+          <w:rFonts w:ascii="Times New Roman" w:cs="Times New Roman" w:eastAsia="Times New Roman" w:hAnsi="Times New Roman"/>
+          <w:i/>
+          <w:iCs/>
+          <w:sz w:val="20"/>
+          <w:szCs w:val="20"/>
+        </w:rPr>
+        <w:t xml:space="preserve">f</w:t>
+      </w:r>
+      <w:r>
+        <w:rPr>
+          <w:rFonts w:ascii="Times New Roman" w:cs="Times New Roman" w:eastAsia="Times New Roman" w:hAnsi="Times New Roman"/>
+          <w:sz w:val="20"/>
+          <w:szCs w:val="20"/>
+        </w:rPr>
+        <w:t xml:space="preserve"> + 1 matching answers include an honest node, and IBFT 2.0 has instant finality, so there are no forks to reconcile. The prototype implements this option (parameter QUORUM = 2 for </w:t>
+      </w:r>
+      <w:r>
+        <w:rPr>
+          <w:rFonts w:ascii="Times New Roman" w:cs="Times New Roman" w:eastAsia="Times New Roman" w:hAnsi="Times New Roman"/>
+          <w:i/>
+          <w:iCs/>
+          <w:sz w:val="20"/>
+          <w:szCs w:val="20"/>
+        </w:rPr>
+        <w:t xml:space="preserve">n</w:t>
+      </w:r>
+      <w:r>
+        <w:rPr>
+          <w:rFonts w:ascii="Times New Roman" w:cs="Times New Roman" w:eastAsia="Times New Roman" w:hAnsi="Times New Roman"/>
+          <w:sz w:val="20"/>
+          <w:szCs w:val="20"/>
+        </w:rPr>
+        <w:t xml:space="preserve"> = 4); the default configuration reads from one node, and the cost of the quorum was not measured in this version of the paper.</w:t>
       </w:r>
     </w:p>
     <w:p>
@@ -6557,6 +7008,329 @@
     <w:p>
       <w:pPr>
         <w:keepNext/>
+        <w:spacing w:after="30" w:before="60"/>
+        <w:jc w:val="left"/>
+      </w:pPr>
+      <w:r>
+        <w:rPr>
+          <w:rFonts w:ascii="Times New Roman" w:cs="Times New Roman" w:eastAsia="Times New Roman" w:hAnsi="Times New Roman"/>
+          <w:i/>
+          <w:iCs/>
+          <w:sz w:val="20"/>
+          <w:szCs w:val="20"/>
+        </w:rPr>
+        <w:t xml:space="preserve">F. Security Analysis</w:t>
+      </w:r>
+    </w:p>
+    <w:p>
+      <w:pPr>
+        <w:spacing w:after="60" w:before="0" w:line="228"/>
+        <w:jc w:val="both"/>
+      </w:pPr>
+      <w:r>
+        <w:rPr>
+          <w:rFonts w:ascii="Times New Roman" w:cs="Times New Roman" w:eastAsia="Times New Roman" w:hAnsi="Times New Roman"/>
+          <w:sz w:val="20"/>
+          <w:szCs w:val="20"/>
+        </w:rPr>
+        <w:t xml:space="preserve">We argue each goal under the assumptions of Sections 4.2–4.3 plus: ECDSA over secp256k1 is existentially unforgeable under chosen-message attack, Keccak-256 is collision- and second-preimage-resistant, device clocks and gateway clocks differ by less than Δ/2, and the enrolment authority registers only genuine devices. These are proof sketches, not machine-checked proofs; a ProVerif </w:t>
+      </w:r>
+      <w:r>
+        <w:rPr>
+          <w:rFonts w:ascii="Times New Roman" w:cs="Times New Roman" w:eastAsia="Times New Roman" w:hAnsi="Times New Roman"/>
+          <w:sz w:val="20"/>
+          <w:szCs w:val="20"/>
+        </w:rPr>
+        <w:t xml:space="preserve">[42]</w:t>
+      </w:r>
+      <w:r>
+        <w:rPr>
+          <w:rFonts w:ascii="Times New Roman" w:cs="Times New Roman" w:eastAsia="Times New Roman" w:hAnsi="Times New Roman"/>
+          <w:sz w:val="20"/>
+          <w:szCs w:val="20"/>
+        </w:rPr>
+        <w:t xml:space="preserve"> model of the request protocol is left for future work.</w:t>
+      </w:r>
+    </w:p>
+    <w:p>
+      <w:pPr>
+        <w:spacing w:after="60" w:before="0" w:line="228"/>
+        <w:jc w:val="both"/>
+      </w:pPr>
+      <w:r>
+        <w:rPr>
+          <w:rFonts w:ascii="Times New Roman" w:cs="Times New Roman" w:eastAsia="Times New Roman" w:hAnsi="Times New Roman"/>
+          <w:b/>
+          <w:bCs/>
+          <w:sz w:val="20"/>
+          <w:szCs w:val="20"/>
+        </w:rPr>
+        <w:t xml:space="preserve">S1 Authenticity.</w:t>
+      </w:r>
+      <w:r>
+        <w:rPr>
+          <w:rFonts w:ascii="Times New Roman" w:cs="Times New Roman" w:eastAsia="Times New Roman" w:hAnsi="Times New Roman"/>
+          <w:sz w:val="20"/>
+          <w:szCs w:val="20"/>
+        </w:rPr>
+        <w:t xml:space="preserve"> A request is accepted only if the signature recovers an address whose hash equals the key hash registered for the claimed DID. A forger without the device key must break unforgeability; registering a new key needs the authority (</w:t>
+      </w:r>
+      <w:r>
+        <w:rPr>
+          <w:rFonts w:ascii="Times New Roman" w:cs="Times New Roman" w:eastAsia="Times New Roman" w:hAnsi="Times New Roman"/>
+          <w:i/>
+          <w:iCs/>
+          <w:sz w:val="20"/>
+          <w:szCs w:val="20"/>
+        </w:rPr>
+        <w:t xml:space="preserve">updateKey</w:t>
+      </w:r>
+      <w:r>
+        <w:rPr>
+          <w:rFonts w:ascii="Times New Roman" w:cs="Times New Roman" w:eastAsia="Times New Roman" w:hAnsi="Times New Roman"/>
+          <w:sz w:val="20"/>
+          <w:szCs w:val="20"/>
+        </w:rPr>
+        <w:t xml:space="preserve">/</w:t>
+      </w:r>
+      <w:r>
+        <w:rPr>
+          <w:rFonts w:ascii="Times New Roman" w:cs="Times New Roman" w:eastAsia="Times New Roman" w:hAnsi="Times New Roman"/>
+          <w:i/>
+          <w:iCs/>
+          <w:sz w:val="20"/>
+          <w:szCs w:val="20"/>
+        </w:rPr>
+        <w:t xml:space="preserve">registerDID</w:t>
+      </w:r>
+      <w:r>
+        <w:rPr>
+          <w:rFonts w:ascii="Times New Roman" w:cs="Times New Roman" w:eastAsia="Times New Roman" w:hAnsi="Times New Roman"/>
+          <w:sz w:val="20"/>
+          <w:szCs w:val="20"/>
+        </w:rPr>
+        <w:t xml:space="preserve">). </w:t>
+      </w:r>
+      <w:r>
+        <w:rPr>
+          <w:rFonts w:ascii="Times New Roman" w:cs="Times New Roman" w:eastAsia="Times New Roman" w:hAnsi="Times New Roman"/>
+          <w:b/>
+          <w:bCs/>
+          <w:sz w:val="20"/>
+          <w:szCs w:val="20"/>
+        </w:rPr>
+        <w:t xml:space="preserve">S2 Replay.</w:t>
+      </w:r>
+      <w:r>
+        <w:rPr>
+          <w:rFonts w:ascii="Times New Roman" w:cs="Times New Roman" w:eastAsia="Times New Roman" w:hAnsi="Times New Roman"/>
+          <w:sz w:val="20"/>
+          <w:szCs w:val="20"/>
+        </w:rPr>
+        <w:t xml:space="preserve"> A replayed request is rejected if it is older than Δ or its nonce was seen by </w:t>
+      </w:r>
+      <w:r>
+        <w:rPr>
+          <w:rFonts w:ascii="Times New Roman" w:cs="Times New Roman" w:eastAsia="Times New Roman" w:hAnsi="Times New Roman"/>
+          <w:i/>
+          <w:iCs/>
+          <w:sz w:val="20"/>
+          <w:szCs w:val="20"/>
+        </w:rPr>
+        <w:t xml:space="preserve">the same gateway</w:t>
+      </w:r>
+      <w:r>
+        <w:rPr>
+          <w:rFonts w:ascii="Times New Roman" w:cs="Times New Roman" w:eastAsia="Times New Roman" w:hAnsi="Times New Roman"/>
+          <w:sz w:val="20"/>
+          <w:szCs w:val="20"/>
+        </w:rPr>
+        <w:t xml:space="preserve"> within Δ. The signed message does not contain a gateway identifier, so the same request can be replayed once at a different gateway within Δ unless nonce caches are shared or the gateway identity is added to the signed fields; we did not test or implement this mitigation. </w:t>
+      </w:r>
+      <w:r>
+        <w:rPr>
+          <w:rFonts w:ascii="Times New Roman" w:cs="Times New Roman" w:eastAsia="Times New Roman" w:hAnsi="Times New Roman"/>
+          <w:b/>
+          <w:bCs/>
+          <w:sz w:val="20"/>
+          <w:szCs w:val="20"/>
+        </w:rPr>
+        <w:t xml:space="preserve">S3 Revocation.</w:t>
+      </w:r>
+      <w:r>
+        <w:rPr>
+          <w:rFonts w:ascii="Times New Roman" w:cs="Times New Roman" w:eastAsia="Times New Roman" w:hAnsi="Times New Roman"/>
+          <w:sz w:val="20"/>
+          <w:szCs w:val="20"/>
+        </w:rPr>
+        <w:t xml:space="preserve"> After a revocation transaction is finalised (IBFT 2.0 has instant finality), a gateway that observes the event stops accepting the device within the event-polling interval; a gateway that misses the event enforces it when its cache entry expires, i.e. within </w:t>
+      </w:r>
+      <w:r>
+        <w:rPr>
+          <w:rFonts w:ascii="Times New Roman" w:cs="Times New Roman" w:eastAsia="Times New Roman" w:hAnsi="Times New Roman"/>
+          <w:i/>
+          <w:iCs/>
+          <w:sz w:val="20"/>
+          <w:szCs w:val="20"/>
+        </w:rPr>
+        <w:t xml:space="preserve">TTL</w:t>
+      </w:r>
+      <w:r>
+        <w:rPr>
+          <w:rFonts w:ascii="Times New Roman" w:cs="Times New Roman" w:eastAsia="Times New Roman" w:hAnsi="Times New Roman"/>
+          <w:sz w:val="20"/>
+          <w:szCs w:val="20"/>
+        </w:rPr>
+        <w:t xml:space="preserve">. If consensus is halted the transaction cannot be finalised, so the bound is measured from finalisation, not from submission (this case was not tested). </w:t>
+      </w:r>
+      <w:r>
+        <w:rPr>
+          <w:rFonts w:ascii="Times New Roman" w:cs="Times New Roman" w:eastAsia="Times New Roman" w:hAnsi="Times New Roman"/>
+          <w:b/>
+          <w:bCs/>
+          <w:sz w:val="20"/>
+          <w:szCs w:val="20"/>
+        </w:rPr>
+        <w:t xml:space="preserve">S4 Audit integrity.</w:t>
+      </w:r>
+      <w:r>
+        <w:rPr>
+          <w:rFonts w:ascii="Times New Roman" w:cs="Times New Roman" w:eastAsia="Times New Roman" w:hAnsi="Times New Roman"/>
+          <w:sz w:val="20"/>
+          <w:szCs w:val="20"/>
+        </w:rPr>
+        <w:t xml:space="preserve"> Each batch root is anchored on-chain; a stored record that is altered later no longer verifies against its batch root, and an anchored root cannot be changed without </w:t>
+      </w:r>
+      <w:r>
+        <w:rPr>
+          <w:rFonts w:ascii="Times New Roman" w:cs="Times New Roman" w:eastAsia="Times New Roman" w:hAnsi="Times New Roman"/>
+          <w:i/>
+          <w:iCs/>
+          <w:sz w:val="20"/>
+          <w:szCs w:val="20"/>
+        </w:rPr>
+        <w:t xml:space="preserve">f</w:t>
+      </w:r>
+      <w:r>
+        <w:rPr>
+          <w:rFonts w:ascii="Times New Roman" w:cs="Times New Roman" w:eastAsia="Times New Roman" w:hAnsi="Times New Roman"/>
+          <w:sz w:val="20"/>
+          <w:szCs w:val="20"/>
+        </w:rPr>
+        <w:t xml:space="preserve"> + 1 validators. Audit completeness is not guaranteed: a compromised gateway can omit records before they are anchored (up to the anchoring interval of 1 s is also exposed on a crash), and the prototype’s </w:t>
+      </w:r>
+      <w:r>
+        <w:rPr>
+          <w:rFonts w:ascii="Times New Roman" w:cs="Times New Roman" w:eastAsia="Times New Roman" w:hAnsi="Times New Roman"/>
+          <w:i/>
+          <w:iCs/>
+          <w:sz w:val="20"/>
+          <w:szCs w:val="20"/>
+        </w:rPr>
+        <w:t xml:space="preserve">AuditLog</w:t>
+      </w:r>
+      <w:r>
+        <w:rPr>
+          <w:rFonts w:ascii="Times New Roman" w:cs="Times New Roman" w:eastAsia="Times New Roman" w:hAnsi="Times New Roman"/>
+          <w:sz w:val="20"/>
+          <w:szCs w:val="20"/>
+        </w:rPr>
+        <w:t xml:space="preserve"> accepts anchors from any account. </w:t>
+      </w:r>
+      <w:r>
+        <w:rPr>
+          <w:rFonts w:ascii="Times New Roman" w:cs="Times New Roman" w:eastAsia="Times New Roman" w:hAnsi="Times New Roman"/>
+          <w:b/>
+          <w:bCs/>
+          <w:sz w:val="20"/>
+          <w:szCs w:val="20"/>
+        </w:rPr>
+        <w:t xml:space="preserve">S5 Availability.</w:t>
+      </w:r>
+      <w:r>
+        <w:rPr>
+          <w:rFonts w:ascii="Times New Roman" w:cs="Times New Roman" w:eastAsia="Times New Roman" w:hAnsi="Times New Roman"/>
+          <w:sz w:val="20"/>
+          <w:szCs w:val="20"/>
+        </w:rPr>
+        <w:t xml:space="preserve"> Decisions never wait for consensus and, when the ledger is unreachable, continue from cache for at most </w:t>
+      </w:r>
+      <w:r>
+        <w:rPr>
+          <w:rFonts w:ascii="Times New Roman" w:cs="Times New Roman" w:eastAsia="Times New Roman" w:hAnsi="Times New Roman"/>
+          <w:i/>
+          <w:iCs/>
+          <w:sz w:val="20"/>
+          <w:szCs w:val="20"/>
+        </w:rPr>
+        <w:t xml:space="preserve">k</w:t>
+      </w:r>
+      <w:r>
+        <w:rPr>
+          <w:rFonts w:ascii="Times New Roman" w:cs="Times New Roman" w:eastAsia="Times New Roman" w:hAnsi="Times New Roman"/>
+          <w:sz w:val="20"/>
+          <w:szCs w:val="20"/>
+        </w:rPr>
+        <w:t xml:space="preserve">·</w:t>
+      </w:r>
+      <w:r>
+        <w:rPr>
+          <w:rFonts w:ascii="Times New Roman" w:cs="Times New Roman" w:eastAsia="Times New Roman" w:hAnsi="Times New Roman"/>
+          <w:i/>
+          <w:iCs/>
+          <w:sz w:val="20"/>
+          <w:szCs w:val="20"/>
+        </w:rPr>
+        <w:t xml:space="preserve">TTL</w:t>
+      </w:r>
+      <w:r>
+        <w:rPr>
+          <w:rFonts w:ascii="Times New Roman" w:cs="Times New Roman" w:eastAsia="Times New Roman" w:hAnsi="Times New Roman"/>
+          <w:sz w:val="20"/>
+          <w:szCs w:val="20"/>
+        </w:rPr>
+        <w:t xml:space="preserve"> (Section III-J); a gateway whose node is compromised can deny service or serve stale state unless the read quorum of Section III-K is used. </w:t>
+      </w:r>
+      <w:r>
+        <w:rPr>
+          <w:rFonts w:ascii="Times New Roman" w:cs="Times New Roman" w:eastAsia="Times New Roman" w:hAnsi="Times New Roman"/>
+          <w:b/>
+          <w:bCs/>
+          <w:sz w:val="20"/>
+          <w:szCs w:val="20"/>
+        </w:rPr>
+        <w:t xml:space="preserve">Non-goals.</w:t>
+      </w:r>
+      <w:r>
+        <w:rPr>
+          <w:rFonts w:ascii="Times New Roman" w:cs="Times New Roman" w:eastAsia="Times New Roman" w:hAnsi="Times New Roman"/>
+          <w:sz w:val="20"/>
+          <w:szCs w:val="20"/>
+        </w:rPr>
+        <w:t xml:space="preserve"> Compromise of the enrolment authority, of </w:t>
+      </w:r>
+      <w:r>
+        <w:rPr>
+          <w:rFonts w:ascii="Times New Roman" w:cs="Times New Roman" w:eastAsia="Times New Roman" w:hAnsi="Times New Roman"/>
+          <w:i/>
+          <w:iCs/>
+          <w:sz w:val="20"/>
+          <w:szCs w:val="20"/>
+        </w:rPr>
+        <w:t xml:space="preserve">f</w:t>
+      </w:r>
+      <w:r>
+        <w:rPr>
+          <w:rFonts w:ascii="Times New Roman" w:cs="Times New Roman" w:eastAsia="Times New Roman" w:hAnsi="Times New Roman"/>
+          <w:sz w:val="20"/>
+          <w:szCs w:val="20"/>
+        </w:rPr>
+        <w:t xml:space="preserve"> + 1 validators, of a device key before revocation, and traffic analysis.</w:t>
+      </w:r>
+    </w:p>
+    <w:p>
+      <w:pPr>
+        <w:keepNext/>
         <w:spacing w:after="60" w:before="120"/>
         <w:jc w:val="center"/>
       </w:pPr>
@@ -6651,7 +7425,7 @@
           <w:sz w:val="20"/>
           <w:szCs w:val="20"/>
         </w:rPr>
-        <w:t xml:space="preserve">), S3 per-event logging at 10–200 tx/s offered for 20 s, S4 batch anchoring at 1 tx/s, and S5 revocation visibility. Block observation was polled every 25 ms. The benchmark scripts, contracts and raw results are available from the authors on request.</w:t>
+        <w:t xml:space="preserve">), S3 per-event logging at 10–200 tx/s offered for 20 s, S4 batch anchoring at 1 tx/s, and S5 revocation visibility. Block observation was polled every 25 ms. The scripts, contracts and raw results are in the public code repository listed under Data and Code Availability.</w:t>
       </w:r>
     </w:p>
     <w:p>
@@ -6960,7 +7734,7 @@
           <w:sz w:val="20"/>
           <w:szCs w:val="20"/>
         </w:rPr>
-        <w:t xml:space="preserve"> transaction (eight sender accounts) and replies only after the block containing it is observed. (P) </w:t>
+        <w:t xml:space="preserve"> transaction (eight sender accounts) and replies only after the block containing it is observed. (B4) </w:t>
       </w:r>
       <w:r>
         <w:rPr>
@@ -6970,6 +7744,74 @@
           <w:sz w:val="20"/>
           <w:szCs w:val="20"/>
         </w:rPr>
+        <w:t xml:space="preserve">Keycloak</w:t>
+      </w:r>
+      <w:r>
+        <w:rPr>
+          <w:rFonts w:ascii="Times New Roman" w:cs="Times New Roman" w:eastAsia="Times New Roman" w:hAnsi="Times New Roman"/>
+          <w:sz w:val="20"/>
+          <w:szCs w:val="20"/>
+        </w:rPr>
+        <w:t xml:space="preserve">: a real Keycloak 26.4.0 identity provider issues each device an OpenID Connect access token carrying its class, trust score and key hash as claims, and the PEP calls the token-introspection endpoint </w:t>
+      </w:r>
+      <w:r>
+        <w:rPr>
+          <w:rFonts w:ascii="Times New Roman" w:cs="Times New Roman" w:eastAsia="Times New Roman" w:hAnsi="Times New Roman"/>
+          <w:sz w:val="20"/>
+          <w:szCs w:val="20"/>
+        </w:rPr>
+        <w:t xml:space="preserve">[43]</w:t>
+      </w:r>
+      <w:r>
+        <w:rPr>
+          <w:rFonts w:ascii="Times New Roman" w:cs="Times New Roman" w:eastAsia="Times New Roman" w:hAnsi="Times New Roman"/>
+          <w:sz w:val="20"/>
+          <w:szCs w:val="20"/>
+        </w:rPr>
+        <w:t xml:space="preserve"> on every request; revocation disables the user. (B5) </w:t>
+      </w:r>
+      <w:r>
+        <w:rPr>
+          <w:rFonts w:ascii="Times New Roman" w:cs="Times New Roman" w:eastAsia="Times New Roman" w:hAnsi="Times New Roman"/>
+          <w:i/>
+          <w:iCs/>
+          <w:sz w:val="20"/>
+          <w:szCs w:val="20"/>
+        </w:rPr>
+        <w:t xml:space="preserve">OpenLDAP</w:t>
+      </w:r>
+      <w:r>
+        <w:rPr>
+          <w:rFonts w:ascii="Times New Roman" w:cs="Times New Roman" w:eastAsia="Times New Roman" w:hAnsi="Times New Roman"/>
+          <w:sz w:val="20"/>
+          <w:szCs w:val="20"/>
+        </w:rPr>
+        <w:t xml:space="preserve">: a real slapd directory holding the same attributes, queried once per request </w:t>
+      </w:r>
+      <w:r>
+        <w:rPr>
+          <w:rFonts w:ascii="Times New Roman" w:cs="Times New Roman" w:eastAsia="Times New Roman" w:hAnsi="Times New Roman"/>
+          <w:sz w:val="20"/>
+          <w:szCs w:val="20"/>
+        </w:rPr>
+        <w:t xml:space="preserve">[44]</w:t>
+      </w:r>
+      <w:r>
+        <w:rPr>
+          <w:rFonts w:ascii="Times New Roman" w:cs="Times New Roman" w:eastAsia="Times New Roman" w:hAnsi="Times New Roman"/>
+          <w:sz w:val="20"/>
+          <w:szCs w:val="20"/>
+        </w:rPr>
+        <w:t xml:space="preserve">. B4 and B5 are also run with a PEP-side decision cache (“cached”, TTL 10 s), which is the usual way to cut their latency. (P) </w:t>
+      </w:r>
+      <w:r>
+        <w:rPr>
+          <w:rFonts w:ascii="Times New Roman" w:cs="Times New Roman" w:eastAsia="Times New Roman" w:hAnsi="Times New Roman"/>
+          <w:i/>
+          <w:iCs/>
+          <w:sz w:val="20"/>
+          <w:szCs w:val="20"/>
+        </w:rPr>
         <w:t xml:space="preserve">Proposed BC-ZTA</w:t>
       </w:r>
       <w:r>
@@ -6978,7 +7820,7 @@
           <w:sz w:val="20"/>
           <w:szCs w:val="20"/>
         </w:rPr>
-        <w:t xml:space="preserve"> as in Section V-C. All four use the same request format, signature check and policy, so differences come from where state is read and written.</w:t>
+        <w:t xml:space="preserve"> as in Section V-C. All systems use the same request format, signature check and policy, so differences come from where state is read and written.</w:t>
       </w:r>
     </w:p>
     <w:p>
@@ -7963,7 +8805,7 @@
           <w:sz w:val="20"/>
           <w:szCs w:val="20"/>
         </w:rPr>
-        <w:t xml:space="preserve"> delays all outgoing traffic of each validator VM by 5 ms to represent a plant-local validator network, and the responses of the directory server by 40 ms to represent a remote central service; all other delay is the real VM-to-VM network delay. Each of the 5 repetitions started a freshly generated chain and restarted the PEP for every device count; the repetitions ran sequentially on the same VMs. The validator-failure test (E5) stops one validator container for 30 s while 50 devices are served. Cloud VMs in one zone approximate independent hosts better than a shared CI runner, but they are not an industrial network: devices are emulated by the load generator and co-tenancy in the cloud can add variance. The deployment scripts, configuration and raw results are available from the authors on request.</w:t>
+        <w:t xml:space="preserve"> delays all outgoing traffic of each validator VM by 5 ms to represent a plant-local validator network, and the responses of the directory server by 40 ms to represent a remote central service; all other delay is the real VM-to-VM network delay. Each of the 5 repetitions started a freshly generated chain and restarted the PEP for every device count; the repetitions ran sequentially on the same VMs. The validator-failure test (E5) stops one validator container for 30 s while 50 devices are served. Cloud VMs in one zone approximate independent hosts better than a shared CI runner, but they are not an industrial network: devices are emulated by the load generator and co-tenancy in the cloud can add variance. The deployment scripts, configuration and raw results are in the public code repository listed under Data and Code Availability.</w:t>
       </w:r>
     </w:p>
     <w:p>
@@ -7977,7 +8819,7 @@
           <w:sz w:val="20"/>
           <w:szCs w:val="20"/>
         </w:rPr>
-        <w:t xml:space="preserve">A second cloud run on the same seven VMs added Keycloak 26.4.0 (Docker, development mode, embedded H2 database, OIDC token introspection) and OpenLDAP slapd (Debian 12 package, one search per request) on the directory VM (B4 and B5), the PEP-cache variants of both, a revocation test, a 25 s outage test, an open-loop PEP capacity test and the ledger flood sweep of Section VI-I. Besu was started with a 2.5 GB heap for the flood sweep. The scripts, orchestration and raw results are in the code package.</w:t>
+        <w:t xml:space="preserve">A second cloud run on the same seven VMs added Keycloak 26.4.0 (Docker, development mode, embedded H2 database, OIDC token introspection) and OpenLDAP slapd (Debian 12 package, one search per request) on the directory VM (B4 and B5), the PEP-cache variants of both, a revocation test, a 25 s outage test, an open-loop PEP capacity test and the ledger flood sweep of Section VI-I. Besu was started with a 2.5 GB heap for the flood sweep and for all later runs; the first IAM repetition used the default 1 GB heap, which does not affect the PEP-side measurements reported here. The scripts, orchestration and raw results are in the code package.</w:t>
       </w:r>
     </w:p>
     <w:p>
@@ -8039,7 +8881,7 @@
           <w:sz w:val="16"/>
           <w:szCs w:val="16"/>
         </w:rPr>
-        <w:t xml:space="preserve">TABLE 5. END-TO-END LATENCY (MS, MEAN OF 5 RUNS)</w:t>
+        <w:t xml:space="preserve">TABLE 5. END-TO-END LATENCY (MS, MEAN ± 95% CI OF 5 RUNS; P95)</w:t>
       </w:r>
     </w:p>
     <w:tbl>
@@ -8056,11 +8898,11 @@
         <w:tblLayout w:type="fixed"/>
       </w:tblPr>
       <w:tblGrid>
-        <w:gridCol w:w="1500"/>
-        <w:gridCol w:w="840"/>
-        <w:gridCol w:w="840"/>
-        <w:gridCol w:w="840"/>
-        <w:gridCol w:w="840"/>
+        <w:gridCol w:w="1100"/>
+        <w:gridCol w:w="1210"/>
+        <w:gridCol w:w="650"/>
+        <w:gridCol w:w="1250"/>
+        <w:gridCol w:w="650"/>
       </w:tblGrid>
       <w:tr>
         <w:trPr>
@@ -8069,7 +8911,7 @@
         </w:trPr>
         <w:tc>
           <w:tcPr>
-            <w:tcW w:type="dxa" w:w="1500"/>
+            <w:tcW w:type="dxa" w:w="1100"/>
             <w:tcBorders>
               <w:top w:val="single" w:color="000000" w:sz="4"/>
               <w:left w:val="none" w:color="FFFFFF" w:sz="0"/>
@@ -8104,7 +8946,7 @@
         </w:tc>
         <w:tc>
           <w:tcPr>
-            <w:tcW w:type="dxa" w:w="840"/>
+            <w:tcW w:type="dxa" w:w="1210"/>
             <w:tcBorders>
               <w:top w:val="single" w:color="000000" w:sz="4"/>
               <w:left w:val="none" w:color="FFFFFF" w:sz="0"/>
@@ -8139,7 +8981,7 @@
         </w:tc>
         <w:tc>
           <w:tcPr>
-            <w:tcW w:type="dxa" w:w="840"/>
+            <w:tcW w:type="dxa" w:w="650"/>
             <w:tcBorders>
               <w:top w:val="single" w:color="000000" w:sz="4"/>
               <w:left w:val="none" w:color="FFFFFF" w:sz="0"/>
@@ -8174,7 +9016,7 @@
         </w:tc>
         <w:tc>
           <w:tcPr>
-            <w:tcW w:type="dxa" w:w="840"/>
+            <w:tcW w:type="dxa" w:w="1250"/>
             <w:tcBorders>
               <w:top w:val="single" w:color="000000" w:sz="4"/>
               <w:left w:val="none" w:color="FFFFFF" w:sz="0"/>
@@ -8209,7 +9051,7 @@
         </w:tc>
         <w:tc>
           <w:tcPr>
-            <w:tcW w:type="dxa" w:w="840"/>
+            <w:tcW w:type="dxa" w:w="650"/>
             <w:tcBorders>
               <w:top w:val="single" w:color="000000" w:sz="4"/>
               <w:left w:val="none" w:color="FFFFFF" w:sz="0"/>
@@ -8249,7 +9091,7 @@
         </w:trPr>
         <w:tc>
           <w:tcPr>
-            <w:tcW w:type="dxa" w:w="1500"/>
+            <w:tcW w:type="dxa" w:w="1100"/>
             <w:tcBorders>
               <w:top w:val="none" w:color="FFFFFF" w:sz="0"/>
               <w:left w:val="none" w:color="FFFFFF" w:sz="0"/>
@@ -8284,42 +9126,42 @@
         </w:tc>
         <w:tc>
           <w:tcPr>
-            <w:tcW w:type="dxa" w:w="840"/>
-            <w:tcBorders>
-              <w:top w:val="none" w:color="FFFFFF" w:sz="0"/>
-              <w:left w:val="none" w:color="FFFFFF" w:sz="0"/>
-              <w:bottom w:val="none" w:color="FFFFFF" w:sz="0"/>
-              <w:right w:val="none" w:color="FFFFFF" w:sz="0"/>
-            </w:tcBorders>
-            <w:tcMar>
-              <w:top w:type="dxa" w:w="20"/>
-              <w:left w:type="dxa" w:w="40"/>
-              <w:bottom w:type="dxa" w:w="20"/>
-              <w:right w:type="dxa" w:w="40"/>
-            </w:tcMar>
-            <w:vAlign w:val="center"/>
-          </w:tcPr>
-          <w:p>
-            <w:pPr>
-              <w:keepNext/>
-              <w:spacing w:after="0" w:line="200"/>
-              <w:jc w:val="left"/>
-            </w:pPr>
-            <w:r>
-              <w:rPr>
-                <w:rFonts w:ascii="Times New Roman" w:cs="Times New Roman" w:eastAsia="Times New Roman" w:hAnsi="Times New Roman"/>
-                <w:b w:val="false"/>
-                <w:bCs w:val="false"/>
-                <w:sz w:val="15"/>
-                <w:szCs w:val="15"/>
-              </w:rPr>
-              <w:t xml:space="preserve">49.1</w:t>
-            </w:r>
-          </w:p>
-        </w:tc>
-        <w:tc>
-          <w:tcPr>
-            <w:tcW w:type="dxa" w:w="840"/>
+            <w:tcW w:type="dxa" w:w="1210"/>
+            <w:tcBorders>
+              <w:top w:val="none" w:color="FFFFFF" w:sz="0"/>
+              <w:left w:val="none" w:color="FFFFFF" w:sz="0"/>
+              <w:bottom w:val="none" w:color="FFFFFF" w:sz="0"/>
+              <w:right w:val="none" w:color="FFFFFF" w:sz="0"/>
+            </w:tcBorders>
+            <w:tcMar>
+              <w:top w:type="dxa" w:w="20"/>
+              <w:left w:type="dxa" w:w="40"/>
+              <w:bottom w:type="dxa" w:w="20"/>
+              <w:right w:type="dxa" w:w="40"/>
+            </w:tcMar>
+            <w:vAlign w:val="center"/>
+          </w:tcPr>
+          <w:p>
+            <w:pPr>
+              <w:keepNext/>
+              <w:spacing w:after="0" w:line="200"/>
+              <w:jc w:val="left"/>
+            </w:pPr>
+            <w:r>
+              <w:rPr>
+                <w:rFonts w:ascii="Times New Roman" w:cs="Times New Roman" w:eastAsia="Times New Roman" w:hAnsi="Times New Roman"/>
+                <w:b w:val="false"/>
+                <w:bCs w:val="false"/>
+                <w:sz w:val="15"/>
+                <w:szCs w:val="15"/>
+              </w:rPr>
+              <w:t xml:space="preserve">49.1 ± 0.2</w:t>
+            </w:r>
+          </w:p>
+        </w:tc>
+        <w:tc>
+          <w:tcPr>
+            <w:tcW w:type="dxa" w:w="650"/>
             <w:tcBorders>
               <w:top w:val="none" w:color="FFFFFF" w:sz="0"/>
               <w:left w:val="none" w:color="FFFFFF" w:sz="0"/>
@@ -8354,42 +9196,42 @@
         </w:tc>
         <w:tc>
           <w:tcPr>
-            <w:tcW w:type="dxa" w:w="840"/>
-            <w:tcBorders>
-              <w:top w:val="none" w:color="FFFFFF" w:sz="0"/>
-              <w:left w:val="none" w:color="FFFFFF" w:sz="0"/>
-              <w:bottom w:val="none" w:color="FFFFFF" w:sz="0"/>
-              <w:right w:val="none" w:color="FFFFFF" w:sz="0"/>
-            </w:tcBorders>
-            <w:tcMar>
-              <w:top w:type="dxa" w:w="20"/>
-              <w:left w:type="dxa" w:w="40"/>
-              <w:bottom w:type="dxa" w:w="20"/>
-              <w:right w:type="dxa" w:w="40"/>
-            </w:tcMar>
-            <w:vAlign w:val="center"/>
-          </w:tcPr>
-          <w:p>
-            <w:pPr>
-              <w:keepNext/>
-              <w:spacing w:after="0" w:line="200"/>
-              <w:jc w:val="left"/>
-            </w:pPr>
-            <w:r>
-              <w:rPr>
-                <w:rFonts w:ascii="Times New Roman" w:cs="Times New Roman" w:eastAsia="Times New Roman" w:hAnsi="Times New Roman"/>
-                <w:b w:val="false"/>
-                <w:bCs w:val="false"/>
-                <w:sz w:val="15"/>
-                <w:szCs w:val="15"/>
-              </w:rPr>
-              <w:t xml:space="preserve">49.0</w:t>
-            </w:r>
-          </w:p>
-        </w:tc>
-        <w:tc>
-          <w:tcPr>
-            <w:tcW w:type="dxa" w:w="840"/>
+            <w:tcW w:type="dxa" w:w="1250"/>
+            <w:tcBorders>
+              <w:top w:val="none" w:color="FFFFFF" w:sz="0"/>
+              <w:left w:val="none" w:color="FFFFFF" w:sz="0"/>
+              <w:bottom w:val="none" w:color="FFFFFF" w:sz="0"/>
+              <w:right w:val="none" w:color="FFFFFF" w:sz="0"/>
+            </w:tcBorders>
+            <w:tcMar>
+              <w:top w:type="dxa" w:w="20"/>
+              <w:left w:type="dxa" w:w="40"/>
+              <w:bottom w:type="dxa" w:w="20"/>
+              <w:right w:type="dxa" w:w="40"/>
+            </w:tcMar>
+            <w:vAlign w:val="center"/>
+          </w:tcPr>
+          <w:p>
+            <w:pPr>
+              <w:keepNext/>
+              <w:spacing w:after="0" w:line="200"/>
+              <w:jc w:val="left"/>
+            </w:pPr>
+            <w:r>
+              <w:rPr>
+                <w:rFonts w:ascii="Times New Roman" w:cs="Times New Roman" w:eastAsia="Times New Roman" w:hAnsi="Times New Roman"/>
+                <w:b w:val="false"/>
+                <w:bCs w:val="false"/>
+                <w:sz w:val="15"/>
+                <w:szCs w:val="15"/>
+              </w:rPr>
+              <w:t xml:space="preserve">49.0 ± 0.2</w:t>
+            </w:r>
+          </w:p>
+        </w:tc>
+        <w:tc>
+          <w:tcPr>
+            <w:tcW w:type="dxa" w:w="650"/>
             <w:tcBorders>
               <w:top w:val="none" w:color="FFFFFF" w:sz="0"/>
               <w:left w:val="none" w:color="FFFFFF" w:sz="0"/>
@@ -8429,7 +9271,7 @@
         </w:trPr>
         <w:tc>
           <w:tcPr>
-            <w:tcW w:type="dxa" w:w="1500"/>
+            <w:tcW w:type="dxa" w:w="1100"/>
             <w:tcBorders>
               <w:top w:val="none" w:color="FFFFFF" w:sz="0"/>
               <w:left w:val="none" w:color="FFFFFF" w:sz="0"/>
@@ -8464,42 +9306,42 @@
         </w:tc>
         <w:tc>
           <w:tcPr>
-            <w:tcW w:type="dxa" w:w="840"/>
-            <w:tcBorders>
-              <w:top w:val="none" w:color="FFFFFF" w:sz="0"/>
-              <w:left w:val="none" w:color="FFFFFF" w:sz="0"/>
-              <w:bottom w:val="none" w:color="FFFFFF" w:sz="0"/>
-              <w:right w:val="none" w:color="FFFFFF" w:sz="0"/>
-            </w:tcBorders>
-            <w:tcMar>
-              <w:top w:type="dxa" w:w="20"/>
-              <w:left w:type="dxa" w:w="40"/>
-              <w:bottom w:type="dxa" w:w="20"/>
-              <w:right w:type="dxa" w:w="40"/>
-            </w:tcMar>
-            <w:vAlign w:val="center"/>
-          </w:tcPr>
-          <w:p>
-            <w:pPr>
-              <w:keepNext/>
-              <w:spacing w:after="0" w:line="200"/>
-              <w:jc w:val="left"/>
-            </w:pPr>
-            <w:r>
-              <w:rPr>
-                <w:rFonts w:ascii="Times New Roman" w:cs="Times New Roman" w:eastAsia="Times New Roman" w:hAnsi="Times New Roman"/>
-                <w:b w:val="false"/>
-                <w:bCs w:val="false"/>
-                <w:sz w:val="15"/>
-                <w:szCs w:val="15"/>
-              </w:rPr>
-              <w:t xml:space="preserve">5.2</w:t>
-            </w:r>
-          </w:p>
-        </w:tc>
-        <w:tc>
-          <w:tcPr>
-            <w:tcW w:type="dxa" w:w="840"/>
+            <w:tcW w:type="dxa" w:w="1210"/>
+            <w:tcBorders>
+              <w:top w:val="none" w:color="FFFFFF" w:sz="0"/>
+              <w:left w:val="none" w:color="FFFFFF" w:sz="0"/>
+              <w:bottom w:val="none" w:color="FFFFFF" w:sz="0"/>
+              <w:right w:val="none" w:color="FFFFFF" w:sz="0"/>
+            </w:tcBorders>
+            <w:tcMar>
+              <w:top w:type="dxa" w:w="20"/>
+              <w:left w:type="dxa" w:w="40"/>
+              <w:bottom w:type="dxa" w:w="20"/>
+              <w:right w:type="dxa" w:w="40"/>
+            </w:tcMar>
+            <w:vAlign w:val="center"/>
+          </w:tcPr>
+          <w:p>
+            <w:pPr>
+              <w:keepNext/>
+              <w:spacing w:after="0" w:line="200"/>
+              <w:jc w:val="left"/>
+            </w:pPr>
+            <w:r>
+              <w:rPr>
+                <w:rFonts w:ascii="Times New Roman" w:cs="Times New Roman" w:eastAsia="Times New Roman" w:hAnsi="Times New Roman"/>
+                <w:b w:val="false"/>
+                <w:bCs w:val="false"/>
+                <w:sz w:val="15"/>
+                <w:szCs w:val="15"/>
+              </w:rPr>
+              <w:t xml:space="preserve">5.2 ± 0.3</w:t>
+            </w:r>
+          </w:p>
+        </w:tc>
+        <w:tc>
+          <w:tcPr>
+            <w:tcW w:type="dxa" w:w="650"/>
             <w:tcBorders>
               <w:top w:val="none" w:color="FFFFFF" w:sz="0"/>
               <w:left w:val="none" w:color="FFFFFF" w:sz="0"/>
@@ -8534,42 +9376,42 @@
         </w:tc>
         <w:tc>
           <w:tcPr>
-            <w:tcW w:type="dxa" w:w="840"/>
-            <w:tcBorders>
-              <w:top w:val="none" w:color="FFFFFF" w:sz="0"/>
-              <w:left w:val="none" w:color="FFFFFF" w:sz="0"/>
-              <w:bottom w:val="none" w:color="FFFFFF" w:sz="0"/>
-              <w:right w:val="none" w:color="FFFFFF" w:sz="0"/>
-            </w:tcBorders>
-            <w:tcMar>
-              <w:top w:type="dxa" w:w="20"/>
-              <w:left w:type="dxa" w:w="40"/>
-              <w:bottom w:type="dxa" w:w="20"/>
-              <w:right w:type="dxa" w:w="40"/>
-            </w:tcMar>
-            <w:vAlign w:val="center"/>
-          </w:tcPr>
-          <w:p>
-            <w:pPr>
-              <w:keepNext/>
-              <w:spacing w:after="0" w:line="200"/>
-              <w:jc w:val="left"/>
-            </w:pPr>
-            <w:r>
-              <w:rPr>
-                <w:rFonts w:ascii="Times New Roman" w:cs="Times New Roman" w:eastAsia="Times New Roman" w:hAnsi="Times New Roman"/>
-                <w:b w:val="false"/>
-                <w:bCs w:val="false"/>
-                <w:sz w:val="15"/>
-                <w:szCs w:val="15"/>
-              </w:rPr>
-              <w:t xml:space="preserve">4.1</w:t>
-            </w:r>
-          </w:p>
-        </w:tc>
-        <w:tc>
-          <w:tcPr>
-            <w:tcW w:type="dxa" w:w="840"/>
+            <w:tcW w:type="dxa" w:w="1250"/>
+            <w:tcBorders>
+              <w:top w:val="none" w:color="FFFFFF" w:sz="0"/>
+              <w:left w:val="none" w:color="FFFFFF" w:sz="0"/>
+              <w:bottom w:val="none" w:color="FFFFFF" w:sz="0"/>
+              <w:right w:val="none" w:color="FFFFFF" w:sz="0"/>
+            </w:tcBorders>
+            <w:tcMar>
+              <w:top w:type="dxa" w:w="20"/>
+              <w:left w:type="dxa" w:w="40"/>
+              <w:bottom w:type="dxa" w:w="20"/>
+              <w:right w:type="dxa" w:w="40"/>
+            </w:tcMar>
+            <w:vAlign w:val="center"/>
+          </w:tcPr>
+          <w:p>
+            <w:pPr>
+              <w:keepNext/>
+              <w:spacing w:after="0" w:line="200"/>
+              <w:jc w:val="left"/>
+            </w:pPr>
+            <w:r>
+              <w:rPr>
+                <w:rFonts w:ascii="Times New Roman" w:cs="Times New Roman" w:eastAsia="Times New Roman" w:hAnsi="Times New Roman"/>
+                <w:b w:val="false"/>
+                <w:bCs w:val="false"/>
+                <w:sz w:val="15"/>
+                <w:szCs w:val="15"/>
+              </w:rPr>
+              <w:t xml:space="preserve">4.1 ± 0.2</w:t>
+            </w:r>
+          </w:p>
+        </w:tc>
+        <w:tc>
+          <w:tcPr>
+            <w:tcW w:type="dxa" w:w="650"/>
             <w:tcBorders>
               <w:top w:val="none" w:color="FFFFFF" w:sz="0"/>
               <w:left w:val="none" w:color="FFFFFF" w:sz="0"/>
@@ -8609,7 +9451,7 @@
         </w:trPr>
         <w:tc>
           <w:tcPr>
-            <w:tcW w:type="dxa" w:w="1500"/>
+            <w:tcW w:type="dxa" w:w="1100"/>
             <w:tcBorders>
               <w:top w:val="none" w:color="FFFFFF" w:sz="0"/>
               <w:left w:val="none" w:color="FFFFFF" w:sz="0"/>
@@ -8644,42 +9486,42 @@
         </w:tc>
         <w:tc>
           <w:tcPr>
-            <w:tcW w:type="dxa" w:w="840"/>
-            <w:tcBorders>
-              <w:top w:val="none" w:color="FFFFFF" w:sz="0"/>
-              <w:left w:val="none" w:color="FFFFFF" w:sz="0"/>
-              <w:bottom w:val="none" w:color="FFFFFF" w:sz="0"/>
-              <w:right w:val="none" w:color="FFFFFF" w:sz="0"/>
-            </w:tcBorders>
-            <w:tcMar>
-              <w:top w:type="dxa" w:w="20"/>
-              <w:left w:type="dxa" w:w="40"/>
-              <w:bottom w:type="dxa" w:w="20"/>
-              <w:right w:type="dxa" w:w="40"/>
-            </w:tcMar>
-            <w:vAlign w:val="center"/>
-          </w:tcPr>
-          <w:p>
-            <w:pPr>
-              <w:keepNext/>
-              <w:spacing w:after="0" w:line="200"/>
-              <w:jc w:val="left"/>
-            </w:pPr>
-            <w:r>
-              <w:rPr>
-                <w:rFonts w:ascii="Times New Roman" w:cs="Times New Roman" w:eastAsia="Times New Roman" w:hAnsi="Times New Roman"/>
-                <w:b w:val="false"/>
-                <w:bCs w:val="false"/>
-                <w:sz w:val="15"/>
-                <w:szCs w:val="15"/>
-              </w:rPr>
-              <w:t xml:space="preserve">1382</w:t>
-            </w:r>
-          </w:p>
-        </w:tc>
-        <w:tc>
-          <w:tcPr>
-            <w:tcW w:type="dxa" w:w="840"/>
+            <w:tcW w:type="dxa" w:w="1210"/>
+            <w:tcBorders>
+              <w:top w:val="none" w:color="FFFFFF" w:sz="0"/>
+              <w:left w:val="none" w:color="FFFFFF" w:sz="0"/>
+              <w:bottom w:val="none" w:color="FFFFFF" w:sz="0"/>
+              <w:right w:val="none" w:color="FFFFFF" w:sz="0"/>
+            </w:tcBorders>
+            <w:tcMar>
+              <w:top w:type="dxa" w:w="20"/>
+              <w:left w:type="dxa" w:w="40"/>
+              <w:bottom w:type="dxa" w:w="20"/>
+              <w:right w:type="dxa" w:w="40"/>
+            </w:tcMar>
+            <w:vAlign w:val="center"/>
+          </w:tcPr>
+          <w:p>
+            <w:pPr>
+              <w:keepNext/>
+              <w:spacing w:after="0" w:line="200"/>
+              <w:jc w:val="left"/>
+            </w:pPr>
+            <w:r>
+              <w:rPr>
+                <w:rFonts w:ascii="Times New Roman" w:cs="Times New Roman" w:eastAsia="Times New Roman" w:hAnsi="Times New Roman"/>
+                <w:b w:val="false"/>
+                <w:bCs w:val="false"/>
+                <w:sz w:val="15"/>
+                <w:szCs w:val="15"/>
+              </w:rPr>
+              <w:t xml:space="preserve">1382 ± 17</w:t>
+            </w:r>
+          </w:p>
+        </w:tc>
+        <w:tc>
+          <w:tcPr>
+            <w:tcW w:type="dxa" w:w="650"/>
             <w:tcBorders>
               <w:top w:val="none" w:color="FFFFFF" w:sz="0"/>
               <w:left w:val="none" w:color="FFFFFF" w:sz="0"/>
@@ -8714,42 +9556,42 @@
         </w:tc>
         <w:tc>
           <w:tcPr>
-            <w:tcW w:type="dxa" w:w="840"/>
-            <w:tcBorders>
-              <w:top w:val="none" w:color="FFFFFF" w:sz="0"/>
-              <w:left w:val="none" w:color="FFFFFF" w:sz="0"/>
-              <w:bottom w:val="none" w:color="FFFFFF" w:sz="0"/>
-              <w:right w:val="none" w:color="FFFFFF" w:sz="0"/>
-            </w:tcBorders>
-            <w:tcMar>
-              <w:top w:type="dxa" w:w="20"/>
-              <w:left w:type="dxa" w:w="40"/>
-              <w:bottom w:type="dxa" w:w="20"/>
-              <w:right w:type="dxa" w:w="40"/>
-            </w:tcMar>
-            <w:vAlign w:val="center"/>
-          </w:tcPr>
-          <w:p>
-            <w:pPr>
-              <w:keepNext/>
-              <w:spacing w:after="0" w:line="200"/>
-              <w:jc w:val="left"/>
-            </w:pPr>
-            <w:r>
-              <w:rPr>
-                <w:rFonts w:ascii="Times New Roman" w:cs="Times New Roman" w:eastAsia="Times New Roman" w:hAnsi="Times New Roman"/>
-                <w:b w:val="false"/>
-                <w:bCs w:val="false"/>
-                <w:sz w:val="15"/>
-                <w:szCs w:val="15"/>
-              </w:rPr>
-              <w:t xml:space="preserve">12094</w:t>
-            </w:r>
-          </w:p>
-        </w:tc>
-        <w:tc>
-          <w:tcPr>
-            <w:tcW w:type="dxa" w:w="840"/>
+            <w:tcW w:type="dxa" w:w="1250"/>
+            <w:tcBorders>
+              <w:top w:val="none" w:color="FFFFFF" w:sz="0"/>
+              <w:left w:val="none" w:color="FFFFFF" w:sz="0"/>
+              <w:bottom w:val="none" w:color="FFFFFF" w:sz="0"/>
+              <w:right w:val="none" w:color="FFFFFF" w:sz="0"/>
+            </w:tcBorders>
+            <w:tcMar>
+              <w:top w:type="dxa" w:w="20"/>
+              <w:left w:type="dxa" w:w="40"/>
+              <w:bottom w:type="dxa" w:w="20"/>
+              <w:right w:type="dxa" w:w="40"/>
+            </w:tcMar>
+            <w:vAlign w:val="center"/>
+          </w:tcPr>
+          <w:p>
+            <w:pPr>
+              <w:keepNext/>
+              <w:spacing w:after="0" w:line="200"/>
+              <w:jc w:val="left"/>
+            </w:pPr>
+            <w:r>
+              <w:rPr>
+                <w:rFonts w:ascii="Times New Roman" w:cs="Times New Roman" w:eastAsia="Times New Roman" w:hAnsi="Times New Roman"/>
+                <w:b w:val="false"/>
+                <w:bCs w:val="false"/>
+                <w:sz w:val="15"/>
+                <w:szCs w:val="15"/>
+              </w:rPr>
+              <w:t xml:space="preserve">12094 ± 6401</w:t>
+            </w:r>
+          </w:p>
+        </w:tc>
+        <w:tc>
+          <w:tcPr>
+            <w:tcW w:type="dxa" w:w="650"/>
             <w:tcBorders>
               <w:top w:val="none" w:color="FFFFFF" w:sz="0"/>
               <w:left w:val="none" w:color="FFFFFF" w:sz="0"/>
@@ -8789,7 +9631,7 @@
         </w:trPr>
         <w:tc>
           <w:tcPr>
-            <w:tcW w:type="dxa" w:w="1500"/>
+            <w:tcW w:type="dxa" w:w="1100"/>
             <w:tcBorders>
               <w:top w:val="none" w:color="FFFFFF" w:sz="0"/>
               <w:left w:val="none" w:color="FFFFFF" w:sz="0"/>
@@ -8824,7 +9666,7 @@
         </w:tc>
         <w:tc>
           <w:tcPr>
-            <w:tcW w:type="dxa" w:w="840"/>
+            <w:tcW w:type="dxa" w:w="1210"/>
             <w:tcBorders>
               <w:top w:val="none" w:color="FFFFFF" w:sz="0"/>
               <w:left w:val="none" w:color="FFFFFF" w:sz="0"/>
@@ -8853,13 +9695,13 @@
                 <w:sz w:val="15"/>
                 <w:szCs w:val="15"/>
               </w:rPr>
-              <w:t xml:space="preserve">5.4</w:t>
-            </w:r>
-          </w:p>
-        </w:tc>
-        <w:tc>
-          <w:tcPr>
-            <w:tcW w:type="dxa" w:w="840"/>
+              <w:t xml:space="preserve">5.4 ± 0.1</w:t>
+            </w:r>
+          </w:p>
+        </w:tc>
+        <w:tc>
+          <w:tcPr>
+            <w:tcW w:type="dxa" w:w="650"/>
             <w:tcBorders>
               <w:top w:val="none" w:color="FFFFFF" w:sz="0"/>
               <w:left w:val="none" w:color="FFFFFF" w:sz="0"/>
@@ -8894,7 +9736,7 @@
         </w:tc>
         <w:tc>
           <w:tcPr>
-            <w:tcW w:type="dxa" w:w="840"/>
+            <w:tcW w:type="dxa" w:w="1250"/>
             <w:tcBorders>
               <w:top w:val="none" w:color="FFFFFF" w:sz="0"/>
               <w:left w:val="none" w:color="FFFFFF" w:sz="0"/>
@@ -8923,13 +9765,13 @@
                 <w:sz w:val="15"/>
                 <w:szCs w:val="15"/>
               </w:rPr>
-              <w:t xml:space="preserve">4.6</w:t>
-            </w:r>
-          </w:p>
-        </w:tc>
-        <w:tc>
-          <w:tcPr>
-            <w:tcW w:type="dxa" w:w="840"/>
+              <w:t xml:space="preserve">4.6 ± 0.2</w:t>
+            </w:r>
+          </w:p>
+        </w:tc>
+        <w:tc>
+          <w:tcPr>
+            <w:tcW w:type="dxa" w:w="650"/>
             <w:tcBorders>
               <w:top w:val="none" w:color="FFFFFF" w:sz="0"/>
               <w:left w:val="none" w:color="FFFFFF" w:sz="0"/>
@@ -8975,7 +9817,7 @@
           <w:sz w:val="14"/>
           <w:szCs w:val="14"/>
         </w:rPr>
-        <w:t xml:space="preserve">Columns give the number of devices; PKI-IAM responses are delayed by 40 ms (netem).</w:t>
+        <w:t xml:space="preserve">Columns give the number of devices; PKI-IAM responses are delayed by 40 ms (netem). With 5 runs the differences discussed in the text exceed the confidence intervals by an order of magnitude; no hypothesis tests were run.</w:t>
       </w:r>
     </w:p>
     <w:p>
@@ -10280,7 +11122,7 @@
           <w:sz w:val="20"/>
           <w:szCs w:val="20"/>
         </w:rPr>
-        <w:t xml:space="preserve">Measured gas per operation is listed in Table 7. Registering a device costs 55,682 gas, whereas committing an epoch root costs 75,469 gas independent of batch size. Logging one event on-chain costs 182,008 gas, while anchoring a batch costs 134,747 gas, i.e. about 135 gas per record for a 1,000-record batch (≈1351× cheaper). At 400 devices and 1 event/s the calculation gives 34.6 M events/day: 6636 MB/day of ledger growth with per-event logging (192 B/entry) versus 13.8 MB/day with batch anchoring. Device-side CPU and memory were not measured; prior IOTA-based DID work reports that DID generation can saturate a Raspberry Pi 4 CPU </w:t>
+        <w:t xml:space="preserve">Measured gas per operation is listed in Table 7. Registering a device costs 55,682 gas, whereas committing an epoch root costs 75,469 gas independent of batch size. Logging one event on-chain costs 182,008 gas, while anchoring a batch costs 134,747 gas, i.e. about 135 gas per record for a 1,000-record batch (≈1351× cheaper); the saving is proportional to the batch size and is ≈68× for the 50 records per batch of the 50-device experiments and ≈270× for 200 devices. At 400 devices and 1 event/s the calculation gives 34.6 M events/day: 6636 MB/day of ledger growth with per-event logging (192 B/entry) versus 13.8 MB/day with batch anchoring. Device-side CPU and memory were not measured; prior IOTA-based DID work reports that DID generation can saturate a Raspberry Pi 4 CPU </w:t>
       </w:r>
       <w:r>
         <w:rPr>
@@ -12937,7 +13779,7 @@
           <w:sz w:val="20"/>
           <w:szCs w:val="20"/>
         </w:rPr>
-        <w:t xml:space="preserve">[31]</w:t>
+        <w:t xml:space="preserve">[43]</w:t>
       </w:r>
       <w:r>
         <w:rPr>
@@ -12953,15 +13795,15 @@
           <w:sz w:val="20"/>
           <w:szCs w:val="20"/>
         </w:rPr>
-        <w:t xml:space="preserve">[32]</w:t>
-      </w:r>
-      <w:r>
-        <w:rPr>
-          <w:rFonts w:ascii="Times New Roman" w:cs="Times New Roman" w:eastAsia="Times New Roman" w:hAnsi="Times New Roman"/>
-          <w:sz w:val="20"/>
-          <w:szCs w:val="20"/>
-        </w:rPr>
-        <w:t xml:space="preserve"> (B5), each on the directory VM behind the same 40 ms netem delay, plus a variant of each with a 10 s decision cache at the PEP (“cached”). All five systems use the same PEP, signatures and policy. Table 10 gives the results (3 repetitions). At 25 and 100 devices the uncached products need 48.3 ms (Keycloak) and 46.8 ms (OpenLDAP) per decision because every request crosses the emulated WAN, against 6.3 ms for BC-ZTA, i.e. 8× and 7× faster. This advantage is mainly the removal of the WAN round trip: a PEP-side cache of the product's answer reaches 9.8–9.5 ms mean latency, and only its P95 (48 ms, one miss per device per TTL) remains WAN-bound. The decisive difference is therefore not the mean latency but what the cache costs: the cached products enforce a revocation only after the cache expires (mean 5.5 s, worst case 9.5 s for the 10 s TTL), whereas BC-ZTA’s event-driven invalidation enforces it in 1.2 s (worst case 2.2 s) at the same low latency. The uncached products are faster at revocation, 84 ms (Keycloak) and 72 ms (OpenLDAP), because the central service is consulted on every request; this is the price BC-ZTA pays for edge autonomy, and a plant that needs sub-second revocation must use the uncached products or a faster block period.</w:t>
+        <w:t xml:space="preserve">[44]</w:t>
+      </w:r>
+      <w:r>
+        <w:rPr>
+          <w:rFonts w:ascii="Times New Roman" w:cs="Times New Roman" w:eastAsia="Times New Roman" w:hAnsi="Times New Roman"/>
+          <w:sz w:val="20"/>
+          <w:szCs w:val="20"/>
+        </w:rPr>
+        <w:t xml:space="preserve"> (B5), each on the directory VM behind the same 40 ms netem delay, plus a variant of each with a 10 s decision cache at the PEP (“cached”). All five systems use the same PEP, signatures and policy. Table 10 gives the results (3 repetitions). At 25 and 100 devices the uncached products need 48.3 ms (Keycloak) and 46.8 ms (OpenLDAP) per decision because every request crosses the emulated WAN, against 6.3 ms for BC-ZTA, i.e. 8× and 7× faster. This advantage is mainly the removal of the WAN round trip: a PEP-side cache of the product's answer reaches 9.8–9.5 ms mean latency, and only its P95 (48 ms, one miss per device per TTL) remains WAN-bound. The decisive difference is therefore not the mean latency but what the cache costs: the cached products enforce a revocation only after the cache expires (mean 5.5 s, worst case 9.5 s for the 10 s TTL), whereas BC-ZTA’s event-driven invalidation enforces it in 1.2 s in this run and 1.3 s in the five-run test of Section VI-F (worst case 2.2 s) at the same low latency. The uncached products are faster at revocation, 84 ms (Keycloak) and 72 ms (OpenLDAP), because the central service is consulted on every request; this is the price BC-ZTA pays for edge autonomy, and a plant that needs sub-second revocation must use the uncached products or a faster block period.</w:t>
       </w:r>
     </w:p>
     <w:p>
@@ -14182,7 +15024,7 @@
           <w:sz w:val="20"/>
           <w:szCs w:val="20"/>
         </w:rPr>
-        <w:t xml:space="preserve">Table 11 reports the outage test: the central service is stopped 20 s into a 100 s run with 100 devices and restarted at 45 s. Without Keycloak or OpenLDAP no new access decisions can be made: 0% of requests were granted during the outage for both uncached products, and 4% for the cached variants, whose entries expired within 2 s of the stop (they kept serving only until the 10 s TTL ran out and, because requests are spread over the TTL, most entries had already expired). Service resumed 1 s after restarting OpenLDAP and 14 s after restarting Keycloak (JVM start-up). BC-ZTA, whose PEP does not contact any central service, granted 100% throughout (Fig. 7). We did not test replicated or clustered Keycloak/OpenLDAP deployments, which would reduce this effect at the cost of operating them; the test shows the single-point-of-failure property that the architecture removes, not that central IAM cannot be made highly available.</w:t>
+        <w:t xml:space="preserve">Table 11 reports the outage test: the central service is stopped 20 s into a 100 s run with 100 devices and restarted at 45 s. Without Keycloak or OpenLDAP no new access decisions can be made: 0% of requests were granted during the outage for both uncached products, and 4% for the cached variants, whose entries expired within 2 s of the stop (they kept serving only until the 10 s TTL ran out and, because requests are spread over the TTL, most entries had already expired). Service resumed 1 s after restarting OpenLDAP and 14 s after restarting Keycloak (JVM start-up). BC-ZTA, whose PEP does not contact any central service, granted 100% throughout (Fig. 7). This test removes a service that BC-ZTA does not use; a design that caches decisions and receives pushed revocations from the same directory would also survive a short outage, so the fair comparison is the loss of each design’s own state source (not tested in this version of the paper). We did not test replicated or clustered Keycloak/OpenLDAP deployments, which would reduce this effect at the cost of operating them; the test shows the single-point-of-failure property that the architecture removes, not that central IAM cannot be made highly available.</w:t>
       </w:r>
     </w:p>
     <w:p>
@@ -16462,6 +17304,20 @@
           <w:sz w:val="20"/>
           <w:szCs w:val="20"/>
         </w:rPr>
+        <w:t xml:space="preserve">Further limitations follow from the security analysis (Section IV-F). The nonce cache is per gateway and the signed request carries no gateway identifier, so a captured request can be replayed once at another gateway within Δ; the default read path trusts one ledger node (the quorum option is implemented but not part of the default measurements); audit completeness is not protected against a compromised gateway; the Merkle epoch proof shows enrolment, not freshness; and the device-side cost of signing and proof storage was not measured, so the claim of compatibility with constrained devices (D5) is an argument, not a result. Each request is signed individually, which is appropriate for access decisions but not for high-rate telemetry, where a session credential issued after one verified request would be used. All statistical statements rest on 2–5 repetitions with standard deviations or 95% confidence intervals and no hypothesis tests.</w:t>
+      </w:r>
+    </w:p>
+    <w:p>
+      <w:pPr>
+        <w:spacing w:after="60" w:before="0" w:line="228"/>
+        <w:jc w:val="both"/>
+      </w:pPr>
+      <w:r>
+        <w:rPr>
+          <w:rFonts w:ascii="Times New Roman" w:cs="Times New Roman" w:eastAsia="Times New Roman" w:hAnsi="Times New Roman"/>
+          <w:sz w:val="20"/>
+          <w:szCs w:val="20"/>
+        </w:rPr>
         <w:t xml:space="preserve">Deployment considerations. First, validators must be run by independent parties (plant, integrator, vendor) for the Byzantine assumption to mean anything. Second, device keys should live in a secure element or TPM, because the architecture’s identity guarantees are only as strong as key custody. Third, on-chain records contain key hashes, scores and event hashes, not process data, which keeps operational data off the shared ledger. Fourth, in the prototype AuditLog and grantSession are callable by any account, and production deployments would restrict them to gateway identities. Fifth, the fail-closed rule of Section III-J trades availability for safety during ledger partitions and should be tuned against plant uptime requirements.</w:t>
       </w:r>
     </w:p>
@@ -16491,7 +17347,7 @@
           <w:sz w:val="20"/>
           <w:szCs w:val="20"/>
         </w:rPr>
-        <w:t xml:space="preserve">We presented BC-ZTA, a blockchain-assisted zero-trust architecture that keeps consensus off the per-request path through edge-cached, Merkle-verified state and asynchronous batched anchoring. Four Solidity contracts pass 15 unit tests, and measured gas shows batch anchoring is about 1351× cheaper per record than per-event logging. In end-to-end tests on a seven-VM Google Cloud deployment with a four-validator Besu network, BC-ZTA decided in 5.4 ms on average at 50 devices and served 200 devices without failures with about one on-chain write per second, and kept deciding while one validator was stopped or the central IAM service was down, while the synchronous design needed 1.4 s at 50 devices and answered only 40% of the requests at 200 devices; the price is a revocation delay of about 1.3 s with event-driven invalidation. All forged, replayed, stale, unregistered, tampered and policy-violating requests were rejected. The evaluation used cloud VMs in a single zone with injected network delay and an emulated device population. Future work includes a multi-site Besu deployment with real network delay, physical devices and industrial protocols, clustered production IAM baselines, learning-based trust scoring and post-quantum signatures.</w:t>
+        <w:t xml:space="preserve">We presented BC-ZTA, a blockchain-assisted zero-trust architecture that keeps consensus off the per-request path through edge-cached, Merkle-verified state and asynchronous batched anchoring. Four Solidity contracts pass 15 unit tests, and measured gas shows batch anchoring is 68–1351× cheaper per record than per-event logging for batches of 50–1,000 records. In end-to-end tests on a seven-VM Google Cloud deployment with a four-validator Besu network, BC-ZTA decided in 5.4 ms on average at 50 devices and served 200 devices without failures with about one on-chain write per second, and kept deciding while one validator was stopped or the central IAM service was down, while the synchronous design needed 1.4 s at 50 devices and answered only 40% of the requests at 200 devices; the price is a revocation delay of about 1.3 s with event-driven invalidation. All forged, replayed, stale, unregistered, tampered and policy-violating requests were rejected. The evaluation used cloud VMs in a single zone with injected network delay and an emulated device population. Future work includes a multi-site Besu deployment with real network delay, physical devices and industrial protocols, clustered production IAM baselines, learning-based trust scoring and post-quantum signatures.</w:t>
       </w:r>
     </w:p>
     <w:p>
@@ -16521,6 +17377,35 @@
           <w:szCs w:val="20"/>
         </w:rPr>
         <w:t xml:space="preserve">[Funding sources and acknowledgments to be added by the authors.]</w:t>
+      </w:r>
+    </w:p>
+    <w:p>
+      <w:pPr>
+        <w:keepNext/>
+        <w:spacing w:after="60" w:before="120"/>
+        <w:jc w:val="center"/>
+      </w:pPr>
+      <w:r>
+        <w:rPr>
+          <w:rFonts w:ascii="Times New Roman" w:cs="Times New Roman" w:eastAsia="Times New Roman" w:hAnsi="Times New Roman"/>
+          <w:sz w:val="18"/>
+          <w:szCs w:val="18"/>
+        </w:rPr>
+        <w:t xml:space="preserve">DATA AND CODE AVAILABILITY</w:t>
+      </w:r>
+    </w:p>
+    <w:p>
+      <w:pPr>
+        <w:spacing w:after="60" w:before="0" w:line="228"/>
+        <w:jc w:val="both"/>
+      </w:pPr>
+      <w:r>
+        <w:rPr>
+          <w:rFonts w:ascii="Times New Roman" w:cs="Times New Roman" w:eastAsia="Times New Roman" w:hAnsi="Times New Roman"/>
+          <w:sz w:val="20"/>
+          <w:szCs w:val="20"/>
+        </w:rPr>
+        <w:t xml:space="preserve">The Solidity contracts, the PEP and load-generator code, the Google Cloud deployment scripts and all raw results used in this paper are available at https://github.com/irfanrazanaqvi/bc-zta-iiot-experiments (archived release with DOI: [to be added by the authors before submission]).</w:t>
       </w:r>
     </w:p>
     <w:p>
@@ -16563,7 +17448,7 @@
         </w:rPr>
         <w:t xml:space="preserve">F. Federici, D. Martintoni, and V. Senni, “A zero-trust architecture for remote access in industrial IoT infrastructures,” Electronics, vol. 12, no. 3, Art. no. 566, 2023, </w:t>
       </w:r>
-      <w:hyperlink w:history="1" r:id="rId9aqn6r98apb0egd4fl7ik">
+      <w:hyperlink w:history="1" r:id="rIdik1qresgntvjx5yaqqfpt">
         <w:r>
           <w:rPr>
             <w:rFonts w:ascii="Times New Roman" w:cs="Times New Roman" w:eastAsia="Times New Roman" w:hAnsi="Times New Roman"/>
@@ -16601,7 +17486,7 @@
         </w:rPr>
         <w:t xml:space="preserve">C. Zanasi, S. Russo, and M. Colajanni, “Flexible zero trust architecture for the cybersecurity of industrial IoT infrastructures,” Ad Hoc Netw., vol. 156, Art. no. 103414, 2024, </w:t>
       </w:r>
-      <w:hyperlink w:history="1" r:id="rIdvrf3h5_m7yoo9fgmr-js0">
+      <w:hyperlink w:history="1" r:id="rId-pb-oimqhurnfbkqbcexh">
         <w:r>
           <w:rPr>
             <w:rFonts w:ascii="Times New Roman" w:cs="Times New Roman" w:eastAsia="Times New Roman" w:hAnsi="Times New Roman"/>
@@ -16639,7 +17524,7 @@
         </w:rPr>
         <w:t xml:space="preserve">S. Rose, O. Borchert, S. Mitchell, and S. Connelly, “Zero trust architecture,” Nat. Inst. Standards Technol., Gaithersburg, MD, USA, Spec. Publ. 800-207, Aug. 2020, </w:t>
       </w:r>
-      <w:hyperlink w:history="1" r:id="rIdyhpn5nqwhoa7vky1u5jo8">
+      <w:hyperlink w:history="1" r:id="rIdb6is-vorulockvmvurpbk">
         <w:r>
           <w:rPr>
             <w:rFonts w:ascii="Times New Roman" w:cs="Times New Roman" w:eastAsia="Times New Roman" w:hAnsi="Times New Roman"/>
@@ -16677,7 +17562,7 @@
         </w:rPr>
         <w:t xml:space="preserve">M. L. Gambo and A. Almulhem, “Zero trust architecture: A systematic literature review,” J. Netw. Syst. Manage., vol. 34, Art. no. 25, 2026, </w:t>
       </w:r>
-      <w:hyperlink w:history="1" r:id="rId818t9opvejjlidxffuvy6">
+      <w:hyperlink w:history="1" r:id="rIdsdky5m8ju1vzfa6xb07oh">
         <w:r>
           <w:rPr>
             <w:rFonts w:ascii="Times New Roman" w:cs="Times New Roman" w:eastAsia="Times New Roman" w:hAnsi="Times New Roman"/>
@@ -16715,7 +17600,7 @@
         </w:rPr>
         <w:t xml:space="preserve">S. Mushtaq, M. Mohsin, and M. M. Mushtaq, “A systematic literature review on the implementation and challenges of zero trust architecture across domains,” Sensors, vol. 25, no. 19, Art. no. 6118, 2025, </w:t>
       </w:r>
-      <w:hyperlink w:history="1" r:id="rIdzni9wvu0cdftpixhvlr4j">
+      <w:hyperlink w:history="1" r:id="rIdeqvby30cny4xfyc3y6afv">
         <w:r>
           <w:rPr>
             <w:rFonts w:ascii="Times New Roman" w:cs="Times New Roman" w:eastAsia="Times New Roman" w:hAnsi="Times New Roman"/>
@@ -16753,7 +17638,7 @@
         </w:rPr>
         <w:t xml:space="preserve">M. A. Azad, S. Abdullah, J. Arshad, H. Lallie, and Y. H. Ahmed, “Verify and trust: A multidimensional survey of zero-trust security in the age of IoT,” Internet Things, vol. 27, Art. no. 101227, 2024, </w:t>
       </w:r>
-      <w:hyperlink w:history="1" r:id="rIdpdm0xujuiq-9q8mga4iz_">
+      <w:hyperlink w:history="1" r:id="rIdwcyfxxksq52pjjlq2tm0w">
         <w:r>
           <w:rPr>
             <w:rFonts w:ascii="Times New Roman" w:cs="Times New Roman" w:eastAsia="Times New Roman" w:hAnsi="Times New Roman"/>
@@ -16791,7 +17676,7 @@
         </w:rPr>
         <w:t xml:space="preserve">S. Mthethwa, M. T. Dlamini, and E. Jembere, “Zero trust for NHIs based on robust identity and access management for a resilient IoT future,” Sensors, vol. 26, no. 8, Art. no. 2392, 2026, </w:t>
       </w:r>
-      <w:hyperlink w:history="1" r:id="rIdh5rguhsonvr4b-6a5czpy">
+      <w:hyperlink w:history="1" r:id="rIdbralhjuchcmw-0iahnckm">
         <w:r>
           <w:rPr>
             <w:rFonts w:ascii="Times New Roman" w:cs="Times New Roman" w:eastAsia="Times New Roman" w:hAnsi="Times New Roman"/>
@@ -16829,7 +17714,7 @@
         </w:rPr>
         <w:t xml:space="preserve">M. Asim, N. Tariq, A. I. Awad, F. Waheed, S. Bukhari, A. Rafay, and H. H. Song, “Lightweight and privacy-aware decentralized identity management for Industrial Internet of Things applications,” Future Gener. Comput. Syst., vol. 186, Art. no. 108753, 2027 (online Aug. 2026), </w:t>
       </w:r>
-      <w:hyperlink w:history="1" r:id="rIdx-33lxilpikji9ourikwb">
+      <w:hyperlink w:history="1" r:id="rId6isbpwnbbruxzcuhrkpb7">
         <w:r>
           <w:rPr>
             <w:rFonts w:ascii="Times New Roman" w:cs="Times New Roman" w:eastAsia="Times New Roman" w:hAnsi="Times New Roman"/>
@@ -16867,7 +17752,7 @@
         </w:rPr>
         <w:t xml:space="preserve">E. B. Fernández and A. Brazhuk, “A critical analysis of zero trust architecture (ZTA),” Comput. Stand. Interfaces, vol. 89, Art. no. 103832, 2024, </w:t>
       </w:r>
-      <w:hyperlink w:history="1" r:id="rIdscswkqlhyhcedtrw79-36">
+      <w:hyperlink w:history="1" r:id="rIdn_gaxpfm6rjyawdnfl5nf">
         <w:r>
           <w:rPr>
             <w:rFonts w:ascii="Times New Roman" w:cs="Times New Roman" w:eastAsia="Times New Roman" w:hAnsi="Times New Roman"/>
@@ -16905,7 +17790,7 @@
         </w:rPr>
         <w:t xml:space="preserve">Y.-W. Ma and P.-H. Chiu, “A novel risk-based access control engine in zero trust architecture for IoT network,” Int. J. Inf. Secur., vol. 24, Art. no. 124, 2025, </w:t>
       </w:r>
-      <w:hyperlink w:history="1" r:id="rIdavowlyyozcsj3nnxl7q_6">
+      <w:hyperlink w:history="1" r:id="rIdskef7nzsnqvqymi1fzbsn">
         <w:r>
           <w:rPr>
             <w:rFonts w:ascii="Times New Roman" w:cs="Times New Roman" w:eastAsia="Times New Roman" w:hAnsi="Times New Roman"/>
@@ -16943,7 +17828,7 @@
         </w:rPr>
         <w:t xml:space="preserve">M. A. Aleisa, “Blockchain-enabled zero trust architecture for privacy-preserving cybersecurity in IoT environments,” IEEE Access, vol. 13, pp. 18660–18676, 2025, </w:t>
       </w:r>
-      <w:hyperlink w:history="1" r:id="rId0exqid-p8asm4rrkqo_ub">
+      <w:hyperlink w:history="1" r:id="rIdalrg_c92_b1g8rblsuk_k">
         <w:r>
           <w:rPr>
             <w:rFonts w:ascii="Times New Roman" w:cs="Times New Roman" w:eastAsia="Times New Roman" w:hAnsi="Times New Roman"/>
@@ -16981,7 +17866,7 @@
         </w:rPr>
         <w:t xml:space="preserve">S. Nie, J. Ren, R. Wu, P. Han, Z. Han, and W. Wan, “Zero-trust access control mechanism based on blockchain and inner-product encryption in the Internet of Things in a 6G environment,” Sensors, vol. 25, no. 2, Art. no. 550, 2025, </w:t>
       </w:r>
-      <w:hyperlink w:history="1" r:id="rIdmbzjlfo6hhteyfipbyo8c">
+      <w:hyperlink w:history="1" r:id="rIdthm6vsezllkqk2_cklcnx">
         <w:r>
           <w:rPr>
             <w:rFonts w:ascii="Times New Roman" w:cs="Times New Roman" w:eastAsia="Times New Roman" w:hAnsi="Times New Roman"/>
@@ -17019,7 +17904,7 @@
         </w:rPr>
         <w:t xml:space="preserve">G. Ali, S. Shah, M. Elaffendi, and N. Ahmad, “Blockchain-based access management framework for interoperable digital twins in industrial IoT,” Front. Blockchain, vol. 8, Art. no. 1693926, 2025, </w:t>
       </w:r>
-      <w:hyperlink w:history="1" r:id="rId2uyee-obs-ri5xi8i8spk">
+      <w:hyperlink w:history="1" r:id="rIdqumxl4-f0klrtushfcha7">
         <w:r>
           <w:rPr>
             <w:rFonts w:ascii="Times New Roman" w:cs="Times New Roman" w:eastAsia="Times New Roman" w:hAnsi="Times New Roman"/>
@@ -17057,7 +17942,7 @@
         </w:rPr>
         <w:t xml:space="preserve">M. Essaid and H. Ju, “Blockchain solutions for enhancing security and privacy in Industrial IoT,” Appl. Sci., vol. 15, no. 12, Art. no. 6835, 2025, </w:t>
       </w:r>
-      <w:hyperlink w:history="1" r:id="rIdav00uf4pyt2cwvmfp5xys">
+      <w:hyperlink w:history="1" r:id="rIdybph3vt7mjjeldtr9qrq5">
         <w:r>
           <w:rPr>
             <w:rFonts w:ascii="Times New Roman" w:cs="Times New Roman" w:eastAsia="Times New Roman" w:hAnsi="Times New Roman"/>
@@ -17095,7 +17980,7 @@
         </w:rPr>
         <w:t xml:space="preserve">D. Li, H. Li, N. Crespi, R. Minerva, M. Li, W. Liang, and K. C. Li, “Hyper-IIoT: A smart contract-inspired access control scheme for resource-constrained Industrial Internet of Things,” IEEE Trans. Sustain. Comput., vol. 10, no. 5, pp. 820–829, 2025, </w:t>
       </w:r>
-      <w:hyperlink w:history="1" r:id="rIdumk7etczjj71f51wfm8sm">
+      <w:hyperlink w:history="1" r:id="rId6kyin3nw-9l4bgaxme3s2">
         <w:r>
           <w:rPr>
             <w:rFonts w:ascii="Times New Roman" w:cs="Times New Roman" w:eastAsia="Times New Roman" w:hAnsi="Times New Roman"/>
@@ -17133,7 +18018,7 @@
         </w:rPr>
         <w:t xml:space="preserve">Z. Guo, “Blockchain-enhanced smart contracts for formal verification of IoT access control mechanisms,” Alexandria Eng. J., vol. 118, pp. 315–324, 2025, </w:t>
       </w:r>
-      <w:hyperlink w:history="1" r:id="rIdttcjwnqhioqeuroscoove">
+      <w:hyperlink w:history="1" r:id="rIdzodamhl4vfpt9f2uydz1r">
         <w:r>
           <w:rPr>
             <w:rFonts w:ascii="Times New Roman" w:cs="Times New Roman" w:eastAsia="Times New Roman" w:hAnsi="Times New Roman"/>
@@ -17171,7 +18056,7 @@
         </w:rPr>
         <w:t xml:space="preserve">A. Singh, V. Pareek, and A. Sharma, “Blockchain-enabled zero trust framework for securing FinTech ecosystems against insider threats and cyber attacks,” </w:t>
       </w:r>
-      <w:hyperlink w:history="1" r:id="rIdq3dgkgdeqkmmixat_gev2">
+      <w:hyperlink w:history="1" r:id="rIdpt4hasj6kzma8p848igh5">
         <w:r>
           <w:rPr>
             <w:rFonts w:ascii="Times New Roman" w:cs="Times New Roman" w:eastAsia="Times New Roman" w:hAnsi="Times New Roman"/>
@@ -17209,7 +18094,7 @@
         </w:rPr>
         <w:t xml:space="preserve">M. M. Salim, M. Kim, S. K. Singh, and J. H. Park, “Zero-trust blockchain-enabled framework for scalable and secure IoT networks,” Future Gener. Comput. Syst., vol. 175, Art. no. 108093, 2026, </w:t>
       </w:r>
-      <w:hyperlink w:history="1" r:id="rIdhi0mlfgivfpdxudsemo2b">
+      <w:hyperlink w:history="1" r:id="rIdsu9gtjbbrnvu-gksxbdnl">
         <w:r>
           <w:rPr>
             <w:rFonts w:ascii="Times New Roman" w:cs="Times New Roman" w:eastAsia="Times New Roman" w:hAnsi="Times New Roman"/>
@@ -17247,7 +18132,7 @@
         </w:rPr>
         <w:t xml:space="preserve">A. Sharma, S. Rani, and W. Boulila, “Blockchain-based zero trust networks with federated transfer learning for IoT security in industry 5.0,” PLOS ONE, vol. 20, no. 6, Art. no. e0323241, 2025, </w:t>
       </w:r>
-      <w:hyperlink w:history="1" r:id="rId20nzaz4hfr5l9txlwmgqf">
+      <w:hyperlink w:history="1" r:id="rIdi4w09rd1jfojw_pei4m2v">
         <w:r>
           <w:rPr>
             <w:rFonts w:ascii="Times New Roman" w:cs="Times New Roman" w:eastAsia="Times New Roman" w:hAnsi="Times New Roman"/>
@@ -17285,7 +18170,7 @@
         </w:rPr>
         <w:t xml:space="preserve">S. Mishra, T. S. M. Aldafas, and N. S. Alshammari, “A zero-trust digital twin framework for privacy-preserving multi-dataset intrusion detection in industrial IoT with lightweight blockchain auditing,” Sci. Rep., vol. 16, Art. no. 15236, 2026, </w:t>
       </w:r>
-      <w:hyperlink w:history="1" r:id="rIdslhhnuwbnfkwygwtsuw6z">
+      <w:hyperlink w:history="1" r:id="rIdtxvsfj8s9ronafobelrof">
         <w:r>
           <w:rPr>
             <w:rFonts w:ascii="Times New Roman" w:cs="Times New Roman" w:eastAsia="Times New Roman" w:hAnsi="Times New Roman"/>
@@ -17323,7 +18208,7 @@
         </w:rPr>
         <w:t xml:space="preserve">Z. Zhai, J. Liu, X. Liu, Y. Mao, X. Zhang, J. Ma, and C. Jin, “A lightweight authentication method for Industrial Internet of Things based on blockchain and Chebyshev chaotic maps,” Future Internet, vol. 17, no. 8, Art. no. 338, 2025, </w:t>
       </w:r>
-      <w:hyperlink w:history="1" r:id="rIdedux-5hhrvb142pskbb35">
+      <w:hyperlink w:history="1" r:id="rId04ghceeqpqv3np_ixgmuz">
         <w:r>
           <w:rPr>
             <w:rFonts w:ascii="Times New Roman" w:cs="Times New Roman" w:eastAsia="Times New Roman" w:hAnsi="Times New Roman"/>
@@ -17361,7 +18246,7 @@
         </w:rPr>
         <w:t xml:space="preserve">T. Ramírez-Gordillo, A. Maciá-Lillo, F. A. Pujol, N. García-D’Urso, J. Azorín-López, and H. Mora, “Decentralized identity management for Internet of Things (IoT) devices using IOTA blockchain technology,” Future Internet, vol. 17, no. 1, Art. no. 49, 2025, </w:t>
       </w:r>
-      <w:hyperlink w:history="1" r:id="rId6bb6rrlurk38dbxju1qw3">
+      <w:hyperlink w:history="1" r:id="rIdeopebolq40q_v7vr2wvi1">
         <w:r>
           <w:rPr>
             <w:rFonts w:ascii="Times New Roman" w:cs="Times New Roman" w:eastAsia="Times New Roman" w:hAnsi="Times New Roman"/>
@@ -17399,7 +18284,7 @@
         </w:rPr>
         <w:t xml:space="preserve">S. I. R. Naqvi, Z. J. Bin, A. Mohsin, M. P. Akhter, and M. M. ur Rahman, “DBoT: Enhancing scalability and privacy in intelligent building spaces through a direct acyclic graph blockchain,” in Proc. 17th Int. Conf. Open Source Syst. Technol. (ICOSST), 2023, </w:t>
       </w:r>
-      <w:hyperlink w:history="1" r:id="rIdw_l-3uhyc7loxk32kzoab">
+      <w:hyperlink w:history="1" r:id="rIdfquyjqwqvpcepciecuubu">
         <w:r>
           <w:rPr>
             <w:rFonts w:ascii="Times New Roman" w:cs="Times New Roman" w:eastAsia="Times New Roman" w:hAnsi="Times New Roman"/>
@@ -17437,7 +18322,7 @@
         </w:rPr>
         <w:t xml:space="preserve">R. Islam, R. Bose, S. Roy, A. A. Khan, S. Sutradhar, S. Das, F. Ali, and A. A. AlZubi, “Decentralized trust framework for smart cities: A blockchain-enabled cybersecurity and data integrity model,” Sci. Rep., vol. 15, Art. no. 23454, 2025, </w:t>
       </w:r>
-      <w:hyperlink w:history="1" r:id="rIdsceddq41acnbagcvwtrrh">
+      <w:hyperlink w:history="1" r:id="rIdugiv57uroxvh3rzengpf7">
         <w:r>
           <w:rPr>
             <w:rFonts w:ascii="Times New Roman" w:cs="Times New Roman" w:eastAsia="Times New Roman" w:hAnsi="Times New Roman"/>
@@ -17475,7 +18360,7 @@
         </w:rPr>
         <w:t xml:space="preserve">P. Rani, “A zero-trust framework for securing next-generation Internet of Things network,” in New Trends and Applications in Internet of Things (IoT) and Big Data Analytics, vol. 2. Cham, Switzerland: Springer, 2026, pp. 213–225, </w:t>
       </w:r>
-      <w:hyperlink w:history="1" r:id="rIdu30sffw0iammjho3zlbev">
+      <w:hyperlink w:history="1" r:id="rIdtx9u-81vterap8kipbgno">
         <w:r>
           <w:rPr>
             <w:rFonts w:ascii="Times New Roman" w:cs="Times New Roman" w:eastAsia="Times New Roman" w:hAnsi="Times New Roman"/>
@@ -17513,7 +18398,7 @@
         </w:rPr>
         <w:t xml:space="preserve">B. Chellaprabha, D. Manohari, and J. J. Justus, “Scalable and secure IoT architecture using trust-driven adaptive resource management and edge intelligence,” in Expert Applications and Security (NICE-TEAS 2025), Lecture Notes in Networks and Systems, vol. 1823. Cham, Switzerland: Springer, 2026, pp. 444–461, </w:t>
       </w:r>
-      <w:hyperlink w:history="1" r:id="rId48oqroymiss_l3kapukcx">
+      <w:hyperlink w:history="1" r:id="rIdv-zkqtgxguyim6oxafrzr">
         <w:r>
           <w:rPr>
             <w:rFonts w:ascii="Times New Roman" w:cs="Times New Roman" w:eastAsia="Times New Roman" w:hAnsi="Times New Roman"/>
@@ -17551,7 +18436,7 @@
         </w:rPr>
         <w:t xml:space="preserve">K. Li et al., “Zero-trust foundation models: A new paradigm for secure and collaborative artificial intelligence for Internet of Things,” </w:t>
       </w:r>
-      <w:hyperlink w:history="1" r:id="rId_mdycpojk0_c_tdu4w2rs">
+      <w:hyperlink w:history="1" r:id="rId3pbkogj4coud9rutwbqb0">
         <w:r>
           <w:rPr>
             <w:rFonts w:ascii="Times New Roman" w:cs="Times New Roman" w:eastAsia="Times New Roman" w:hAnsi="Times New Roman"/>
@@ -17589,7 +18474,7 @@
         </w:rPr>
         <w:t xml:space="preserve">S. Ghasemshirazi, G. Shirvani, and M. A. Alipour, “Zero trust: Applications, challenges, and opportunities,” </w:t>
       </w:r>
-      <w:hyperlink w:history="1" r:id="rIdx29lvdtm9_lleaoaltvsw">
+      <w:hyperlink w:history="1" r:id="rId_altkoyocqflu1not8opz">
         <w:r>
           <w:rPr>
             <w:rFonts w:ascii="Times New Roman" w:cs="Times New Roman" w:eastAsia="Times New Roman" w:hAnsi="Times New Roman"/>
@@ -17627,7 +18512,7 @@
         </w:rPr>
         <w:t xml:space="preserve">A. K. Peepliwal et al., “A prototype model of zero-trust architecture blockchain with EigenTrust-based practical Byzantine fault tolerance protocol to manage decentralized clinical trials,” </w:t>
       </w:r>
-      <w:hyperlink w:history="1" r:id="rIdodos2wmr7q3tcorn5ofgp">
+      <w:hyperlink w:history="1" r:id="rIdwwrl_c3hekligjrxhgdeo">
         <w:r>
           <w:rPr>
             <w:rFonts w:ascii="Times New Roman" w:cs="Times New Roman" w:eastAsia="Times New Roman" w:hAnsi="Times New Roman"/>
@@ -17665,7 +18550,7 @@
         </w:rPr>
         <w:t xml:space="preserve">A. Kulkarni, N. A. Hazari, and M. Y. Niamat, “A zero trust-based framework employing blockchain technology and ring oscillator physical unclonable functions for security of field programmable gate array supply chain,” IEEE Access, vol. 12, pp. 89322–89338, 2024. [Online]. Available: </w:t>
       </w:r>
-      <w:hyperlink w:history="1" r:id="rIdpc6_1qg1jntxeh_oupgwz">
+      <w:hyperlink w:history="1" r:id="rId52ie33p8jjwcnb5fgw7_q">
         <w:r>
           <w:rPr>
             <w:rFonts w:ascii="Times New Roman" w:cs="Times New Roman" w:eastAsia="Times New Roman" w:hAnsi="Times New Roman"/>
@@ -17701,9 +18586,465 @@
           <w:sz w:val="15"/>
           <w:szCs w:val="15"/>
         </w:rPr>
+        <w:t xml:space="preserve">D. Cooper, S. Santesson, S. Farrell, S. Boeyen, R. Housley, and W. Polk, “Internet X.509 public key infrastructure certificate and certificate revocation list (CRL) profile,” Internet Eng. Task Force, RFC 5280, May 2008. [Online]. Available: </w:t>
+      </w:r>
+      <w:hyperlink w:history="1" r:id="rIdvkqtjb92jeczq4y15o9ur">
+        <w:r>
+          <w:rPr>
+            <w:rFonts w:ascii="Times New Roman" w:cs="Times New Roman" w:eastAsia="Times New Roman" w:hAnsi="Times New Roman"/>
+            <w:color w:val="0563C1"/>
+            <w:sz w:val="15"/>
+            <w:szCs w:val="15"/>
+            <w:u w:val="single"/>
+          </w:rPr>
+          <w:t xml:space="preserve">https://www.rfc-editor.org/rfc/rfc5280</w:t>
+        </w:r>
+      </w:hyperlink>
+    </w:p>
+    <w:p>
+      <w:pPr>
+        <w:tabs>
+          <w:tab w:val="left" w:pos="280"/>
+        </w:tabs>
+        <w:spacing w:after="20" w:line="200"/>
+        <w:ind w:left="280" w:hanging="280"/>
+        <w:jc w:val="left"/>
+      </w:pPr>
+      <w:r>
+        <w:rPr>
+          <w:rFonts w:ascii="Times New Roman" w:cs="Times New Roman" w:eastAsia="Times New Roman" w:hAnsi="Times New Roman"/>
+          <w:sz w:val="15"/>
+          <w:szCs w:val="15"/>
+        </w:rPr>
+        <w:t xml:space="preserve">[32]	</w:t>
+      </w:r>
+      <w:r>
+        <w:rPr>
+          <w:rFonts w:ascii="Times New Roman" w:cs="Times New Roman" w:eastAsia="Times New Roman" w:hAnsi="Times New Roman"/>
+          <w:sz w:val="15"/>
+          <w:szCs w:val="15"/>
+        </w:rPr>
+        <w:t xml:space="preserve">S. Santesson, M. Myers, R. Ankney, A. Malpani, S. Galperin, and C. Adams, “X.509 Internet public key infrastructure online certificate status protocol—OCSP,” Internet Eng. Task Force, RFC 6960, Jun. 2013. [Online]. Available: </w:t>
+      </w:r>
+      <w:hyperlink w:history="1" r:id="rIdbxrppsxydqgzvnt7vrkbj">
+        <w:r>
+          <w:rPr>
+            <w:rFonts w:ascii="Times New Roman" w:cs="Times New Roman" w:eastAsia="Times New Roman" w:hAnsi="Times New Roman"/>
+            <w:color w:val="0563C1"/>
+            <w:sz w:val="15"/>
+            <w:szCs w:val="15"/>
+            <w:u w:val="single"/>
+          </w:rPr>
+          <w:t xml:space="preserve">https://www.rfc-editor.org/rfc/rfc6960</w:t>
+        </w:r>
+      </w:hyperlink>
+    </w:p>
+    <w:p>
+      <w:pPr>
+        <w:tabs>
+          <w:tab w:val="left" w:pos="280"/>
+        </w:tabs>
+        <w:spacing w:after="20" w:line="200"/>
+        <w:ind w:left="280" w:hanging="280"/>
+        <w:jc w:val="left"/>
+      </w:pPr>
+      <w:r>
+        <w:rPr>
+          <w:rFonts w:ascii="Times New Roman" w:cs="Times New Roman" w:eastAsia="Times New Roman" w:hAnsi="Times New Roman"/>
+          <w:sz w:val="15"/>
+          <w:szCs w:val="15"/>
+        </w:rPr>
+        <w:t xml:space="preserve">[33]	</w:t>
+      </w:r>
+      <w:r>
+        <w:rPr>
+          <w:rFonts w:ascii="Times New Roman" w:cs="Times New Roman" w:eastAsia="Times New Roman" w:hAnsi="Times New Roman"/>
+          <w:sz w:val="15"/>
+          <w:szCs w:val="15"/>
+        </w:rPr>
+        <w:t xml:space="preserve">D. Eastlake 3rd, “Transport layer security (TLS) extensions: Extension definitions,” Internet Eng. Task Force, RFC 6066, Jan. 2011. [Online]. Available: </w:t>
+      </w:r>
+      <w:hyperlink w:history="1" r:id="rIdole-hyetyizacjne2cblj">
+        <w:r>
+          <w:rPr>
+            <w:rFonts w:ascii="Times New Roman" w:cs="Times New Roman" w:eastAsia="Times New Roman" w:hAnsi="Times New Roman"/>
+            <w:color w:val="0563C1"/>
+            <w:sz w:val="15"/>
+            <w:szCs w:val="15"/>
+            <w:u w:val="single"/>
+          </w:rPr>
+          <w:t xml:space="preserve">https://www.rfc-editor.org/rfc/rfc6066</w:t>
+        </w:r>
+      </w:hyperlink>
+    </w:p>
+    <w:p>
+      <w:pPr>
+        <w:tabs>
+          <w:tab w:val="left" w:pos="280"/>
+        </w:tabs>
+        <w:spacing w:after="20" w:line="200"/>
+        <w:ind w:left="280" w:hanging="280"/>
+        <w:jc w:val="left"/>
+      </w:pPr>
+      <w:r>
+        <w:rPr>
+          <w:rFonts w:ascii="Times New Roman" w:cs="Times New Roman" w:eastAsia="Times New Roman" w:hAnsi="Times New Roman"/>
+          <w:sz w:val="15"/>
+          <w:szCs w:val="15"/>
+        </w:rPr>
+        <w:t xml:space="preserve">[34]	</w:t>
+      </w:r>
+      <w:r>
+        <w:rPr>
+          <w:rFonts w:ascii="Times New Roman" w:cs="Times New Roman" w:eastAsia="Times New Roman" w:hAnsi="Times New Roman"/>
+          <w:sz w:val="15"/>
+          <w:szCs w:val="15"/>
+        </w:rPr>
+        <w:t xml:space="preserve">B. Laurie, A. Langley, and E. Kasper, “Certificate transparency,” Internet Eng. Task Force, RFC 6962, Jun. 2013. [Online]. Available: </w:t>
+      </w:r>
+      <w:hyperlink w:history="1" r:id="rIdopab6bjduktoi-vjzmo5r">
+        <w:r>
+          <w:rPr>
+            <w:rFonts w:ascii="Times New Roman" w:cs="Times New Roman" w:eastAsia="Times New Roman" w:hAnsi="Times New Roman"/>
+            <w:color w:val="0563C1"/>
+            <w:sz w:val="15"/>
+            <w:szCs w:val="15"/>
+            <w:u w:val="single"/>
+          </w:rPr>
+          <w:t xml:space="preserve">https://www.rfc-editor.org/rfc/rfc6962</w:t>
+        </w:r>
+      </w:hyperlink>
+    </w:p>
+    <w:p>
+      <w:pPr>
+        <w:tabs>
+          <w:tab w:val="left" w:pos="280"/>
+        </w:tabs>
+        <w:spacing w:after="20" w:line="200"/>
+        <w:ind w:left="280" w:hanging="280"/>
+        <w:jc w:val="left"/>
+      </w:pPr>
+      <w:r>
+        <w:rPr>
+          <w:rFonts w:ascii="Times New Roman" w:cs="Times New Roman" w:eastAsia="Times New Roman" w:hAnsi="Times New Roman"/>
+          <w:sz w:val="15"/>
+          <w:szCs w:val="15"/>
+        </w:rPr>
+        <w:t xml:space="preserve">[35]	</w:t>
+      </w:r>
+      <w:r>
+        <w:rPr>
+          <w:rFonts w:ascii="Times New Roman" w:cs="Times New Roman" w:eastAsia="Times New Roman" w:hAnsi="Times New Roman"/>
+          <w:sz w:val="15"/>
+          <w:szCs w:val="15"/>
+        </w:rPr>
+        <w:t xml:space="preserve">M. Sporny, D. Longley, M. Sabadello, D. Reed, O. Steele, and C. Allen, “Decentralized identifiers (DIDs) v1.0,” W3C Recommendation, Jul. 2022. [Online]. Available: https://www.w3.org/TR/did-core/ [Online]. Available: </w:t>
+      </w:r>
+      <w:hyperlink w:history="1" r:id="rIddh-icl6jtfgxsoe7dpfma">
+        <w:r>
+          <w:rPr>
+            <w:rFonts w:ascii="Times New Roman" w:cs="Times New Roman" w:eastAsia="Times New Roman" w:hAnsi="Times New Roman"/>
+            <w:color w:val="0563C1"/>
+            <w:sz w:val="15"/>
+            <w:szCs w:val="15"/>
+            <w:u w:val="single"/>
+          </w:rPr>
+          <w:t xml:space="preserve">https://www.w3.org/TR/did-core/</w:t>
+        </w:r>
+      </w:hyperlink>
+    </w:p>
+    <w:p>
+      <w:pPr>
+        <w:tabs>
+          <w:tab w:val="left" w:pos="280"/>
+        </w:tabs>
+        <w:spacing w:after="20" w:line="200"/>
+        <w:ind w:left="280" w:hanging="280"/>
+        <w:jc w:val="left"/>
+      </w:pPr>
+      <w:r>
+        <w:rPr>
+          <w:rFonts w:ascii="Times New Roman" w:cs="Times New Roman" w:eastAsia="Times New Roman" w:hAnsi="Times New Roman"/>
+          <w:sz w:val="15"/>
+          <w:szCs w:val="15"/>
+        </w:rPr>
+        <w:t xml:space="preserve">[36]	</w:t>
+      </w:r>
+      <w:r>
+        <w:rPr>
+          <w:rFonts w:ascii="Times New Roman" w:cs="Times New Roman" w:eastAsia="Times New Roman" w:hAnsi="Times New Roman"/>
+          <w:sz w:val="15"/>
+          <w:szCs w:val="15"/>
+        </w:rPr>
+        <w:t xml:space="preserve">A. Ouaddah, A. Abou Elkalam, and A. Ait Ouahman, “FairAccess: A new blockchain-based access control framework for the Internet of Things,” Secur. Commun. Netw., vol. 9, no. 18, pp. 5943–5964, 2016, </w:t>
+      </w:r>
+      <w:hyperlink w:history="1" r:id="rId-qccxyqyg58ocjsgv-igm">
+        <w:r>
+          <w:rPr>
+            <w:rFonts w:ascii="Times New Roman" w:cs="Times New Roman" w:eastAsia="Times New Roman" w:hAnsi="Times New Roman"/>
+            <w:color w:val="0563C1"/>
+            <w:sz w:val="15"/>
+            <w:szCs w:val="15"/>
+            <w:u w:val="single"/>
+          </w:rPr>
+          <w:t xml:space="preserve">doi: 10.1002/sec.1748.</w:t>
+        </w:r>
+      </w:hyperlink>
+    </w:p>
+    <w:p>
+      <w:pPr>
+        <w:tabs>
+          <w:tab w:val="left" w:pos="280"/>
+        </w:tabs>
+        <w:spacing w:after="20" w:line="200"/>
+        <w:ind w:left="280" w:hanging="280"/>
+        <w:jc w:val="left"/>
+      </w:pPr>
+      <w:r>
+        <w:rPr>
+          <w:rFonts w:ascii="Times New Roman" w:cs="Times New Roman" w:eastAsia="Times New Roman" w:hAnsi="Times New Roman"/>
+          <w:sz w:val="15"/>
+          <w:szCs w:val="15"/>
+        </w:rPr>
+        <w:t xml:space="preserve">[37]	</w:t>
+      </w:r>
+      <w:r>
+        <w:rPr>
+          <w:rFonts w:ascii="Times New Roman" w:cs="Times New Roman" w:eastAsia="Times New Roman" w:hAnsi="Times New Roman"/>
+          <w:sz w:val="15"/>
+          <w:szCs w:val="15"/>
+        </w:rPr>
+        <w:t xml:space="preserve">O. Novo, “Blockchain meets IoT: An architecture for scalable access management in IoT,” IEEE Internet Things J., vol. 5, no. 2, Apr. 2018, </w:t>
+      </w:r>
+      <w:hyperlink w:history="1" r:id="rIdno3zd3qj5zlglu393c-yw">
+        <w:r>
+          <w:rPr>
+            <w:rFonts w:ascii="Times New Roman" w:cs="Times New Roman" w:eastAsia="Times New Roman" w:hAnsi="Times New Roman"/>
+            <w:color w:val="0563C1"/>
+            <w:sz w:val="15"/>
+            <w:szCs w:val="15"/>
+            <w:u w:val="single"/>
+          </w:rPr>
+          <w:t xml:space="preserve">doi: 10.1109/JIOT.2018.2812239.</w:t>
+        </w:r>
+      </w:hyperlink>
+    </w:p>
+    <w:p>
+      <w:pPr>
+        <w:tabs>
+          <w:tab w:val="left" w:pos="280"/>
+        </w:tabs>
+        <w:spacing w:after="20" w:line="200"/>
+        <w:ind w:left="280" w:hanging="280"/>
+        <w:jc w:val="left"/>
+      </w:pPr>
+      <w:r>
+        <w:rPr>
+          <w:rFonts w:ascii="Times New Roman" w:cs="Times New Roman" w:eastAsia="Times New Roman" w:hAnsi="Times New Roman"/>
+          <w:sz w:val="15"/>
+          <w:szCs w:val="15"/>
+        </w:rPr>
+        <w:t xml:space="preserve">[38]	</w:t>
+      </w:r>
+      <w:r>
+        <w:rPr>
+          <w:rFonts w:ascii="Times New Roman" w:cs="Times New Roman" w:eastAsia="Times New Roman" w:hAnsi="Times New Roman"/>
+          <w:sz w:val="15"/>
+          <w:szCs w:val="15"/>
+        </w:rPr>
+        <w:t xml:space="preserve">E. Androulaki et al., “Hyperledger Fabric: A distributed operating system for permissioned blockchains,” in Proc. 13th EuroSys Conf., Porto, Portugal, Apr. 2018, Art. no. 30, </w:t>
+      </w:r>
+      <w:hyperlink w:history="1" r:id="rIdt4upqtgthfwjclk0a1-yr">
+        <w:r>
+          <w:rPr>
+            <w:rFonts w:ascii="Times New Roman" w:cs="Times New Roman" w:eastAsia="Times New Roman" w:hAnsi="Times New Roman"/>
+            <w:color w:val="0563C1"/>
+            <w:sz w:val="15"/>
+            <w:szCs w:val="15"/>
+            <w:u w:val="single"/>
+          </w:rPr>
+          <w:t xml:space="preserve">doi: 10.1145/3190508.3190538.</w:t>
+        </w:r>
+      </w:hyperlink>
+    </w:p>
+    <w:p>
+      <w:pPr>
+        <w:tabs>
+          <w:tab w:val="left" w:pos="280"/>
+        </w:tabs>
+        <w:spacing w:after="20" w:line="200"/>
+        <w:ind w:left="280" w:hanging="280"/>
+        <w:jc w:val="left"/>
+      </w:pPr>
+      <w:r>
+        <w:rPr>
+          <w:rFonts w:ascii="Times New Roman" w:cs="Times New Roman" w:eastAsia="Times New Roman" w:hAnsi="Times New Roman"/>
+          <w:sz w:val="15"/>
+          <w:szCs w:val="15"/>
+        </w:rPr>
+        <w:t xml:space="preserve">[39]	</w:t>
+      </w:r>
+      <w:r>
+        <w:rPr>
+          <w:rFonts w:ascii="Times New Roman" w:cs="Times New Roman" w:eastAsia="Times New Roman" w:hAnsi="Times New Roman"/>
+          <w:sz w:val="15"/>
+          <w:szCs w:val="15"/>
+        </w:rPr>
+        <w:t xml:space="preserve">H. Moniz, “The Istanbul BFT consensus algorithm,” </w:t>
+      </w:r>
+      <w:hyperlink w:history="1" r:id="rIdmihtuplka6dlzmjowestd">
+        <w:r>
+          <w:rPr>
+            <w:rFonts w:ascii="Times New Roman" w:cs="Times New Roman" w:eastAsia="Times New Roman" w:hAnsi="Times New Roman"/>
+            <w:color w:val="0563C1"/>
+            <w:sz w:val="15"/>
+            <w:szCs w:val="15"/>
+            <w:u w:val="single"/>
+          </w:rPr>
+          <w:t xml:space="preserve">arXiv:2002.03613, 2020.</w:t>
+        </w:r>
+      </w:hyperlink>
+    </w:p>
+    <w:p>
+      <w:pPr>
+        <w:tabs>
+          <w:tab w:val="left" w:pos="280"/>
+        </w:tabs>
+        <w:spacing w:after="20" w:line="200"/>
+        <w:ind w:left="280" w:hanging="280"/>
+        <w:jc w:val="left"/>
+      </w:pPr>
+      <w:r>
+        <w:rPr>
+          <w:rFonts w:ascii="Times New Roman" w:cs="Times New Roman" w:eastAsia="Times New Roman" w:hAnsi="Times New Roman"/>
+          <w:sz w:val="15"/>
+          <w:szCs w:val="15"/>
+        </w:rPr>
+        <w:t xml:space="preserve">[40]	</w:t>
+      </w:r>
+      <w:r>
+        <w:rPr>
+          <w:rFonts w:ascii="Times New Roman" w:cs="Times New Roman" w:eastAsia="Times New Roman" w:hAnsi="Times New Roman"/>
+          <w:sz w:val="15"/>
+          <w:szCs w:val="15"/>
+        </w:rPr>
+        <w:t xml:space="preserve">M. Castro and B. Liskov, “Practical Byzantine fault tolerance,” in Proc. 3rd USENIX Symp. Oper. Syst. Design Implement. (OSDI), New Orleans, LA, USA, Feb. 1999, pp. 173–186. [Online]. Available: </w:t>
+      </w:r>
+      <w:hyperlink w:history="1" r:id="rIddsjc12kywmyo8xq7gquju">
+        <w:r>
+          <w:rPr>
+            <w:rFonts w:ascii="Times New Roman" w:cs="Times New Roman" w:eastAsia="Times New Roman" w:hAnsi="Times New Roman"/>
+            <w:color w:val="0563C1"/>
+            <w:sz w:val="15"/>
+            <w:szCs w:val="15"/>
+            <w:u w:val="single"/>
+          </w:rPr>
+          <w:t xml:space="preserve">https://www.usenix.org/conference/osdi-99/practical-byzantine-fault-tolerance</w:t>
+        </w:r>
+      </w:hyperlink>
+    </w:p>
+    <w:p>
+      <w:pPr>
+        <w:tabs>
+          <w:tab w:val="left" w:pos="280"/>
+        </w:tabs>
+        <w:spacing w:after="20" w:line="200"/>
+        <w:ind w:left="280" w:hanging="280"/>
+        <w:jc w:val="left"/>
+      </w:pPr>
+      <w:r>
+        <w:rPr>
+          <w:rFonts w:ascii="Times New Roman" w:cs="Times New Roman" w:eastAsia="Times New Roman" w:hAnsi="Times New Roman"/>
+          <w:sz w:val="15"/>
+          <w:szCs w:val="15"/>
+        </w:rPr>
+        <w:t xml:space="preserve">[41]	</w:t>
+      </w:r>
+      <w:r>
+        <w:rPr>
+          <w:rFonts w:ascii="Times New Roman" w:cs="Times New Roman" w:eastAsia="Times New Roman" w:hAnsi="Times New Roman"/>
+          <w:sz w:val="15"/>
+          <w:szCs w:val="15"/>
+        </w:rPr>
+        <w:t xml:space="preserve">M. Dahlmanns, J. Lohmöller, I. B. Fink, J. Pennekamp, K. Wehrle, and M. Henze, “Easing the conscience with OPC UA: An Internet-wide study on insecure deployments,” in Proc. ACM Internet Meas. Conf. (IMC), Virtual Event, Oct. 2020, pp. 101–110, </w:t>
+      </w:r>
+      <w:hyperlink w:history="1" r:id="rIddvrnszb9lipbodsxgroal">
+        <w:r>
+          <w:rPr>
+            <w:rFonts w:ascii="Times New Roman" w:cs="Times New Roman" w:eastAsia="Times New Roman" w:hAnsi="Times New Roman"/>
+            <w:color w:val="0563C1"/>
+            <w:sz w:val="15"/>
+            <w:szCs w:val="15"/>
+            <w:u w:val="single"/>
+          </w:rPr>
+          <w:t xml:space="preserve">doi: 10.1145/3419394.3423666.</w:t>
+        </w:r>
+      </w:hyperlink>
+    </w:p>
+    <w:p>
+      <w:pPr>
+        <w:tabs>
+          <w:tab w:val="left" w:pos="280"/>
+        </w:tabs>
+        <w:spacing w:after="20" w:line="200"/>
+        <w:ind w:left="280" w:hanging="280"/>
+        <w:jc w:val="left"/>
+      </w:pPr>
+      <w:r>
+        <w:rPr>
+          <w:rFonts w:ascii="Times New Roman" w:cs="Times New Roman" w:eastAsia="Times New Roman" w:hAnsi="Times New Roman"/>
+          <w:sz w:val="15"/>
+          <w:szCs w:val="15"/>
+        </w:rPr>
+        <w:t xml:space="preserve">[42]	</w:t>
+      </w:r>
+      <w:r>
+        <w:rPr>
+          <w:rFonts w:ascii="Times New Roman" w:cs="Times New Roman" w:eastAsia="Times New Roman" w:hAnsi="Times New Roman"/>
+          <w:sz w:val="15"/>
+          <w:szCs w:val="15"/>
+        </w:rPr>
+        <w:t xml:space="preserve">B. Blanchet, “Modeling and verifying security protocols with the applied pi calculus and ProVerif,” Found. Trends Privacy Secur., vol. 1, no. 1–2, pp. 1–135, 2016, </w:t>
+      </w:r>
+      <w:hyperlink w:history="1" r:id="rIdb-s0o6wdxqs-k4suqtiki">
+        <w:r>
+          <w:rPr>
+            <w:rFonts w:ascii="Times New Roman" w:cs="Times New Roman" w:eastAsia="Times New Roman" w:hAnsi="Times New Roman"/>
+            <w:color w:val="0563C1"/>
+            <w:sz w:val="15"/>
+            <w:szCs w:val="15"/>
+            <w:u w:val="single"/>
+          </w:rPr>
+          <w:t xml:space="preserve">doi: 10.1561/3300000004.</w:t>
+        </w:r>
+      </w:hyperlink>
+    </w:p>
+    <w:p>
+      <w:pPr>
+        <w:tabs>
+          <w:tab w:val="left" w:pos="280"/>
+        </w:tabs>
+        <w:spacing w:after="20" w:line="200"/>
+        <w:ind w:left="280" w:hanging="280"/>
+        <w:jc w:val="left"/>
+      </w:pPr>
+      <w:r>
+        <w:rPr>
+          <w:rFonts w:ascii="Times New Roman" w:cs="Times New Roman" w:eastAsia="Times New Roman" w:hAnsi="Times New Roman"/>
+          <w:sz w:val="15"/>
+          <w:szCs w:val="15"/>
+        </w:rPr>
+        <w:t xml:space="preserve">[43]	</w:t>
+      </w:r>
+      <w:r>
+        <w:rPr>
+          <w:rFonts w:ascii="Times New Roman" w:cs="Times New Roman" w:eastAsia="Times New Roman" w:hAnsi="Times New Roman"/>
+          <w:sz w:val="15"/>
+          <w:szCs w:val="15"/>
+        </w:rPr>
         <w:t xml:space="preserve">J. Richer, Ed., “OAuth 2.0 token introspection,” Internet Eng. Task Force, RFC 7662, Oct. 2015. [Online]. Available: </w:t>
       </w:r>
-      <w:hyperlink w:history="1" r:id="rIdako1fy14ypufpviooafxc">
+      <w:hyperlink w:history="1" r:id="rIdobuguhk9ps4c-hemp-oid">
         <w:r>
           <w:rPr>
             <w:rFonts w:ascii="Times New Roman" w:cs="Times New Roman" w:eastAsia="Times New Roman" w:hAnsi="Times New Roman"/>
@@ -17731,7 +19072,7 @@
           <w:sz w:val="15"/>
           <w:szCs w:val="15"/>
         </w:rPr>
-        <w:t xml:space="preserve">[32]	</w:t>
+        <w:t xml:space="preserve">[44]	</w:t>
       </w:r>
       <w:r>
         <w:rPr>
@@ -17741,7 +19082,7 @@
         </w:rPr>
         <w:t xml:space="preserve">J. Sermersheim, Ed., “Lightweight Directory Access Protocol (LDAP): The protocol,” Internet Eng. Task Force, RFC 4511, Jun. 2006. [Online]. Available: </w:t>
       </w:r>
-      <w:hyperlink w:history="1" r:id="rIduvdwujtmw73l2t0oar9gf">
+      <w:hyperlink w:history="1" r:id="rId_tcjopmugmm_ockmfgp6o">
         <w:r>
           <w:rPr>
             <w:rFonts w:ascii="Times New Roman" w:cs="Times New Roman" w:eastAsia="Times New Roman" w:hAnsi="Times New Roman"/>

</xml_diff>

<commit_message>
Paper v3: robustness section (push baseline, quorum, fail-closed, consensus halt, scale-out) and gcp-ext2 results
Co-Authored-By: Claude Sonnet 5.5 <noreply@anthropic.com>
Claude-Session: https://claude.ai/code/session_013MWEbKStV7gCMmHJrttV1T
</commit_message>
<xml_diff>
--- a/paper/paper.docx
+++ b/paper/paper.docx
@@ -101,7 +101,7 @@
           <w:sz w:val="18"/>
           <w:szCs w:val="18"/>
         </w:rPr>
-        <w:t xml:space="preserve">Industrial IoT (IIoT) networks need continuous, per-request verification, but placing a blockchain on the authentication path adds seconds of latency and saturates ledger capacity. We propose BC-ZTA, a three-tier blockchain-assisted zero-trust architecture in which edge policy enforcement points decide from cached, Merkle-verified ledger state, while identity, trust and audit updates are written asynchronously to a permissioned Hyperledger Besu (IBFT 2.0) network through four Solidity contracts. We implemented the policy enforcement point and five baselines, including real Keycloak and OpenLDAP services, and measured them end to end on a four-validator Besu network (five repetitions, seven cloud VMs). At 50 devices BC-ZTA answers in 5.4 ms on average, compared with 49.1 ms for a centralised directory with an injected 40 ms network delay and 1382 ms when every request is an on-chain transaction; the synchronous design answers only 40% of the requests at 200 devices, whereas BC-ZTA served 200 devices with no failures and about one on-chain write per second, and kept deciding while one of the four validators was stopped. Event-driven cache invalidation enforces a revocation in 1.3 s on average, and all 1750 forged, replayed, stale, unregistered, tampered or policy-violating requests were rejected. Merkle batch anchoring cuts audit gas per record by 68× to 1351× for batches of 50 to 1,000 records. Against real Keycloak and OpenLDAP services, BC-ZTA decides 8× faster at 100 devices and keeps granting access when they are down, but revokes in 1.3 s rather than about 84 ms, and its ledger-independent latency (P95 ≤ 8 ms) holds when the ledger is flooded up to 1,200 tx/s. Limitations are the single cloud zone with injected network delay, single-node IAM products, a single-process PEP and the emulated device population.</w:t>
+        <w:t xml:space="preserve">Industrial IoT (IIoT) networks need per-request verification, but a blockchain on the authentication path adds seconds of latency and saturates ledger capacity. We propose BC-ZTA, a three-tier blockchain-assisted zero-trust architecture in which edge policy enforcement points decide from cached, Merkle-verified ledger state, while identity, trust and audit updates are written asynchronously to a permissioned Hyperledger Besu (IBFT 2.0) network. We implemented the enforcement point and six baselines, including real Keycloak and OpenLDAP services and a central directory with pushed revocations, and measured them on a four-validator network of seven cloud VMs. At 50 devices BC-ZTA answers in 5.4 ms, against 49.1 ms for a centralised directory with a 40 ms network delay and 1382 ms when every request is an on-chain transaction; that synchronous design answers only 40% of requests at 200 devices, whereas BC-ZTA served 200 devices without failures. Event-driven invalidation enforces a revocation in 1.3 s, and all 1750 attack requests were rejected. Batch anchoring cuts audit gas per record 68- to 1351-fold. Keycloak and OpenLDAP revoke in about 84 ms but decide 8× slower at 100 devices. A central directory with pushed revocations and no blockchain matches the latency of BC-ZTA and revokes in 109 ms, so the ledger buys trust distribution and verifiable audit, not speed. Both designs fail closed after twice the cache lifetime when their state source is lost, and a consensus halt delays revocations by minutes. Limitations are a single cloud zone, emulated devices and single-node IAM products.</w:t>
       </w:r>
     </w:p>
     <w:p>
@@ -4282,7 +4282,7 @@
           <w:sz w:val="20"/>
           <w:szCs w:val="20"/>
         </w:rPr>
-        <w:t xml:space="preserve"> a device-side workload of one ECDSA signature per request and one stored Merkle path (device-side cost was not measured, Section VI-K).</w:t>
+        <w:t xml:space="preserve"> a device-side workload of one ECDSA signature per request and one stored Merkle path (device-side cost was not measured, Section VI-L).</w:t>
       </w:r>
     </w:p>
     <w:p>
@@ -5790,7 +5790,7 @@
           <w:sz w:val="20"/>
           <w:szCs w:val="20"/>
         </w:rPr>
-        <w:t xml:space="preserve"> = 2 rule is described here but was not evaluated in this version of the paper.</w:t>
+        <w:t xml:space="preserve"> = 2 rule is evaluated in Section VI-J.</w:t>
       </w:r>
     </w:p>
     <w:p>
@@ -5893,7 +5893,7 @@
           <w:sz w:val="20"/>
           <w:szCs w:val="20"/>
         </w:rPr>
-        <w:t xml:space="preserve"> = 4); the default configuration reads from one node, and the cost of the quorum was not measured in this version of the paper.</w:t>
+        <w:t xml:space="preserve"> = 4); the default configuration reads from one node, and the cost of the quorum is reported in Section VI-J.</w:t>
       </w:r>
     </w:p>
     <w:p>
@@ -7181,7 +7181,7 @@
           <w:sz w:val="20"/>
           <w:szCs w:val="20"/>
         </w:rPr>
-        <w:t xml:space="preserve">. If consensus is halted the transaction cannot be finalised, so the bound is measured from finalisation, not from submission (this case was not tested). </w:t>
+        <w:t xml:space="preserve">. If consensus is halted the transaction cannot be finalised, so the bound is measured from finalisation, not from submission (Section VI-J). </w:t>
       </w:r>
       <w:r>
         <w:rPr>
@@ -15024,7 +15024,7 @@
           <w:sz w:val="20"/>
           <w:szCs w:val="20"/>
         </w:rPr>
-        <w:t xml:space="preserve">Table 11 reports the outage test: the central service is stopped 20 s into a 100 s run with 100 devices and restarted at 45 s. Without Keycloak or OpenLDAP no new access decisions can be made: 0% of requests were granted during the outage for both uncached products, and 4% for the cached variants, whose entries expired within 2 s of the stop (they kept serving only until the 10 s TTL ran out and, because requests are spread over the TTL, most entries had already expired). Service resumed 1 s after restarting OpenLDAP and 14 s after restarting Keycloak (JVM start-up). BC-ZTA, whose PEP does not contact any central service, granted 100% throughout (Fig. 7). This test removes a service that BC-ZTA does not use; a design that caches decisions and receives pushed revocations from the same directory would also survive a short outage, so the fair comparison is the loss of each design’s own state source (not tested in this version of the paper). We did not test replicated or clustered Keycloak/OpenLDAP deployments, which would reduce this effect at the cost of operating them; the test shows the single-point-of-failure property that the architecture removes, not that central IAM cannot be made highly available.</w:t>
+        <w:t xml:space="preserve">Table 11 reports the outage test: the central service is stopped 20 s into a 100 s run with 100 devices and restarted at 45 s. Without Keycloak or OpenLDAP no new access decisions can be made: 0% of requests were granted during the outage for both uncached products, and 4% for the cached variants, whose entries expired within 2 s of the stop (they kept serving only until the 10 s TTL ran out and, because requests are spread over the TTL, most entries had already expired). Service resumed 1 s after restarting OpenLDAP and 14 s after restarting Keycloak (JVM start-up). BC-ZTA, whose PEP does not contact any central service, granted 100% throughout (Fig. 7). This test removes a service that BC-ZTA does not use; a design that caches decisions and receives pushed revocations from the same directory would also survive a short outage, so the fair comparison is the loss of each design’s own state source (Section VI-J). We did not test replicated or clustered Keycloak/OpenLDAP deployments, which would reduce this effect at the cost of operating them; the test shows the single-point-of-failure property that the architecture removes, not that central IAM cannot be made highly available.</w:t>
       </w:r>
     </w:p>
     <w:p>
@@ -17229,11 +17229,12 @@
           <w:sz w:val="20"/>
           <w:szCs w:val="20"/>
         </w:rPr>
-        <w:t xml:space="preserve">J. Comparison with Baselines</w:t>
-      </w:r>
-    </w:p>
-    <w:p>
-      <w:pPr>
+        <w:t xml:space="preserve">J. Robustness: Push Revocation, Read Quorum, Fail-Closed Bound, Consensus Halt and Scaling</w:t>
+      </w:r>
+    </w:p>
+    <w:p>
+      <w:pPr>
+        <w:keepNext/>
         <w:spacing w:after="60" w:before="0" w:line="228"/>
         <w:jc w:val="both"/>
       </w:pPr>
@@ -17243,23 +17244,2448 @@
           <w:sz w:val="20"/>
           <w:szCs w:val="20"/>
         </w:rPr>
-        <w:t xml:space="preserve">BC-ZTA is 0.2 ms slower than a ledger-free ABAC store at 50 devices but adds decentralised identity, shared policy and tamper-evident anchored audit that B2 lacks; against the centralised PKI-IAM it is 89% faster at 50 devices (with a 40 ms netem delay on the directory server) and removes the central directory; and against the synchronous blockchain it avoids ~1.4 s per decision at 50 devices and the ledger ceiling. Against real Keycloak and OpenLDAP services (Section VI-H) it is 8× and 7× faster at 100 devices and keeps granting access when they are down, but a PEP-side cache gives similar mean latency at the cost of stale revocations. Its price is revocation latency: about 1.3 s with events (one block) instead of about 84 ms for a central store. A reported Ethereum-based framework pays about 25 ms extra per request even at small scale </w:t>
-      </w:r>
-      <w:r>
-        <w:rPr>
-          <w:rFonts w:ascii="Times New Roman" w:cs="Times New Roman" w:eastAsia="Times New Roman" w:hAnsi="Times New Roman"/>
-          <w:sz w:val="20"/>
-          <w:szCs w:val="20"/>
-        </w:rPr>
-        <w:t xml:space="preserve">[17]</w:t>
-      </w:r>
-      <w:r>
-        <w:rPr>
-          <w:rFonts w:ascii="Times New Roman" w:cs="Times New Roman" w:eastAsia="Times New Roman" w:hAnsi="Times New Roman"/>
-          <w:sz w:val="20"/>
-          <w:szCs w:val="20"/>
-        </w:rPr>
-        <w:t xml:space="preserve">, consistent with our finding that on-path consensus is the bottleneck.</w:t>
+        <w:t xml:space="preserve">The comparison with Keycloak and OpenLDAP leaves open whether the ledger is needed for what BC-ZTA does well. We therefore added baseline B6, a central directory (40 ms WAN delay) whose answers the PEP caches for 30 s and which pushes each revocation to the PEP over a server-sent-event stream, i.e. event-driven invalidation without a blockchain, and BC-ZTA with a read quorum of </w:t>
+      </w:r>
+      <w:r>
+        <w:rPr>
+          <w:rFonts w:ascii="Times New Roman" w:cs="Times New Roman" w:eastAsia="Times New Roman" w:hAnsi="Times New Roman"/>
+          <w:i/>
+          <w:iCs/>
+          <w:sz w:val="20"/>
+          <w:szCs w:val="20"/>
+        </w:rPr>
+        <w:t xml:space="preserve">f</w:t>
+      </w:r>
+      <w:r>
+        <w:rPr>
+          <w:rFonts w:ascii="Times New Roman" w:cs="Times New Roman" w:eastAsia="Times New Roman" w:hAnsi="Times New Roman"/>
+          <w:sz w:val="20"/>
+          <w:szCs w:val="20"/>
+        </w:rPr>
+        <w:t xml:space="preserve"> + 1 = 2 validators (Section III-K). The experiments were repeated 3 times on a fresh network each; Table 13 gives the results. B6 decides in 3.9 ± 0.4 ms at 100 devices against 4.2 ± 0.4 ms for BC-ZTA, so the two are equivalent for access latency. B6 enforces a revocation after 109 ms on average (worst case 154 ms), which is 11× faster than BC-ZTA with quorum (1.2 s, worst case 2.1 s), because BC-ZTA must wait for a block. The read quorum changes the mean latency at 100 devices from 4.2 ± 0.4 to 4.6 ± 1.1 ms, since only cache misses read from two nodes, and no quorum mismatch occurred in the runs. The result is that a trusted central operator who pushes revocations matches BC-ZTA’s latency and revokes faster; what the ledger provides that B6 cannot is that no single operator holds identity, policy and audit records, and that anchored audit can be verified by the other consortium members. Where one operator is acceptable, B6 is the simpler design.</w:t>
+      </w:r>
+    </w:p>
+    <w:p>
+      <w:pPr>
+        <w:keepNext/>
+        <w:spacing w:after="30" w:before="60"/>
+        <w:jc w:val="center"/>
+      </w:pPr>
+      <w:r>
+        <w:rPr>
+          <w:rFonts w:ascii="Times New Roman" w:cs="Times New Roman" w:eastAsia="Times New Roman" w:hAnsi="Times New Roman"/>
+          <w:sz w:val="16"/>
+          <w:szCs w:val="16"/>
+        </w:rPr>
+        <w:t xml:space="preserve">TABLE 13. CENTRAL DIRECTORY WITH PUSH REVOCATION (B6) AND READ QUORUM (3 RUNS)</w:t>
+      </w:r>
+    </w:p>
+    <w:tbl>
+      <w:tblPr>
+        <w:tblW w:type="dxa" w:w="4860"/>
+        <w:tblBorders>
+          <w:top w:val="single" w:color="auto" w:sz="4"/>
+          <w:left w:val="single" w:color="auto" w:sz="4"/>
+          <w:bottom w:val="single" w:color="auto" w:sz="4"/>
+          <w:right w:val="single" w:color="auto" w:sz="4"/>
+          <w:insideH w:val="single" w:color="auto" w:sz="4"/>
+          <w:insideV w:val="single" w:color="auto" w:sz="4"/>
+        </w:tblBorders>
+        <w:tblLayout w:type="fixed"/>
+      </w:tblPr>
+      <w:tblGrid>
+        <w:gridCol w:w="1500"/>
+        <w:gridCol w:w="800"/>
+        <w:gridCol w:w="800"/>
+        <w:gridCol w:w="800"/>
+        <w:gridCol w:w="960"/>
+      </w:tblGrid>
+      <w:tr>
+        <w:trPr>
+          <w:cantSplit/>
+          <w:tblHeader/>
+        </w:trPr>
+        <w:tc>
+          <w:tcPr>
+            <w:tcW w:type="dxa" w:w="1500"/>
+            <w:tcBorders>
+              <w:top w:val="single" w:color="000000" w:sz="4"/>
+              <w:left w:val="none" w:color="FFFFFF" w:sz="0"/>
+              <w:bottom w:val="single" w:color="000000" w:sz="4"/>
+              <w:right w:val="none" w:color="FFFFFF" w:sz="0"/>
+            </w:tcBorders>
+            <w:tcMar>
+              <w:top w:type="dxa" w:w="20"/>
+              <w:left w:type="dxa" w:w="40"/>
+              <w:bottom w:type="dxa" w:w="20"/>
+              <w:right w:type="dxa" w:w="40"/>
+            </w:tcMar>
+            <w:vAlign w:val="center"/>
+          </w:tcPr>
+          <w:p>
+            <w:pPr>
+              <w:keepNext/>
+              <w:spacing w:after="0" w:line="200"/>
+              <w:jc w:val="left"/>
+            </w:pPr>
+            <w:r>
+              <w:rPr>
+                <w:rFonts w:ascii="Times New Roman" w:cs="Times New Roman" w:eastAsia="Times New Roman" w:hAnsi="Times New Roman"/>
+                <w:b/>
+                <w:bCs/>
+                <w:sz w:val="15"/>
+                <w:szCs w:val="15"/>
+              </w:rPr>
+              <w:t xml:space="preserve">System</w:t>
+            </w:r>
+          </w:p>
+        </w:tc>
+        <w:tc>
+          <w:tcPr>
+            <w:tcW w:type="dxa" w:w="800"/>
+            <w:tcBorders>
+              <w:top w:val="single" w:color="000000" w:sz="4"/>
+              <w:left w:val="none" w:color="FFFFFF" w:sz="0"/>
+              <w:bottom w:val="single" w:color="000000" w:sz="4"/>
+              <w:right w:val="none" w:color="FFFFFF" w:sz="0"/>
+            </w:tcBorders>
+            <w:tcMar>
+              <w:top w:type="dxa" w:w="20"/>
+              <w:left w:type="dxa" w:w="40"/>
+              <w:bottom w:type="dxa" w:w="20"/>
+              <w:right w:type="dxa" w:w="40"/>
+            </w:tcMar>
+            <w:vAlign w:val="center"/>
+          </w:tcPr>
+          <w:p>
+            <w:pPr>
+              <w:keepNext/>
+              <w:spacing w:after="0" w:line="200"/>
+              <w:jc w:val="left"/>
+            </w:pPr>
+            <w:r>
+              <w:rPr>
+                <w:rFonts w:ascii="Times New Roman" w:cs="Times New Roman" w:eastAsia="Times New Roman" w:hAnsi="Times New Roman"/>
+                <w:b/>
+                <w:bCs/>
+                <w:sz w:val="15"/>
+                <w:szCs w:val="15"/>
+              </w:rPr>
+              <w:t xml:space="preserve">25 dev.</w:t>
+            </w:r>
+          </w:p>
+        </w:tc>
+        <w:tc>
+          <w:tcPr>
+            <w:tcW w:type="dxa" w:w="800"/>
+            <w:tcBorders>
+              <w:top w:val="single" w:color="000000" w:sz="4"/>
+              <w:left w:val="none" w:color="FFFFFF" w:sz="0"/>
+              <w:bottom w:val="single" w:color="000000" w:sz="4"/>
+              <w:right w:val="none" w:color="FFFFFF" w:sz="0"/>
+            </w:tcBorders>
+            <w:tcMar>
+              <w:top w:type="dxa" w:w="20"/>
+              <w:left w:type="dxa" w:w="40"/>
+              <w:bottom w:type="dxa" w:w="20"/>
+              <w:right w:type="dxa" w:w="40"/>
+            </w:tcMar>
+            <w:vAlign w:val="center"/>
+          </w:tcPr>
+          <w:p>
+            <w:pPr>
+              <w:keepNext/>
+              <w:spacing w:after="0" w:line="200"/>
+              <w:jc w:val="left"/>
+            </w:pPr>
+            <w:r>
+              <w:rPr>
+                <w:rFonts w:ascii="Times New Roman" w:cs="Times New Roman" w:eastAsia="Times New Roman" w:hAnsi="Times New Roman"/>
+                <w:b/>
+                <w:bCs/>
+                <w:sz w:val="15"/>
+                <w:szCs w:val="15"/>
+              </w:rPr>
+              <w:t xml:space="preserve">100 dev.</w:t>
+            </w:r>
+          </w:p>
+        </w:tc>
+        <w:tc>
+          <w:tcPr>
+            <w:tcW w:type="dxa" w:w="800"/>
+            <w:tcBorders>
+              <w:top w:val="single" w:color="000000" w:sz="4"/>
+              <w:left w:val="none" w:color="FFFFFF" w:sz="0"/>
+              <w:bottom w:val="single" w:color="000000" w:sz="4"/>
+              <w:right w:val="none" w:color="FFFFFF" w:sz="0"/>
+            </w:tcBorders>
+            <w:tcMar>
+              <w:top w:type="dxa" w:w="20"/>
+              <w:left w:type="dxa" w:w="40"/>
+              <w:bottom w:type="dxa" w:w="20"/>
+              <w:right w:type="dxa" w:w="40"/>
+            </w:tcMar>
+            <w:vAlign w:val="center"/>
+          </w:tcPr>
+          <w:p>
+            <w:pPr>
+              <w:keepNext/>
+              <w:spacing w:after="0" w:line="200"/>
+              <w:jc w:val="left"/>
+            </w:pPr>
+            <w:r>
+              <w:rPr>
+                <w:rFonts w:ascii="Times New Roman" w:cs="Times New Roman" w:eastAsia="Times New Roman" w:hAnsi="Times New Roman"/>
+                <w:b/>
+                <w:bCs/>
+                <w:sz w:val="15"/>
+                <w:szCs w:val="15"/>
+              </w:rPr>
+              <w:t xml:space="preserve">200 dev.</w:t>
+            </w:r>
+          </w:p>
+        </w:tc>
+        <w:tc>
+          <w:tcPr>
+            <w:tcW w:type="dxa" w:w="960"/>
+            <w:tcBorders>
+              <w:top w:val="single" w:color="000000" w:sz="4"/>
+              <w:left w:val="none" w:color="FFFFFF" w:sz="0"/>
+              <w:bottom w:val="single" w:color="000000" w:sz="4"/>
+              <w:right w:val="none" w:color="FFFFFF" w:sz="0"/>
+            </w:tcBorders>
+            <w:tcMar>
+              <w:top w:type="dxa" w:w="20"/>
+              <w:left w:type="dxa" w:w="40"/>
+              <w:bottom w:type="dxa" w:w="20"/>
+              <w:right w:type="dxa" w:w="40"/>
+            </w:tcMar>
+            <w:vAlign w:val="center"/>
+          </w:tcPr>
+          <w:p>
+            <w:pPr>
+              <w:keepNext/>
+              <w:spacing w:after="0" w:line="200"/>
+              <w:jc w:val="left"/>
+            </w:pPr>
+            <w:r>
+              <w:rPr>
+                <w:rFonts w:ascii="Times New Roman" w:cs="Times New Roman" w:eastAsia="Times New Roman" w:hAnsi="Times New Roman"/>
+                <w:b/>
+                <w:bCs/>
+                <w:sz w:val="15"/>
+                <w:szCs w:val="15"/>
+              </w:rPr>
+              <w:t xml:space="preserve">Revoc. (ms)</w:t>
+            </w:r>
+          </w:p>
+        </w:tc>
+      </w:tr>
+      <w:tr>
+        <w:trPr>
+          <w:cantSplit/>
+        </w:trPr>
+        <w:tc>
+          <w:tcPr>
+            <w:tcW w:type="dxa" w:w="1500"/>
+            <w:tcBorders>
+              <w:top w:val="none" w:color="FFFFFF" w:sz="0"/>
+              <w:left w:val="none" w:color="FFFFFF" w:sz="0"/>
+              <w:bottom w:val="none" w:color="FFFFFF" w:sz="0"/>
+              <w:right w:val="none" w:color="FFFFFF" w:sz="0"/>
+            </w:tcBorders>
+            <w:tcMar>
+              <w:top w:type="dxa" w:w="20"/>
+              <w:left w:type="dxa" w:w="40"/>
+              <w:bottom w:type="dxa" w:w="20"/>
+              <w:right w:type="dxa" w:w="40"/>
+            </w:tcMar>
+            <w:vAlign w:val="center"/>
+          </w:tcPr>
+          <w:p>
+            <w:pPr>
+              <w:keepNext/>
+              <w:spacing w:after="0" w:line="200"/>
+              <w:jc w:val="left"/>
+            </w:pPr>
+            <w:r>
+              <w:rPr>
+                <w:rFonts w:ascii="Times New Roman" w:cs="Times New Roman" w:eastAsia="Times New Roman" w:hAnsi="Times New Roman"/>
+                <w:b w:val="false"/>
+                <w:bCs w:val="false"/>
+                <w:sz w:val="15"/>
+                <w:szCs w:val="15"/>
+              </w:rPr>
+              <w:t xml:space="preserve">B6 push</w:t>
+            </w:r>
+          </w:p>
+        </w:tc>
+        <w:tc>
+          <w:tcPr>
+            <w:tcW w:type="dxa" w:w="800"/>
+            <w:tcBorders>
+              <w:top w:val="none" w:color="FFFFFF" w:sz="0"/>
+              <w:left w:val="none" w:color="FFFFFF" w:sz="0"/>
+              <w:bottom w:val="none" w:color="FFFFFF" w:sz="0"/>
+              <w:right w:val="none" w:color="FFFFFF" w:sz="0"/>
+            </w:tcBorders>
+            <w:tcMar>
+              <w:top w:type="dxa" w:w="20"/>
+              <w:left w:type="dxa" w:w="40"/>
+              <w:bottom w:type="dxa" w:w="20"/>
+              <w:right w:type="dxa" w:w="40"/>
+            </w:tcMar>
+            <w:vAlign w:val="center"/>
+          </w:tcPr>
+          <w:p>
+            <w:pPr>
+              <w:keepNext/>
+              <w:spacing w:after="0" w:line="200"/>
+              <w:jc w:val="left"/>
+            </w:pPr>
+            <w:r>
+              <w:rPr>
+                <w:rFonts w:ascii="Times New Roman" w:cs="Times New Roman" w:eastAsia="Times New Roman" w:hAnsi="Times New Roman"/>
+                <w:b w:val="false"/>
+                <w:bCs w:val="false"/>
+                <w:sz w:val="15"/>
+                <w:szCs w:val="15"/>
+              </w:rPr>
+              <w:t xml:space="preserve">4.7 ± 0.3</w:t>
+            </w:r>
+          </w:p>
+        </w:tc>
+        <w:tc>
+          <w:tcPr>
+            <w:tcW w:type="dxa" w:w="800"/>
+            <w:tcBorders>
+              <w:top w:val="none" w:color="FFFFFF" w:sz="0"/>
+              <w:left w:val="none" w:color="FFFFFF" w:sz="0"/>
+              <w:bottom w:val="none" w:color="FFFFFF" w:sz="0"/>
+              <w:right w:val="none" w:color="FFFFFF" w:sz="0"/>
+            </w:tcBorders>
+            <w:tcMar>
+              <w:top w:type="dxa" w:w="20"/>
+              <w:left w:type="dxa" w:w="40"/>
+              <w:bottom w:type="dxa" w:w="20"/>
+              <w:right w:type="dxa" w:w="40"/>
+            </w:tcMar>
+            <w:vAlign w:val="center"/>
+          </w:tcPr>
+          <w:p>
+            <w:pPr>
+              <w:keepNext/>
+              <w:spacing w:after="0" w:line="200"/>
+              <w:jc w:val="left"/>
+            </w:pPr>
+            <w:r>
+              <w:rPr>
+                <w:rFonts w:ascii="Times New Roman" w:cs="Times New Roman" w:eastAsia="Times New Roman" w:hAnsi="Times New Roman"/>
+                <w:b w:val="false"/>
+                <w:bCs w:val="false"/>
+                <w:sz w:val="15"/>
+                <w:szCs w:val="15"/>
+              </w:rPr>
+              <w:t xml:space="preserve">3.9 ± 0.4</w:t>
+            </w:r>
+          </w:p>
+        </w:tc>
+        <w:tc>
+          <w:tcPr>
+            <w:tcW w:type="dxa" w:w="800"/>
+            <w:tcBorders>
+              <w:top w:val="none" w:color="FFFFFF" w:sz="0"/>
+              <w:left w:val="none" w:color="FFFFFF" w:sz="0"/>
+              <w:bottom w:val="none" w:color="FFFFFF" w:sz="0"/>
+              <w:right w:val="none" w:color="FFFFFF" w:sz="0"/>
+            </w:tcBorders>
+            <w:tcMar>
+              <w:top w:type="dxa" w:w="20"/>
+              <w:left w:type="dxa" w:w="40"/>
+              <w:bottom w:type="dxa" w:w="20"/>
+              <w:right w:type="dxa" w:w="40"/>
+            </w:tcMar>
+            <w:vAlign w:val="center"/>
+          </w:tcPr>
+          <w:p>
+            <w:pPr>
+              <w:keepNext/>
+              <w:spacing w:after="0" w:line="200"/>
+              <w:jc w:val="left"/>
+            </w:pPr>
+            <w:r>
+              <w:rPr>
+                <w:rFonts w:ascii="Times New Roman" w:cs="Times New Roman" w:eastAsia="Times New Roman" w:hAnsi="Times New Roman"/>
+                <w:b w:val="false"/>
+                <w:bCs w:val="false"/>
+                <w:sz w:val="15"/>
+                <w:szCs w:val="15"/>
+              </w:rPr>
+              <w:t xml:space="preserve">3.6 ± 0.3</w:t>
+            </w:r>
+          </w:p>
+        </w:tc>
+        <w:tc>
+          <w:tcPr>
+            <w:tcW w:type="dxa" w:w="960"/>
+            <w:tcBorders>
+              <w:top w:val="none" w:color="FFFFFF" w:sz="0"/>
+              <w:left w:val="none" w:color="FFFFFF" w:sz="0"/>
+              <w:bottom w:val="none" w:color="FFFFFF" w:sz="0"/>
+              <w:right w:val="none" w:color="FFFFFF" w:sz="0"/>
+            </w:tcBorders>
+            <w:tcMar>
+              <w:top w:type="dxa" w:w="20"/>
+              <w:left w:type="dxa" w:w="40"/>
+              <w:bottom w:type="dxa" w:w="20"/>
+              <w:right w:type="dxa" w:w="40"/>
+            </w:tcMar>
+            <w:vAlign w:val="center"/>
+          </w:tcPr>
+          <w:p>
+            <w:pPr>
+              <w:keepNext/>
+              <w:spacing w:after="0" w:line="200"/>
+              <w:jc w:val="left"/>
+            </w:pPr>
+            <w:r>
+              <w:rPr>
+                <w:rFonts w:ascii="Times New Roman" w:cs="Times New Roman" w:eastAsia="Times New Roman" w:hAnsi="Times New Roman"/>
+                <w:b w:val="false"/>
+                <w:bCs w:val="false"/>
+                <w:sz w:val="15"/>
+                <w:szCs w:val="15"/>
+              </w:rPr>
+              <w:t xml:space="preserve">109</w:t>
+            </w:r>
+          </w:p>
+        </w:tc>
+      </w:tr>
+      <w:tr>
+        <w:trPr>
+          <w:cantSplit/>
+        </w:trPr>
+        <w:tc>
+          <w:tcPr>
+            <w:tcW w:type="dxa" w:w="1500"/>
+            <w:tcBorders>
+              <w:top w:val="none" w:color="FFFFFF" w:sz="0"/>
+              <w:left w:val="none" w:color="FFFFFF" w:sz="0"/>
+              <w:bottom w:val="none" w:color="FFFFFF" w:sz="0"/>
+              <w:right w:val="none" w:color="FFFFFF" w:sz="0"/>
+            </w:tcBorders>
+            <w:tcMar>
+              <w:top w:type="dxa" w:w="20"/>
+              <w:left w:type="dxa" w:w="40"/>
+              <w:bottom w:type="dxa" w:w="20"/>
+              <w:right w:type="dxa" w:w="40"/>
+            </w:tcMar>
+            <w:vAlign w:val="center"/>
+          </w:tcPr>
+          <w:p>
+            <w:pPr>
+              <w:keepNext/>
+              <w:spacing w:after="0" w:line="200"/>
+              <w:jc w:val="left"/>
+            </w:pPr>
+            <w:r>
+              <w:rPr>
+                <w:rFonts w:ascii="Times New Roman" w:cs="Times New Roman" w:eastAsia="Times New Roman" w:hAnsi="Times New Roman"/>
+                <w:b w:val="false"/>
+                <w:bCs w:val="false"/>
+                <w:sz w:val="15"/>
+                <w:szCs w:val="15"/>
+              </w:rPr>
+              <w:t xml:space="preserve">BC-ZTA</w:t>
+            </w:r>
+          </w:p>
+        </w:tc>
+        <w:tc>
+          <w:tcPr>
+            <w:tcW w:type="dxa" w:w="800"/>
+            <w:tcBorders>
+              <w:top w:val="none" w:color="FFFFFF" w:sz="0"/>
+              <w:left w:val="none" w:color="FFFFFF" w:sz="0"/>
+              <w:bottom w:val="none" w:color="FFFFFF" w:sz="0"/>
+              <w:right w:val="none" w:color="FFFFFF" w:sz="0"/>
+            </w:tcBorders>
+            <w:tcMar>
+              <w:top w:type="dxa" w:w="20"/>
+              <w:left w:type="dxa" w:w="40"/>
+              <w:bottom w:type="dxa" w:w="20"/>
+              <w:right w:type="dxa" w:w="40"/>
+            </w:tcMar>
+            <w:vAlign w:val="center"/>
+          </w:tcPr>
+          <w:p>
+            <w:pPr>
+              <w:keepNext/>
+              <w:spacing w:after="0" w:line="200"/>
+              <w:jc w:val="left"/>
+            </w:pPr>
+            <w:r>
+              <w:rPr>
+                <w:rFonts w:ascii="Times New Roman" w:cs="Times New Roman" w:eastAsia="Times New Roman" w:hAnsi="Times New Roman"/>
+                <w:b w:val="false"/>
+                <w:bCs w:val="false"/>
+                <w:sz w:val="15"/>
+                <w:szCs w:val="15"/>
+              </w:rPr>
+              <w:t xml:space="preserve">4.5 ± 0.5</w:t>
+            </w:r>
+          </w:p>
+        </w:tc>
+        <w:tc>
+          <w:tcPr>
+            <w:tcW w:type="dxa" w:w="800"/>
+            <w:tcBorders>
+              <w:top w:val="none" w:color="FFFFFF" w:sz="0"/>
+              <w:left w:val="none" w:color="FFFFFF" w:sz="0"/>
+              <w:bottom w:val="none" w:color="FFFFFF" w:sz="0"/>
+              <w:right w:val="none" w:color="FFFFFF" w:sz="0"/>
+            </w:tcBorders>
+            <w:tcMar>
+              <w:top w:type="dxa" w:w="20"/>
+              <w:left w:type="dxa" w:w="40"/>
+              <w:bottom w:type="dxa" w:w="20"/>
+              <w:right w:type="dxa" w:w="40"/>
+            </w:tcMar>
+            <w:vAlign w:val="center"/>
+          </w:tcPr>
+          <w:p>
+            <w:pPr>
+              <w:keepNext/>
+              <w:spacing w:after="0" w:line="200"/>
+              <w:jc w:val="left"/>
+            </w:pPr>
+            <w:r>
+              <w:rPr>
+                <w:rFonts w:ascii="Times New Roman" w:cs="Times New Roman" w:eastAsia="Times New Roman" w:hAnsi="Times New Roman"/>
+                <w:b w:val="false"/>
+                <w:bCs w:val="false"/>
+                <w:sz w:val="15"/>
+                <w:szCs w:val="15"/>
+              </w:rPr>
+              <w:t xml:space="preserve">4.2 ± 0.4</w:t>
+            </w:r>
+          </w:p>
+        </w:tc>
+        <w:tc>
+          <w:tcPr>
+            <w:tcW w:type="dxa" w:w="800"/>
+            <w:tcBorders>
+              <w:top w:val="none" w:color="FFFFFF" w:sz="0"/>
+              <w:left w:val="none" w:color="FFFFFF" w:sz="0"/>
+              <w:bottom w:val="none" w:color="FFFFFF" w:sz="0"/>
+              <w:right w:val="none" w:color="FFFFFF" w:sz="0"/>
+            </w:tcBorders>
+            <w:tcMar>
+              <w:top w:type="dxa" w:w="20"/>
+              <w:left w:type="dxa" w:w="40"/>
+              <w:bottom w:type="dxa" w:w="20"/>
+              <w:right w:type="dxa" w:w="40"/>
+            </w:tcMar>
+            <w:vAlign w:val="center"/>
+          </w:tcPr>
+          <w:p>
+            <w:pPr>
+              <w:keepNext/>
+              <w:spacing w:after="0" w:line="200"/>
+              <w:jc w:val="left"/>
+            </w:pPr>
+            <w:r>
+              <w:rPr>
+                <w:rFonts w:ascii="Times New Roman" w:cs="Times New Roman" w:eastAsia="Times New Roman" w:hAnsi="Times New Roman"/>
+                <w:b w:val="false"/>
+                <w:bCs w:val="false"/>
+                <w:sz w:val="15"/>
+                <w:szCs w:val="15"/>
+              </w:rPr>
+              <w:t xml:space="preserve">4.0 ± 0.3</w:t>
+            </w:r>
+          </w:p>
+        </w:tc>
+        <w:tc>
+          <w:tcPr>
+            <w:tcW w:type="dxa" w:w="960"/>
+            <w:tcBorders>
+              <w:top w:val="none" w:color="FFFFFF" w:sz="0"/>
+              <w:left w:val="none" w:color="FFFFFF" w:sz="0"/>
+              <w:bottom w:val="none" w:color="FFFFFF" w:sz="0"/>
+              <w:right w:val="none" w:color="FFFFFF" w:sz="0"/>
+            </w:tcBorders>
+            <w:tcMar>
+              <w:top w:type="dxa" w:w="20"/>
+              <w:left w:type="dxa" w:w="40"/>
+              <w:bottom w:type="dxa" w:w="20"/>
+              <w:right w:type="dxa" w:w="40"/>
+            </w:tcMar>
+            <w:vAlign w:val="center"/>
+          </w:tcPr>
+          <w:p>
+            <w:pPr>
+              <w:keepNext/>
+              <w:spacing w:after="0" w:line="200"/>
+              <w:jc w:val="left"/>
+            </w:pPr>
+            <w:r>
+              <w:rPr>
+                <w:rFonts w:ascii="Times New Roman" w:cs="Times New Roman" w:eastAsia="Times New Roman" w:hAnsi="Times New Roman"/>
+                <w:b w:val="false"/>
+                <w:bCs w:val="false"/>
+                <w:sz w:val="15"/>
+                <w:szCs w:val="15"/>
+              </w:rPr>
+              <w:t xml:space="preserve">see Table 10</w:t>
+            </w:r>
+          </w:p>
+        </w:tc>
+      </w:tr>
+      <w:tr>
+        <w:trPr>
+          <w:cantSplit/>
+        </w:trPr>
+        <w:tc>
+          <w:tcPr>
+            <w:tcW w:type="dxa" w:w="1500"/>
+            <w:tcBorders>
+              <w:top w:val="none" w:color="FFFFFF" w:sz="0"/>
+              <w:left w:val="none" w:color="FFFFFF" w:sz="0"/>
+              <w:bottom w:val="single" w:color="000000" w:sz="4"/>
+              <w:right w:val="none" w:color="FFFFFF" w:sz="0"/>
+            </w:tcBorders>
+            <w:tcMar>
+              <w:top w:type="dxa" w:w="20"/>
+              <w:left w:type="dxa" w:w="40"/>
+              <w:bottom w:type="dxa" w:w="20"/>
+              <w:right w:type="dxa" w:w="40"/>
+            </w:tcMar>
+            <w:vAlign w:val="center"/>
+          </w:tcPr>
+          <w:p>
+            <w:pPr>
+              <w:keepNext/>
+              <w:spacing w:after="0" w:line="200"/>
+              <w:jc w:val="left"/>
+            </w:pPr>
+            <w:r>
+              <w:rPr>
+                <w:rFonts w:ascii="Times New Roman" w:cs="Times New Roman" w:eastAsia="Times New Roman" w:hAnsi="Times New Roman"/>
+                <w:b w:val="false"/>
+                <w:bCs w:val="false"/>
+                <w:sz w:val="15"/>
+                <w:szCs w:val="15"/>
+              </w:rPr>
+              <w:t xml:space="preserve">BC-ZTA, quorum 2</w:t>
+            </w:r>
+          </w:p>
+        </w:tc>
+        <w:tc>
+          <w:tcPr>
+            <w:tcW w:type="dxa" w:w="800"/>
+            <w:tcBorders>
+              <w:top w:val="none" w:color="FFFFFF" w:sz="0"/>
+              <w:left w:val="none" w:color="FFFFFF" w:sz="0"/>
+              <w:bottom w:val="single" w:color="000000" w:sz="4"/>
+              <w:right w:val="none" w:color="FFFFFF" w:sz="0"/>
+            </w:tcBorders>
+            <w:tcMar>
+              <w:top w:type="dxa" w:w="20"/>
+              <w:left w:type="dxa" w:w="40"/>
+              <w:bottom w:type="dxa" w:w="20"/>
+              <w:right w:type="dxa" w:w="40"/>
+            </w:tcMar>
+            <w:vAlign w:val="center"/>
+          </w:tcPr>
+          <w:p>
+            <w:pPr>
+              <w:keepNext/>
+              <w:spacing w:after="0" w:line="200"/>
+              <w:jc w:val="left"/>
+            </w:pPr>
+            <w:r>
+              <w:rPr>
+                <w:rFonts w:ascii="Times New Roman" w:cs="Times New Roman" w:eastAsia="Times New Roman" w:hAnsi="Times New Roman"/>
+                <w:b w:val="false"/>
+                <w:bCs w:val="false"/>
+                <w:sz w:val="15"/>
+                <w:szCs w:val="15"/>
+              </w:rPr>
+              <w:t xml:space="preserve">4.6 ± 0.2</w:t>
+            </w:r>
+          </w:p>
+        </w:tc>
+        <w:tc>
+          <w:tcPr>
+            <w:tcW w:type="dxa" w:w="800"/>
+            <w:tcBorders>
+              <w:top w:val="none" w:color="FFFFFF" w:sz="0"/>
+              <w:left w:val="none" w:color="FFFFFF" w:sz="0"/>
+              <w:bottom w:val="single" w:color="000000" w:sz="4"/>
+              <w:right w:val="none" w:color="FFFFFF" w:sz="0"/>
+            </w:tcBorders>
+            <w:tcMar>
+              <w:top w:type="dxa" w:w="20"/>
+              <w:left w:type="dxa" w:w="40"/>
+              <w:bottom w:type="dxa" w:w="20"/>
+              <w:right w:type="dxa" w:w="40"/>
+            </w:tcMar>
+            <w:vAlign w:val="center"/>
+          </w:tcPr>
+          <w:p>
+            <w:pPr>
+              <w:keepNext/>
+              <w:spacing w:after="0" w:line="200"/>
+              <w:jc w:val="left"/>
+            </w:pPr>
+            <w:r>
+              <w:rPr>
+                <w:rFonts w:ascii="Times New Roman" w:cs="Times New Roman" w:eastAsia="Times New Roman" w:hAnsi="Times New Roman"/>
+                <w:b w:val="false"/>
+                <w:bCs w:val="false"/>
+                <w:sz w:val="15"/>
+                <w:szCs w:val="15"/>
+              </w:rPr>
+              <w:t xml:space="preserve">4.6 ± 1.1</w:t>
+            </w:r>
+          </w:p>
+        </w:tc>
+        <w:tc>
+          <w:tcPr>
+            <w:tcW w:type="dxa" w:w="800"/>
+            <w:tcBorders>
+              <w:top w:val="none" w:color="FFFFFF" w:sz="0"/>
+              <w:left w:val="none" w:color="FFFFFF" w:sz="0"/>
+              <w:bottom w:val="single" w:color="000000" w:sz="4"/>
+              <w:right w:val="none" w:color="FFFFFF" w:sz="0"/>
+            </w:tcBorders>
+            <w:tcMar>
+              <w:top w:type="dxa" w:w="20"/>
+              <w:left w:type="dxa" w:w="40"/>
+              <w:bottom w:type="dxa" w:w="20"/>
+              <w:right w:type="dxa" w:w="40"/>
+            </w:tcMar>
+            <w:vAlign w:val="center"/>
+          </w:tcPr>
+          <w:p>
+            <w:pPr>
+              <w:keepNext/>
+              <w:spacing w:after="0" w:line="200"/>
+              <w:jc w:val="left"/>
+            </w:pPr>
+            <w:r>
+              <w:rPr>
+                <w:rFonts w:ascii="Times New Roman" w:cs="Times New Roman" w:eastAsia="Times New Roman" w:hAnsi="Times New Roman"/>
+                <w:b w:val="false"/>
+                <w:bCs w:val="false"/>
+                <w:sz w:val="15"/>
+                <w:szCs w:val="15"/>
+              </w:rPr>
+              <w:t xml:space="preserve">4.0 ± 0.5</w:t>
+            </w:r>
+          </w:p>
+        </w:tc>
+        <w:tc>
+          <w:tcPr>
+            <w:tcW w:type="dxa" w:w="960"/>
+            <w:tcBorders>
+              <w:top w:val="none" w:color="FFFFFF" w:sz="0"/>
+              <w:left w:val="none" w:color="FFFFFF" w:sz="0"/>
+              <w:bottom w:val="single" w:color="000000" w:sz="4"/>
+              <w:right w:val="none" w:color="FFFFFF" w:sz="0"/>
+            </w:tcBorders>
+            <w:tcMar>
+              <w:top w:type="dxa" w:w="20"/>
+              <w:left w:type="dxa" w:w="40"/>
+              <w:bottom w:type="dxa" w:w="20"/>
+              <w:right w:type="dxa" w:w="40"/>
+            </w:tcMar>
+            <w:vAlign w:val="center"/>
+          </w:tcPr>
+          <w:p>
+            <w:pPr>
+              <w:keepNext/>
+              <w:spacing w:after="0" w:line="200"/>
+              <w:jc w:val="left"/>
+            </w:pPr>
+            <w:r>
+              <w:rPr>
+                <w:rFonts w:ascii="Times New Roman" w:cs="Times New Roman" w:eastAsia="Times New Roman" w:hAnsi="Times New Roman"/>
+                <w:b w:val="false"/>
+                <w:bCs w:val="false"/>
+                <w:sz w:val="15"/>
+                <w:szCs w:val="15"/>
+              </w:rPr>
+              <w:t xml:space="preserve">1162</w:t>
+            </w:r>
+          </w:p>
+        </w:tc>
+      </w:tr>
+    </w:tbl>
+    <w:p>
+      <w:pPr>
+        <w:spacing w:after="80" w:before="20"/>
+        <w:jc w:val="both"/>
+      </w:pPr>
+      <w:r>
+        <w:rPr>
+          <w:rFonts w:ascii="Times New Roman" w:cs="Times New Roman" w:eastAsia="Times New Roman" w:hAnsi="Times New Roman"/>
+          <w:sz w:val="14"/>
+          <w:szCs w:val="14"/>
+        </w:rPr>
+        <w:t xml:space="preserve">Mean latency (ms) ± 95% CI of 3 runs; revocation: mean of 24 (B6) and 24 (quorum) samples. TTL 30 s (latency), 10 s (revocation).</w:t>
+      </w:r>
+    </w:p>
+    <w:p>
+      <w:pPr>
+        <w:keepNext/>
+        <w:spacing w:after="60" w:before="0" w:line="228"/>
+        <w:jc w:val="both"/>
+      </w:pPr>
+      <w:r>
+        <w:rPr>
+          <w:rFonts w:ascii="Times New Roman" w:cs="Times New Roman" w:eastAsia="Times New Roman" w:hAnsi="Times New Roman"/>
+          <w:sz w:val="20"/>
+          <w:szCs w:val="20"/>
+        </w:rPr>
+        <w:t xml:space="preserve">Section VI-H stopped Keycloak or OpenLDAP, a service BC-ZTA does not use. The fair test is the loss of each design’s own state source with the same cache policy (TTL 10 s, serve-stale bound 2·TTL = 20 s, 50 devices): the PEP of BC-ZTA is cut off from its ledger node with a firewall rule (</w:t>
+      </w:r>
+      <w:r>
+        <w:rPr>
+          <w:rFonts w:ascii="Times New Roman" w:cs="Times New Roman" w:eastAsia="Times New Roman" w:hAnsi="Times New Roman"/>
+          <w:i/>
+          <w:iCs/>
+          <w:sz w:val="20"/>
+          <w:szCs w:val="20"/>
+        </w:rPr>
+        <w:t xml:space="preserve">iptables</w:t>
+      </w:r>
+      <w:r>
+        <w:rPr>
+          <w:rFonts w:ascii="Times New Roman" w:cs="Times New Roman" w:eastAsia="Times New Roman" w:hAnsi="Times New Roman"/>
+          <w:sz w:val="20"/>
+          <w:szCs w:val="20"/>
+        </w:rPr>
+        <w:t xml:space="preserve"> DROP) for 50 s, and the directory of B6 is stopped for the same time (Table 14, Fig. 9, 3 runs). Both designs behave alike: requests are granted from cache and then from stale state (89% and 100% granted in the first 10 s after the loss), granted fractions fall to 0% and 0% once the last read is older than 20 s, and service resumes 1 s and 1 s after the source returns. The first denials appear 9 s (BC-ZTA) and 12 s (B6) after the loss rather than after 20 s, because the bound of each cache entry runs from its own last successful read, which lies up to one TTL before the loss; the first reads that hit the unreachable ledger also wait for the 2.5 s read timeout, which is why BC-ZTA grants slightly less than B6 in the first window. The ledger therefore gives no extra availability by itself in this test; any cache with a stale bound provides the same short-outage behaviour. What differs is that the BC-ZTA state is replicated on four validators and the PEP could read from another node, which we did not implement as automatic failover in this test, while the directory of B6 is a single service unless it is replicated too.</w:t>
+      </w:r>
+    </w:p>
+    <w:p>
+      <w:pPr>
+        <w:keepNext/>
+        <w:spacing w:after="30" w:before="60"/>
+        <w:jc w:val="center"/>
+      </w:pPr>
+      <w:r>
+        <w:rPr>
+          <w:rFonts w:ascii="Times New Roman" w:cs="Times New Roman" w:eastAsia="Times New Roman" w:hAnsi="Times New Roman"/>
+          <w:sz w:val="16"/>
+          <w:szCs w:val="16"/>
+        </w:rPr>
+        <w:t xml:space="preserve">TABLE 14. LOSS OF THE STATE SOURCE (TTL 10 S, STALE BOUND 20 S, 3 RUNS)</w:t>
+      </w:r>
+    </w:p>
+    <w:tbl>
+      <w:tblPr>
+        <w:tblW w:type="dxa" w:w="4960"/>
+        <w:tblBorders>
+          <w:top w:val="single" w:color="auto" w:sz="4"/>
+          <w:left w:val="single" w:color="auto" w:sz="4"/>
+          <w:bottom w:val="single" w:color="auto" w:sz="4"/>
+          <w:right w:val="single" w:color="auto" w:sz="4"/>
+          <w:insideH w:val="single" w:color="auto" w:sz="4"/>
+          <w:insideV w:val="single" w:color="auto" w:sz="4"/>
+        </w:tblBorders>
+        <w:tblLayout w:type="fixed"/>
+      </w:tblPr>
+      <w:tblGrid>
+        <w:gridCol w:w="1800"/>
+        <w:gridCol w:w="560"/>
+        <w:gridCol w:w="560"/>
+        <w:gridCol w:w="660"/>
+        <w:gridCol w:w="600"/>
+        <w:gridCol w:w="780"/>
+      </w:tblGrid>
+      <w:tr>
+        <w:trPr>
+          <w:cantSplit/>
+          <w:tblHeader/>
+        </w:trPr>
+        <w:tc>
+          <w:tcPr>
+            <w:tcW w:type="dxa" w:w="1800"/>
+            <w:tcBorders>
+              <w:top w:val="single" w:color="000000" w:sz="4"/>
+              <w:left w:val="none" w:color="FFFFFF" w:sz="0"/>
+              <w:bottom w:val="single" w:color="000000" w:sz="4"/>
+              <w:right w:val="none" w:color="FFFFFF" w:sz="0"/>
+            </w:tcBorders>
+            <w:tcMar>
+              <w:top w:type="dxa" w:w="20"/>
+              <w:left w:type="dxa" w:w="40"/>
+              <w:bottom w:type="dxa" w:w="20"/>
+              <w:right w:type="dxa" w:w="40"/>
+            </w:tcMar>
+            <w:vAlign w:val="center"/>
+          </w:tcPr>
+          <w:p>
+            <w:pPr>
+              <w:keepNext/>
+              <w:spacing w:after="0" w:line="200"/>
+              <w:jc w:val="left"/>
+            </w:pPr>
+            <w:r>
+              <w:rPr>
+                <w:rFonts w:ascii="Times New Roman" w:cs="Times New Roman" w:eastAsia="Times New Roman" w:hAnsi="Times New Roman"/>
+                <w:b/>
+                <w:bCs/>
+                <w:sz w:val="15"/>
+                <w:szCs w:val="15"/>
+              </w:rPr>
+              <w:t xml:space="preserve">System (source lost)</w:t>
+            </w:r>
+          </w:p>
+        </w:tc>
+        <w:tc>
+          <w:tcPr>
+            <w:tcW w:type="dxa" w:w="560"/>
+            <w:tcBorders>
+              <w:top w:val="single" w:color="000000" w:sz="4"/>
+              <w:left w:val="none" w:color="FFFFFF" w:sz="0"/>
+              <w:bottom w:val="single" w:color="000000" w:sz="4"/>
+              <w:right w:val="none" w:color="FFFFFF" w:sz="0"/>
+            </w:tcBorders>
+            <w:tcMar>
+              <w:top w:type="dxa" w:w="20"/>
+              <w:left w:type="dxa" w:w="40"/>
+              <w:bottom w:type="dxa" w:w="20"/>
+              <w:right w:type="dxa" w:w="40"/>
+            </w:tcMar>
+            <w:vAlign w:val="center"/>
+          </w:tcPr>
+          <w:p>
+            <w:pPr>
+              <w:keepNext/>
+              <w:spacing w:after="0" w:line="200"/>
+              <w:jc w:val="left"/>
+            </w:pPr>
+            <w:r>
+              <w:rPr>
+                <w:rFonts w:ascii="Times New Roman" w:cs="Times New Roman" w:eastAsia="Times New Roman" w:hAnsi="Times New Roman"/>
+                <w:b/>
+                <w:bCs/>
+                <w:sz w:val="15"/>
+                <w:szCs w:val="15"/>
+              </w:rPr>
+              <w:t xml:space="preserve">Before</w:t>
+            </w:r>
+          </w:p>
+        </w:tc>
+        <w:tc>
+          <w:tcPr>
+            <w:tcW w:type="dxa" w:w="560"/>
+            <w:tcBorders>
+              <w:top w:val="single" w:color="000000" w:sz="4"/>
+              <w:left w:val="none" w:color="FFFFFF" w:sz="0"/>
+              <w:bottom w:val="single" w:color="000000" w:sz="4"/>
+              <w:right w:val="none" w:color="FFFFFF" w:sz="0"/>
+            </w:tcBorders>
+            <w:tcMar>
+              <w:top w:type="dxa" w:w="20"/>
+              <w:left w:type="dxa" w:w="40"/>
+              <w:bottom w:type="dxa" w:w="20"/>
+              <w:right w:type="dxa" w:w="40"/>
+            </w:tcMar>
+            <w:vAlign w:val="center"/>
+          </w:tcPr>
+          <w:p>
+            <w:pPr>
+              <w:keepNext/>
+              <w:spacing w:after="0" w:line="200"/>
+              <w:jc w:val="left"/>
+            </w:pPr>
+            <w:r>
+              <w:rPr>
+                <w:rFonts w:ascii="Times New Roman" w:cs="Times New Roman" w:eastAsia="Times New Roman" w:hAnsi="Times New Roman"/>
+                <w:b/>
+                <w:bCs/>
+                <w:sz w:val="15"/>
+                <w:szCs w:val="15"/>
+              </w:rPr>
+              <w:t xml:space="preserve">≤ TTL</w:t>
+            </w:r>
+          </w:p>
+        </w:tc>
+        <w:tc>
+          <w:tcPr>
+            <w:tcW w:type="dxa" w:w="660"/>
+            <w:tcBorders>
+              <w:top w:val="single" w:color="000000" w:sz="4"/>
+              <w:left w:val="none" w:color="FFFFFF" w:sz="0"/>
+              <w:bottom w:val="single" w:color="000000" w:sz="4"/>
+              <w:right w:val="none" w:color="FFFFFF" w:sz="0"/>
+            </w:tcBorders>
+            <w:tcMar>
+              <w:top w:type="dxa" w:w="20"/>
+              <w:left w:type="dxa" w:w="40"/>
+              <w:bottom w:type="dxa" w:w="20"/>
+              <w:right w:type="dxa" w:w="40"/>
+            </w:tcMar>
+            <w:vAlign w:val="center"/>
+          </w:tcPr>
+          <w:p>
+            <w:pPr>
+              <w:keepNext/>
+              <w:spacing w:after="0" w:line="200"/>
+              <w:jc w:val="left"/>
+            </w:pPr>
+            <w:r>
+              <w:rPr>
+                <w:rFonts w:ascii="Times New Roman" w:cs="Times New Roman" w:eastAsia="Times New Roman" w:hAnsi="Times New Roman"/>
+                <w:b/>
+                <w:bCs/>
+                <w:sz w:val="15"/>
+                <w:szCs w:val="15"/>
+              </w:rPr>
+              <w:t xml:space="preserve">TTL–2TTL</w:t>
+            </w:r>
+          </w:p>
+        </w:tc>
+        <w:tc>
+          <w:tcPr>
+            <w:tcW w:type="dxa" w:w="600"/>
+            <w:tcBorders>
+              <w:top w:val="single" w:color="000000" w:sz="4"/>
+              <w:left w:val="none" w:color="FFFFFF" w:sz="0"/>
+              <w:bottom w:val="single" w:color="000000" w:sz="4"/>
+              <w:right w:val="none" w:color="FFFFFF" w:sz="0"/>
+            </w:tcBorders>
+            <w:tcMar>
+              <w:top w:type="dxa" w:w="20"/>
+              <w:left w:type="dxa" w:w="40"/>
+              <w:bottom w:type="dxa" w:w="20"/>
+              <w:right w:type="dxa" w:w="40"/>
+            </w:tcMar>
+            <w:vAlign w:val="center"/>
+          </w:tcPr>
+          <w:p>
+            <w:pPr>
+              <w:keepNext/>
+              <w:spacing w:after="0" w:line="200"/>
+              <w:jc w:val="left"/>
+            </w:pPr>
+            <w:r>
+              <w:rPr>
+                <w:rFonts w:ascii="Times New Roman" w:cs="Times New Roman" w:eastAsia="Times New Roman" w:hAnsi="Times New Roman"/>
+                <w:b/>
+                <w:bCs/>
+                <w:sz w:val="15"/>
+                <w:szCs w:val="15"/>
+              </w:rPr>
+              <w:t xml:space="preserve">&gt; 2TTL</w:t>
+            </w:r>
+          </w:p>
+        </w:tc>
+        <w:tc>
+          <w:tcPr>
+            <w:tcW w:type="dxa" w:w="780"/>
+            <w:tcBorders>
+              <w:top w:val="single" w:color="000000" w:sz="4"/>
+              <w:left w:val="none" w:color="FFFFFF" w:sz="0"/>
+              <w:bottom w:val="single" w:color="000000" w:sz="4"/>
+              <w:right w:val="none" w:color="FFFFFF" w:sz="0"/>
+            </w:tcBorders>
+            <w:tcMar>
+              <w:top w:type="dxa" w:w="20"/>
+              <w:left w:type="dxa" w:w="40"/>
+              <w:bottom w:type="dxa" w:w="20"/>
+              <w:right w:type="dxa" w:w="40"/>
+            </w:tcMar>
+            <w:vAlign w:val="center"/>
+          </w:tcPr>
+          <w:p>
+            <w:pPr>
+              <w:keepNext/>
+              <w:spacing w:after="0" w:line="200"/>
+              <w:jc w:val="left"/>
+            </w:pPr>
+            <w:r>
+              <w:rPr>
+                <w:rFonts w:ascii="Times New Roman" w:cs="Times New Roman" w:eastAsia="Times New Roman" w:hAnsi="Times New Roman"/>
+                <w:b/>
+                <w:bCs/>
+                <w:sz w:val="15"/>
+                <w:szCs w:val="15"/>
+              </w:rPr>
+              <w:t xml:space="preserve">Restored</w:t>
+            </w:r>
+          </w:p>
+        </w:tc>
+      </w:tr>
+      <w:tr>
+        <w:trPr>
+          <w:cantSplit/>
+        </w:trPr>
+        <w:tc>
+          <w:tcPr>
+            <w:tcW w:type="dxa" w:w="1800"/>
+            <w:tcBorders>
+              <w:top w:val="none" w:color="FFFFFF" w:sz="0"/>
+              <w:left w:val="none" w:color="FFFFFF" w:sz="0"/>
+              <w:bottom w:val="none" w:color="FFFFFF" w:sz="0"/>
+              <w:right w:val="none" w:color="FFFFFF" w:sz="0"/>
+            </w:tcBorders>
+            <w:tcMar>
+              <w:top w:type="dxa" w:w="20"/>
+              <w:left w:type="dxa" w:w="40"/>
+              <w:bottom w:type="dxa" w:w="20"/>
+              <w:right w:type="dxa" w:w="40"/>
+            </w:tcMar>
+            <w:vAlign w:val="center"/>
+          </w:tcPr>
+          <w:p>
+            <w:pPr>
+              <w:keepNext/>
+              <w:spacing w:after="0" w:line="200"/>
+              <w:jc w:val="left"/>
+            </w:pPr>
+            <w:r>
+              <w:rPr>
+                <w:rFonts w:ascii="Times New Roman" w:cs="Times New Roman" w:eastAsia="Times New Roman" w:hAnsi="Times New Roman"/>
+                <w:b w:val="false"/>
+                <w:bCs w:val="false"/>
+                <w:sz w:val="15"/>
+                <w:szCs w:val="15"/>
+              </w:rPr>
+              <w:t xml:space="preserve">BC-ZTA (ledger node)</w:t>
+            </w:r>
+          </w:p>
+        </w:tc>
+        <w:tc>
+          <w:tcPr>
+            <w:tcW w:type="dxa" w:w="560"/>
+            <w:tcBorders>
+              <w:top w:val="none" w:color="FFFFFF" w:sz="0"/>
+              <w:left w:val="none" w:color="FFFFFF" w:sz="0"/>
+              <w:bottom w:val="none" w:color="FFFFFF" w:sz="0"/>
+              <w:right w:val="none" w:color="FFFFFF" w:sz="0"/>
+            </w:tcBorders>
+            <w:tcMar>
+              <w:top w:type="dxa" w:w="20"/>
+              <w:left w:type="dxa" w:w="40"/>
+              <w:bottom w:type="dxa" w:w="20"/>
+              <w:right w:type="dxa" w:w="40"/>
+            </w:tcMar>
+            <w:vAlign w:val="center"/>
+          </w:tcPr>
+          <w:p>
+            <w:pPr>
+              <w:keepNext/>
+              <w:spacing w:after="0" w:line="200"/>
+              <w:jc w:val="left"/>
+            </w:pPr>
+            <w:r>
+              <w:rPr>
+                <w:rFonts w:ascii="Times New Roman" w:cs="Times New Roman" w:eastAsia="Times New Roman" w:hAnsi="Times New Roman"/>
+                <w:b w:val="false"/>
+                <w:bCs w:val="false"/>
+                <w:sz w:val="15"/>
+                <w:szCs w:val="15"/>
+              </w:rPr>
+              <w:t xml:space="preserve">100</w:t>
+            </w:r>
+          </w:p>
+        </w:tc>
+        <w:tc>
+          <w:tcPr>
+            <w:tcW w:type="dxa" w:w="560"/>
+            <w:tcBorders>
+              <w:top w:val="none" w:color="FFFFFF" w:sz="0"/>
+              <w:left w:val="none" w:color="FFFFFF" w:sz="0"/>
+              <w:bottom w:val="none" w:color="FFFFFF" w:sz="0"/>
+              <w:right w:val="none" w:color="FFFFFF" w:sz="0"/>
+            </w:tcBorders>
+            <w:tcMar>
+              <w:top w:type="dxa" w:w="20"/>
+              <w:left w:type="dxa" w:w="40"/>
+              <w:bottom w:type="dxa" w:w="20"/>
+              <w:right w:type="dxa" w:w="40"/>
+            </w:tcMar>
+            <w:vAlign w:val="center"/>
+          </w:tcPr>
+          <w:p>
+            <w:pPr>
+              <w:keepNext/>
+              <w:spacing w:after="0" w:line="200"/>
+              <w:jc w:val="left"/>
+            </w:pPr>
+            <w:r>
+              <w:rPr>
+                <w:rFonts w:ascii="Times New Roman" w:cs="Times New Roman" w:eastAsia="Times New Roman" w:hAnsi="Times New Roman"/>
+                <w:b w:val="false"/>
+                <w:bCs w:val="false"/>
+                <w:sz w:val="15"/>
+                <w:szCs w:val="15"/>
+              </w:rPr>
+              <w:t xml:space="preserve">89</w:t>
+            </w:r>
+          </w:p>
+        </w:tc>
+        <w:tc>
+          <w:tcPr>
+            <w:tcW w:type="dxa" w:w="660"/>
+            <w:tcBorders>
+              <w:top w:val="none" w:color="FFFFFF" w:sz="0"/>
+              <w:left w:val="none" w:color="FFFFFF" w:sz="0"/>
+              <w:bottom w:val="none" w:color="FFFFFF" w:sz="0"/>
+              <w:right w:val="none" w:color="FFFFFF" w:sz="0"/>
+            </w:tcBorders>
+            <w:tcMar>
+              <w:top w:type="dxa" w:w="20"/>
+              <w:left w:type="dxa" w:w="40"/>
+              <w:bottom w:type="dxa" w:w="20"/>
+              <w:right w:type="dxa" w:w="40"/>
+            </w:tcMar>
+            <w:vAlign w:val="center"/>
+          </w:tcPr>
+          <w:p>
+            <w:pPr>
+              <w:keepNext/>
+              <w:spacing w:after="0" w:line="200"/>
+              <w:jc w:val="left"/>
+            </w:pPr>
+            <w:r>
+              <w:rPr>
+                <w:rFonts w:ascii="Times New Roman" w:cs="Times New Roman" w:eastAsia="Times New Roman" w:hAnsi="Times New Roman"/>
+                <w:b w:val="false"/>
+                <w:bCs w:val="false"/>
+                <w:sz w:val="15"/>
+                <w:szCs w:val="15"/>
+              </w:rPr>
+              <w:t xml:space="preserve">15</w:t>
+            </w:r>
+          </w:p>
+        </w:tc>
+        <w:tc>
+          <w:tcPr>
+            <w:tcW w:type="dxa" w:w="600"/>
+            <w:tcBorders>
+              <w:top w:val="none" w:color="FFFFFF" w:sz="0"/>
+              <w:left w:val="none" w:color="FFFFFF" w:sz="0"/>
+              <w:bottom w:val="none" w:color="FFFFFF" w:sz="0"/>
+              <w:right w:val="none" w:color="FFFFFF" w:sz="0"/>
+            </w:tcBorders>
+            <w:tcMar>
+              <w:top w:type="dxa" w:w="20"/>
+              <w:left w:type="dxa" w:w="40"/>
+              <w:bottom w:type="dxa" w:w="20"/>
+              <w:right w:type="dxa" w:w="40"/>
+            </w:tcMar>
+            <w:vAlign w:val="center"/>
+          </w:tcPr>
+          <w:p>
+            <w:pPr>
+              <w:keepNext/>
+              <w:spacing w:after="0" w:line="200"/>
+              <w:jc w:val="left"/>
+            </w:pPr>
+            <w:r>
+              <w:rPr>
+                <w:rFonts w:ascii="Times New Roman" w:cs="Times New Roman" w:eastAsia="Times New Roman" w:hAnsi="Times New Roman"/>
+                <w:b w:val="false"/>
+                <w:bCs w:val="false"/>
+                <w:sz w:val="15"/>
+                <w:szCs w:val="15"/>
+              </w:rPr>
+              <w:t xml:space="preserve">0</w:t>
+            </w:r>
+          </w:p>
+        </w:tc>
+        <w:tc>
+          <w:tcPr>
+            <w:tcW w:type="dxa" w:w="780"/>
+            <w:tcBorders>
+              <w:top w:val="none" w:color="FFFFFF" w:sz="0"/>
+              <w:left w:val="none" w:color="FFFFFF" w:sz="0"/>
+              <w:bottom w:val="none" w:color="FFFFFF" w:sz="0"/>
+              <w:right w:val="none" w:color="FFFFFF" w:sz="0"/>
+            </w:tcBorders>
+            <w:tcMar>
+              <w:top w:type="dxa" w:w="20"/>
+              <w:left w:type="dxa" w:w="40"/>
+              <w:bottom w:type="dxa" w:w="20"/>
+              <w:right w:type="dxa" w:w="40"/>
+            </w:tcMar>
+            <w:vAlign w:val="center"/>
+          </w:tcPr>
+          <w:p>
+            <w:pPr>
+              <w:keepNext/>
+              <w:spacing w:after="0" w:line="200"/>
+              <w:jc w:val="left"/>
+            </w:pPr>
+            <w:r>
+              <w:rPr>
+                <w:rFonts w:ascii="Times New Roman" w:cs="Times New Roman" w:eastAsia="Times New Roman" w:hAnsi="Times New Roman"/>
+                <w:b w:val="false"/>
+                <w:bCs w:val="false"/>
+                <w:sz w:val="15"/>
+                <w:szCs w:val="15"/>
+              </w:rPr>
+              <w:t xml:space="preserve">100</w:t>
+            </w:r>
+          </w:p>
+        </w:tc>
+      </w:tr>
+      <w:tr>
+        <w:trPr>
+          <w:cantSplit/>
+        </w:trPr>
+        <w:tc>
+          <w:tcPr>
+            <w:tcW w:type="dxa" w:w="1800"/>
+            <w:tcBorders>
+              <w:top w:val="none" w:color="FFFFFF" w:sz="0"/>
+              <w:left w:val="none" w:color="FFFFFF" w:sz="0"/>
+              <w:bottom w:val="single" w:color="000000" w:sz="4"/>
+              <w:right w:val="none" w:color="FFFFFF" w:sz="0"/>
+            </w:tcBorders>
+            <w:tcMar>
+              <w:top w:type="dxa" w:w="20"/>
+              <w:left w:type="dxa" w:w="40"/>
+              <w:bottom w:type="dxa" w:w="20"/>
+              <w:right w:type="dxa" w:w="40"/>
+            </w:tcMar>
+            <w:vAlign w:val="center"/>
+          </w:tcPr>
+          <w:p>
+            <w:pPr>
+              <w:keepNext/>
+              <w:spacing w:after="0" w:line="200"/>
+              <w:jc w:val="left"/>
+            </w:pPr>
+            <w:r>
+              <w:rPr>
+                <w:rFonts w:ascii="Times New Roman" w:cs="Times New Roman" w:eastAsia="Times New Roman" w:hAnsi="Times New Roman"/>
+                <w:b w:val="false"/>
+                <w:bCs w:val="false"/>
+                <w:sz w:val="15"/>
+                <w:szCs w:val="15"/>
+              </w:rPr>
+              <w:t xml:space="preserve">B6 (directory)</w:t>
+            </w:r>
+          </w:p>
+        </w:tc>
+        <w:tc>
+          <w:tcPr>
+            <w:tcW w:type="dxa" w:w="560"/>
+            <w:tcBorders>
+              <w:top w:val="none" w:color="FFFFFF" w:sz="0"/>
+              <w:left w:val="none" w:color="FFFFFF" w:sz="0"/>
+              <w:bottom w:val="single" w:color="000000" w:sz="4"/>
+              <w:right w:val="none" w:color="FFFFFF" w:sz="0"/>
+            </w:tcBorders>
+            <w:tcMar>
+              <w:top w:type="dxa" w:w="20"/>
+              <w:left w:type="dxa" w:w="40"/>
+              <w:bottom w:type="dxa" w:w="20"/>
+              <w:right w:type="dxa" w:w="40"/>
+            </w:tcMar>
+            <w:vAlign w:val="center"/>
+          </w:tcPr>
+          <w:p>
+            <w:pPr>
+              <w:keepNext/>
+              <w:spacing w:after="0" w:line="200"/>
+              <w:jc w:val="left"/>
+            </w:pPr>
+            <w:r>
+              <w:rPr>
+                <w:rFonts w:ascii="Times New Roman" w:cs="Times New Roman" w:eastAsia="Times New Roman" w:hAnsi="Times New Roman"/>
+                <w:b w:val="false"/>
+                <w:bCs w:val="false"/>
+                <w:sz w:val="15"/>
+                <w:szCs w:val="15"/>
+              </w:rPr>
+              <w:t xml:space="preserve">100</w:t>
+            </w:r>
+          </w:p>
+        </w:tc>
+        <w:tc>
+          <w:tcPr>
+            <w:tcW w:type="dxa" w:w="560"/>
+            <w:tcBorders>
+              <w:top w:val="none" w:color="FFFFFF" w:sz="0"/>
+              <w:left w:val="none" w:color="FFFFFF" w:sz="0"/>
+              <w:bottom w:val="single" w:color="000000" w:sz="4"/>
+              <w:right w:val="none" w:color="FFFFFF" w:sz="0"/>
+            </w:tcBorders>
+            <w:tcMar>
+              <w:top w:type="dxa" w:w="20"/>
+              <w:left w:type="dxa" w:w="40"/>
+              <w:bottom w:type="dxa" w:w="20"/>
+              <w:right w:type="dxa" w:w="40"/>
+            </w:tcMar>
+            <w:vAlign w:val="center"/>
+          </w:tcPr>
+          <w:p>
+            <w:pPr>
+              <w:keepNext/>
+              <w:spacing w:after="0" w:line="200"/>
+              <w:jc w:val="left"/>
+            </w:pPr>
+            <w:r>
+              <w:rPr>
+                <w:rFonts w:ascii="Times New Roman" w:cs="Times New Roman" w:eastAsia="Times New Roman" w:hAnsi="Times New Roman"/>
+                <w:b w:val="false"/>
+                <w:bCs w:val="false"/>
+                <w:sz w:val="15"/>
+                <w:szCs w:val="15"/>
+              </w:rPr>
+              <w:t xml:space="preserve">100</w:t>
+            </w:r>
+          </w:p>
+        </w:tc>
+        <w:tc>
+          <w:tcPr>
+            <w:tcW w:type="dxa" w:w="660"/>
+            <w:tcBorders>
+              <w:top w:val="none" w:color="FFFFFF" w:sz="0"/>
+              <w:left w:val="none" w:color="FFFFFF" w:sz="0"/>
+              <w:bottom w:val="single" w:color="000000" w:sz="4"/>
+              <w:right w:val="none" w:color="FFFFFF" w:sz="0"/>
+            </w:tcBorders>
+            <w:tcMar>
+              <w:top w:type="dxa" w:w="20"/>
+              <w:left w:type="dxa" w:w="40"/>
+              <w:bottom w:type="dxa" w:w="20"/>
+              <w:right w:type="dxa" w:w="40"/>
+            </w:tcMar>
+            <w:vAlign w:val="center"/>
+          </w:tcPr>
+          <w:p>
+            <w:pPr>
+              <w:keepNext/>
+              <w:spacing w:after="0" w:line="200"/>
+              <w:jc w:val="left"/>
+            </w:pPr>
+            <w:r>
+              <w:rPr>
+                <w:rFonts w:ascii="Times New Roman" w:cs="Times New Roman" w:eastAsia="Times New Roman" w:hAnsi="Times New Roman"/>
+                <w:b w:val="false"/>
+                <w:bCs w:val="false"/>
+                <w:sz w:val="15"/>
+                <w:szCs w:val="15"/>
+              </w:rPr>
+              <w:t xml:space="preserve">20</w:t>
+            </w:r>
+          </w:p>
+        </w:tc>
+        <w:tc>
+          <w:tcPr>
+            <w:tcW w:type="dxa" w:w="600"/>
+            <w:tcBorders>
+              <w:top w:val="none" w:color="FFFFFF" w:sz="0"/>
+              <w:left w:val="none" w:color="FFFFFF" w:sz="0"/>
+              <w:bottom w:val="single" w:color="000000" w:sz="4"/>
+              <w:right w:val="none" w:color="FFFFFF" w:sz="0"/>
+            </w:tcBorders>
+            <w:tcMar>
+              <w:top w:type="dxa" w:w="20"/>
+              <w:left w:type="dxa" w:w="40"/>
+              <w:bottom w:type="dxa" w:w="20"/>
+              <w:right w:type="dxa" w:w="40"/>
+            </w:tcMar>
+            <w:vAlign w:val="center"/>
+          </w:tcPr>
+          <w:p>
+            <w:pPr>
+              <w:keepNext/>
+              <w:spacing w:after="0" w:line="200"/>
+              <w:jc w:val="left"/>
+            </w:pPr>
+            <w:r>
+              <w:rPr>
+                <w:rFonts w:ascii="Times New Roman" w:cs="Times New Roman" w:eastAsia="Times New Roman" w:hAnsi="Times New Roman"/>
+                <w:b w:val="false"/>
+                <w:bCs w:val="false"/>
+                <w:sz w:val="15"/>
+                <w:szCs w:val="15"/>
+              </w:rPr>
+              <w:t xml:space="preserve">0</w:t>
+            </w:r>
+          </w:p>
+        </w:tc>
+        <w:tc>
+          <w:tcPr>
+            <w:tcW w:type="dxa" w:w="780"/>
+            <w:tcBorders>
+              <w:top w:val="none" w:color="FFFFFF" w:sz="0"/>
+              <w:left w:val="none" w:color="FFFFFF" w:sz="0"/>
+              <w:bottom w:val="single" w:color="000000" w:sz="4"/>
+              <w:right w:val="none" w:color="FFFFFF" w:sz="0"/>
+            </w:tcBorders>
+            <w:tcMar>
+              <w:top w:type="dxa" w:w="20"/>
+              <w:left w:type="dxa" w:w="40"/>
+              <w:bottom w:type="dxa" w:w="20"/>
+              <w:right w:type="dxa" w:w="40"/>
+            </w:tcMar>
+            <w:vAlign w:val="center"/>
+          </w:tcPr>
+          <w:p>
+            <w:pPr>
+              <w:keepNext/>
+              <w:spacing w:after="0" w:line="200"/>
+              <w:jc w:val="left"/>
+            </w:pPr>
+            <w:r>
+              <w:rPr>
+                <w:rFonts w:ascii="Times New Roman" w:cs="Times New Roman" w:eastAsia="Times New Roman" w:hAnsi="Times New Roman"/>
+                <w:b w:val="false"/>
+                <w:bCs w:val="false"/>
+                <w:sz w:val="15"/>
+                <w:szCs w:val="15"/>
+              </w:rPr>
+              <w:t xml:space="preserve">100</w:t>
+            </w:r>
+          </w:p>
+        </w:tc>
+      </w:tr>
+    </w:tbl>
+    <w:p>
+      <w:pPr>
+        <w:spacing w:after="80" w:before="20"/>
+        <w:jc w:val="both"/>
+      </w:pPr>
+      <w:r>
+        <w:rPr>
+          <w:rFonts w:ascii="Times New Roman" w:cs="Times New Roman" w:eastAsia="Times New Roman" w:hAnsi="Times New Roman"/>
+          <w:sz w:val="14"/>
+          <w:szCs w:val="14"/>
+        </w:rPr>
+        <w:t xml:space="preserve">Requests granted (%) in the windows after the loss of the state source; windows are relative to the time of the loss.</w:t>
+      </w:r>
+    </w:p>
+    <w:p>
+      <w:pPr>
+        <w:keepNext/>
+        <w:spacing w:after="20" w:before="40"/>
+        <w:jc w:val="center"/>
+      </w:pPr>
+      <w:r>
+        <w:drawing>
+          <wp:inline distT="0" distB="0" distL="0" distR="0">
+            <wp:extent cx="3067050" cy="2276475"/>
+            <wp:effectExtent t="0" r="0" b="0" l="0"/>
+            <wp:docPr id="1" name="fig9_failclosed.png" descr="Fig. 9. Requests granted while the state source is lost (shaded); dotted lines: TTL and 2·TTL after the loss." title="Fig. 9. Requests granted while the state source is lost (shaded); dotted lines: TTL and 2·TTL after the loss."/>
+            <wp:cNvGraphicFramePr>
+              <a:graphicFrameLocks xmlns:a="http://schemas.openxmlformats.org/drawingml/2006/main" noChangeAspect="1"/>
+            </wp:cNvGraphicFramePr>
+            <a:graphic xmlns:a="http://schemas.openxmlformats.org/drawingml/2006/main">
+              <a:graphicData uri="http://schemas.openxmlformats.org/drawingml/2006/picture">
+                <pic:pic xmlns:pic="http://schemas.openxmlformats.org/drawingml/2006/picture">
+                  <pic:nvPicPr>
+                    <pic:cNvPr id="0" name="" descr=""/>
+                    <pic:cNvPicPr>
+                      <a:picLocks noChangeAspect="1" noChangeArrowheads="1"/>
+                    </pic:cNvPicPr>
+                  </pic:nvPicPr>
+                  <pic:blipFill>
+                    <a:blip r:embed="rId17" cstate="none"/>
+                    <a:srcRect/>
+                    <a:stretch>
+                      <a:fillRect/>
+                    </a:stretch>
+                  </pic:blipFill>
+                  <pic:spPr bwMode="auto">
+                    <a:xfrm>
+                      <a:off x="0" y="0"/>
+                      <a:ext cx="3067050" cy="2276475"/>
+                    </a:xfrm>
+                    <a:prstGeom prst="rect">
+                      <a:avLst/>
+                    </a:prstGeom>
+                  </pic:spPr>
+                </pic:pic>
+              </a:graphicData>
+            </a:graphic>
+          </wp:inline>
+        </w:drawing>
+      </w:r>
+    </w:p>
+    <w:p>
+      <w:pPr>
+        <w:spacing w:after="80"/>
+        <w:jc w:val="center"/>
+      </w:pPr>
+      <w:r>
+        <w:rPr>
+          <w:rFonts w:ascii="Times New Roman" w:cs="Times New Roman" w:eastAsia="Times New Roman" w:hAnsi="Times New Roman"/>
+          <w:sz w:val="16"/>
+          <w:szCs w:val="16"/>
+        </w:rPr>
+        <w:t xml:space="preserve">Fig. 9. Requests granted while the state source is lost (shaded); dotted lines: TTL and 2·TTL after the loss.</w:t>
+      </w:r>
+    </w:p>
+    <w:p>
+      <w:pPr>
+        <w:spacing w:after="60" w:before="0" w:line="228"/>
+        <w:jc w:val="both"/>
+      </w:pPr>
+      <w:r>
+        <w:rPr>
+          <w:rFonts w:ascii="Times New Roman" w:cs="Times New Roman" w:eastAsia="Times New Roman" w:hAnsi="Times New Roman"/>
+          <w:sz w:val="20"/>
+          <w:szCs w:val="20"/>
+        </w:rPr>
+        <w:t xml:space="preserve">To test the consensus assumption we stopped two of the four validators for 40 s (IBFT 2.0 needs three, so block production halts) while 50 devices were served and a device was revoked 5 s after the stop. The PEP kept answering: 100% of the requests were granted during the halt, as the cache and the still-reachable node serve the last committed state. The revoked device, however, stayed accepted until consensus resumed and the transaction was mined: enforcement came 126.2 s after the validators were restarted and 161.1 s after submission (3 runs). The staleness bound of BC-ZTA therefore runs from finalisation of the revocation, not from its submission, and a consensus halt is a window in which revocations cannot take effect; a central directory is not affected by this particular failure. The delay is much longer than the halt itself (40 s): block production stayed frozen for 126 s after the validators were restarted. This is consistent with the round-change rule of IBFT 2.0, in which the timeout of a round doubles after each failed round (base 4 s in our configuration), so the surviving and the restarted validators needed one long round to agree again; shorter base timeouts or supervised automatic restarts of validators would reduce it, and an operator that needs bounded revocation latency during a halt must additionally enforce revocations at the PEP by a short-lived local deny list.</w:t>
+      </w:r>
+    </w:p>
+    <w:p>
+      <w:pPr>
+        <w:keepNext/>
+        <w:spacing w:after="60" w:before="0" w:line="228"/>
+        <w:jc w:val="both"/>
+      </w:pPr>
+      <w:r>
+        <w:rPr>
+          <w:rFonts w:ascii="Times New Roman" w:cs="Times New Roman" w:eastAsia="Times New Roman" w:hAnsi="Times New Roman"/>
+          <w:sz w:val="20"/>
+          <w:szCs w:val="20"/>
+        </w:rPr>
+        <w:t xml:space="preserve">Finally, per-PEP capacity is not a limit of the architecture if gateways are replicated. We ran k = 1, 2, 4 PEP processes on one 4-vCPU VM, with devices sharded across them, and raised the offered rate (Fig. 10, Table 15). The highest offered rate served without any failed request and with a P95 below 50 ms was 200 req/s for k = 1, 400 req/s for k = 2, 400 req/s for k = 4. At 800 req/s offered, k = 1 is overloaded (goodput 457 req/s, P95 8.5 s) and k = 2 is overloaded (goodput 706 req/s, P95 7.2 s), whereas k = 4 delivers 770 req/s (96% of the offered rate) at a P95 of 436 ms while using 2.4 cores of the 4-vCPU VM. Beyond that the goodput of every configuration falls as the offered rate rises (overload collapse: requests queue behind signature verification and time out), so a deployment must keep the rate per gateway below its knee, which an admission limit or load balancer would enforce. Scale-out was measured on one host; across hosts the shared state is the ledger, which is read once per device per TTL.</w:t>
+      </w:r>
+    </w:p>
+    <w:p>
+      <w:pPr>
+        <w:keepNext/>
+        <w:spacing w:after="30" w:before="60"/>
+        <w:jc w:val="center"/>
+      </w:pPr>
+      <w:r>
+        <w:rPr>
+          <w:rFonts w:ascii="Times New Roman" w:cs="Times New Roman" w:eastAsia="Times New Roman" w:hAnsi="Times New Roman"/>
+          <w:sz w:val="16"/>
+          <w:szCs w:val="16"/>
+        </w:rPr>
+        <w:t xml:space="preserve">TABLE 15. PEP SCALE-OUT (BC-ZTA, 3 RUNS)</w:t>
+      </w:r>
+    </w:p>
+    <w:tbl>
+      <w:tblPr>
+        <w:tblW w:type="dxa" w:w="6000"/>
+        <w:tblBorders>
+          <w:top w:val="single" w:color="auto" w:sz="4"/>
+          <w:left w:val="single" w:color="auto" w:sz="4"/>
+          <w:bottom w:val="single" w:color="auto" w:sz="4"/>
+          <w:right w:val="single" w:color="auto" w:sz="4"/>
+          <w:insideH w:val="single" w:color="auto" w:sz="4"/>
+          <w:insideV w:val="single" w:color="auto" w:sz="4"/>
+        </w:tblBorders>
+        <w:tblLayout w:type="fixed"/>
+      </w:tblPr>
+      <w:tblGrid>
+        <w:gridCol w:w="1100"/>
+        <w:gridCol w:w="1500"/>
+        <w:gridCol w:w="1200"/>
+        <w:gridCol w:w="1200"/>
+        <w:gridCol w:w="1000"/>
+      </w:tblGrid>
+      <w:tr>
+        <w:trPr>
+          <w:cantSplit/>
+          <w:tblHeader/>
+        </w:trPr>
+        <w:tc>
+          <w:tcPr>
+            <w:tcW w:type="dxa" w:w="1100"/>
+            <w:tcBorders>
+              <w:top w:val="single" w:color="000000" w:sz="4"/>
+              <w:left w:val="none" w:color="FFFFFF" w:sz="0"/>
+              <w:bottom w:val="single" w:color="000000" w:sz="4"/>
+              <w:right w:val="none" w:color="FFFFFF" w:sz="0"/>
+            </w:tcBorders>
+            <w:tcMar>
+              <w:top w:type="dxa" w:w="20"/>
+              <w:left w:type="dxa" w:w="40"/>
+              <w:bottom w:type="dxa" w:w="20"/>
+              <w:right w:type="dxa" w:w="40"/>
+            </w:tcMar>
+            <w:vAlign w:val="center"/>
+          </w:tcPr>
+          <w:p>
+            <w:pPr>
+              <w:keepNext/>
+              <w:spacing w:after="0" w:line="200"/>
+              <w:jc w:val="left"/>
+            </w:pPr>
+            <w:r>
+              <w:rPr>
+                <w:rFonts w:ascii="Times New Roman" w:cs="Times New Roman" w:eastAsia="Times New Roman" w:hAnsi="Times New Roman"/>
+                <w:b/>
+                <w:bCs/>
+                <w:sz w:val="15"/>
+                <w:szCs w:val="15"/>
+              </w:rPr>
+              <w:t xml:space="preserve">PEPs</w:t>
+            </w:r>
+          </w:p>
+        </w:tc>
+        <w:tc>
+          <w:tcPr>
+            <w:tcW w:type="dxa" w:w="1500"/>
+            <w:tcBorders>
+              <w:top w:val="single" w:color="000000" w:sz="4"/>
+              <w:left w:val="none" w:color="FFFFFF" w:sz="0"/>
+              <w:bottom w:val="single" w:color="000000" w:sz="4"/>
+              <w:right w:val="none" w:color="FFFFFF" w:sz="0"/>
+            </w:tcBorders>
+            <w:tcMar>
+              <w:top w:type="dxa" w:w="20"/>
+              <w:left w:type="dxa" w:w="40"/>
+              <w:bottom w:type="dxa" w:w="20"/>
+              <w:right w:type="dxa" w:w="40"/>
+            </w:tcMar>
+            <w:vAlign w:val="center"/>
+          </w:tcPr>
+          <w:p>
+            <w:pPr>
+              <w:keepNext/>
+              <w:spacing w:after="0" w:line="200"/>
+              <w:jc w:val="left"/>
+            </w:pPr>
+            <w:r>
+              <w:rPr>
+                <w:rFonts w:ascii="Times New Roman" w:cs="Times New Roman" w:eastAsia="Times New Roman" w:hAnsi="Times New Roman"/>
+                <w:b/>
+                <w:bCs/>
+                <w:sz w:val="15"/>
+                <w:szCs w:val="15"/>
+              </w:rPr>
+              <w:t xml:space="preserve">Clean rate (req/s)</w:t>
+            </w:r>
+          </w:p>
+        </w:tc>
+        <w:tc>
+          <w:tcPr>
+            <w:tcW w:type="dxa" w:w="1200"/>
+            <w:tcBorders>
+              <w:top w:val="single" w:color="000000" w:sz="4"/>
+              <w:left w:val="none" w:color="FFFFFF" w:sz="0"/>
+              <w:bottom w:val="single" w:color="000000" w:sz="4"/>
+              <w:right w:val="none" w:color="FFFFFF" w:sz="0"/>
+            </w:tcBorders>
+            <w:tcMar>
+              <w:top w:type="dxa" w:w="20"/>
+              <w:left w:type="dxa" w:w="40"/>
+              <w:bottom w:type="dxa" w:w="20"/>
+              <w:right w:type="dxa" w:w="40"/>
+            </w:tcMar>
+            <w:vAlign w:val="center"/>
+          </w:tcPr>
+          <w:p>
+            <w:pPr>
+              <w:keepNext/>
+              <w:spacing w:after="0" w:line="200"/>
+              <w:jc w:val="left"/>
+            </w:pPr>
+            <w:r>
+              <w:rPr>
+                <w:rFonts w:ascii="Times New Roman" w:cs="Times New Roman" w:eastAsia="Times New Roman" w:hAnsi="Times New Roman"/>
+                <w:b/>
+                <w:bCs/>
+                <w:sz w:val="15"/>
+                <w:szCs w:val="15"/>
+              </w:rPr>
+              <w:t xml:space="preserve">Goodput at 800 (req/s)</w:t>
+            </w:r>
+          </w:p>
+        </w:tc>
+        <w:tc>
+          <w:tcPr>
+            <w:tcW w:type="dxa" w:w="1200"/>
+            <w:tcBorders>
+              <w:top w:val="single" w:color="000000" w:sz="4"/>
+              <w:left w:val="none" w:color="FFFFFF" w:sz="0"/>
+              <w:bottom w:val="single" w:color="000000" w:sz="4"/>
+              <w:right w:val="none" w:color="FFFFFF" w:sz="0"/>
+            </w:tcBorders>
+            <w:tcMar>
+              <w:top w:type="dxa" w:w="20"/>
+              <w:left w:type="dxa" w:w="40"/>
+              <w:bottom w:type="dxa" w:w="20"/>
+              <w:right w:type="dxa" w:w="40"/>
+            </w:tcMar>
+            <w:vAlign w:val="center"/>
+          </w:tcPr>
+          <w:p>
+            <w:pPr>
+              <w:keepNext/>
+              <w:spacing w:after="0" w:line="200"/>
+              <w:jc w:val="left"/>
+            </w:pPr>
+            <w:r>
+              <w:rPr>
+                <w:rFonts w:ascii="Times New Roman" w:cs="Times New Roman" w:eastAsia="Times New Roman" w:hAnsi="Times New Roman"/>
+                <w:b/>
+                <w:bCs/>
+                <w:sz w:val="15"/>
+                <w:szCs w:val="15"/>
+              </w:rPr>
+              <w:t xml:space="preserve">P95 at 800 (ms)</w:t>
+            </w:r>
+          </w:p>
+        </w:tc>
+        <w:tc>
+          <w:tcPr>
+            <w:tcW w:type="dxa" w:w="1000"/>
+            <w:tcBorders>
+              <w:top w:val="single" w:color="000000" w:sz="4"/>
+              <w:left w:val="none" w:color="FFFFFF" w:sz="0"/>
+              <w:bottom w:val="single" w:color="000000" w:sz="4"/>
+              <w:right w:val="none" w:color="FFFFFF" w:sz="0"/>
+            </w:tcBorders>
+            <w:tcMar>
+              <w:top w:type="dxa" w:w="20"/>
+              <w:left w:type="dxa" w:w="40"/>
+              <w:bottom w:type="dxa" w:w="20"/>
+              <w:right w:type="dxa" w:w="40"/>
+            </w:tcMar>
+            <w:vAlign w:val="center"/>
+          </w:tcPr>
+          <w:p>
+            <w:pPr>
+              <w:keepNext/>
+              <w:spacing w:after="0" w:line="200"/>
+              <w:jc w:val="left"/>
+            </w:pPr>
+            <w:r>
+              <w:rPr>
+                <w:rFonts w:ascii="Times New Roman" w:cs="Times New Roman" w:eastAsia="Times New Roman" w:hAnsi="Times New Roman"/>
+                <w:b/>
+                <w:bCs/>
+                <w:sz w:val="15"/>
+                <w:szCs w:val="15"/>
+              </w:rPr>
+              <w:t xml:space="preserve">CPU cores at 800</w:t>
+            </w:r>
+          </w:p>
+        </w:tc>
+      </w:tr>
+      <w:tr>
+        <w:trPr>
+          <w:cantSplit/>
+        </w:trPr>
+        <w:tc>
+          <w:tcPr>
+            <w:tcW w:type="dxa" w:w="1100"/>
+            <w:tcBorders>
+              <w:top w:val="none" w:color="FFFFFF" w:sz="0"/>
+              <w:left w:val="none" w:color="FFFFFF" w:sz="0"/>
+              <w:bottom w:val="none" w:color="FFFFFF" w:sz="0"/>
+              <w:right w:val="none" w:color="FFFFFF" w:sz="0"/>
+            </w:tcBorders>
+            <w:tcMar>
+              <w:top w:type="dxa" w:w="20"/>
+              <w:left w:type="dxa" w:w="40"/>
+              <w:bottom w:type="dxa" w:w="20"/>
+              <w:right w:type="dxa" w:w="40"/>
+            </w:tcMar>
+            <w:vAlign w:val="center"/>
+          </w:tcPr>
+          <w:p>
+            <w:pPr>
+              <w:keepNext/>
+              <w:spacing w:after="0" w:line="200"/>
+              <w:jc w:val="left"/>
+            </w:pPr>
+            <w:r>
+              <w:rPr>
+                <w:rFonts w:ascii="Times New Roman" w:cs="Times New Roman" w:eastAsia="Times New Roman" w:hAnsi="Times New Roman"/>
+                <w:b w:val="false"/>
+                <w:bCs w:val="false"/>
+                <w:sz w:val="15"/>
+                <w:szCs w:val="15"/>
+              </w:rPr>
+              <w:t xml:space="preserve">1</w:t>
+            </w:r>
+          </w:p>
+        </w:tc>
+        <w:tc>
+          <w:tcPr>
+            <w:tcW w:type="dxa" w:w="1500"/>
+            <w:tcBorders>
+              <w:top w:val="none" w:color="FFFFFF" w:sz="0"/>
+              <w:left w:val="none" w:color="FFFFFF" w:sz="0"/>
+              <w:bottom w:val="none" w:color="FFFFFF" w:sz="0"/>
+              <w:right w:val="none" w:color="FFFFFF" w:sz="0"/>
+            </w:tcBorders>
+            <w:tcMar>
+              <w:top w:type="dxa" w:w="20"/>
+              <w:left w:type="dxa" w:w="40"/>
+              <w:bottom w:type="dxa" w:w="20"/>
+              <w:right w:type="dxa" w:w="40"/>
+            </w:tcMar>
+            <w:vAlign w:val="center"/>
+          </w:tcPr>
+          <w:p>
+            <w:pPr>
+              <w:keepNext/>
+              <w:spacing w:after="0" w:line="200"/>
+              <w:jc w:val="left"/>
+            </w:pPr>
+            <w:r>
+              <w:rPr>
+                <w:rFonts w:ascii="Times New Roman" w:cs="Times New Roman" w:eastAsia="Times New Roman" w:hAnsi="Times New Roman"/>
+                <w:b w:val="false"/>
+                <w:bCs w:val="false"/>
+                <w:sz w:val="15"/>
+                <w:szCs w:val="15"/>
+              </w:rPr>
+              <w:t xml:space="preserve">200</w:t>
+            </w:r>
+          </w:p>
+        </w:tc>
+        <w:tc>
+          <w:tcPr>
+            <w:tcW w:type="dxa" w:w="1200"/>
+            <w:tcBorders>
+              <w:top w:val="none" w:color="FFFFFF" w:sz="0"/>
+              <w:left w:val="none" w:color="FFFFFF" w:sz="0"/>
+              <w:bottom w:val="none" w:color="FFFFFF" w:sz="0"/>
+              <w:right w:val="none" w:color="FFFFFF" w:sz="0"/>
+            </w:tcBorders>
+            <w:tcMar>
+              <w:top w:type="dxa" w:w="20"/>
+              <w:left w:type="dxa" w:w="40"/>
+              <w:bottom w:type="dxa" w:w="20"/>
+              <w:right w:type="dxa" w:w="40"/>
+            </w:tcMar>
+            <w:vAlign w:val="center"/>
+          </w:tcPr>
+          <w:p>
+            <w:pPr>
+              <w:keepNext/>
+              <w:spacing w:after="0" w:line="200"/>
+              <w:jc w:val="left"/>
+            </w:pPr>
+            <w:r>
+              <w:rPr>
+                <w:rFonts w:ascii="Times New Roman" w:cs="Times New Roman" w:eastAsia="Times New Roman" w:hAnsi="Times New Roman"/>
+                <w:b w:val="false"/>
+                <w:bCs w:val="false"/>
+                <w:sz w:val="15"/>
+                <w:szCs w:val="15"/>
+              </w:rPr>
+              <w:t xml:space="preserve">457</w:t>
+            </w:r>
+          </w:p>
+        </w:tc>
+        <w:tc>
+          <w:tcPr>
+            <w:tcW w:type="dxa" w:w="1200"/>
+            <w:tcBorders>
+              <w:top w:val="none" w:color="FFFFFF" w:sz="0"/>
+              <w:left w:val="none" w:color="FFFFFF" w:sz="0"/>
+              <w:bottom w:val="none" w:color="FFFFFF" w:sz="0"/>
+              <w:right w:val="none" w:color="FFFFFF" w:sz="0"/>
+            </w:tcBorders>
+            <w:tcMar>
+              <w:top w:type="dxa" w:w="20"/>
+              <w:left w:type="dxa" w:w="40"/>
+              <w:bottom w:type="dxa" w:w="20"/>
+              <w:right w:type="dxa" w:w="40"/>
+            </w:tcMar>
+            <w:vAlign w:val="center"/>
+          </w:tcPr>
+          <w:p>
+            <w:pPr>
+              <w:keepNext/>
+              <w:spacing w:after="0" w:line="200"/>
+              <w:jc w:val="left"/>
+            </w:pPr>
+            <w:r>
+              <w:rPr>
+                <w:rFonts w:ascii="Times New Roman" w:cs="Times New Roman" w:eastAsia="Times New Roman" w:hAnsi="Times New Roman"/>
+                <w:b w:val="false"/>
+                <w:bCs w:val="false"/>
+                <w:sz w:val="15"/>
+                <w:szCs w:val="15"/>
+              </w:rPr>
+              <w:t xml:space="preserve">8464</w:t>
+            </w:r>
+          </w:p>
+        </w:tc>
+        <w:tc>
+          <w:tcPr>
+            <w:tcW w:type="dxa" w:w="1000"/>
+            <w:tcBorders>
+              <w:top w:val="none" w:color="FFFFFF" w:sz="0"/>
+              <w:left w:val="none" w:color="FFFFFF" w:sz="0"/>
+              <w:bottom w:val="none" w:color="FFFFFF" w:sz="0"/>
+              <w:right w:val="none" w:color="FFFFFF" w:sz="0"/>
+            </w:tcBorders>
+            <w:tcMar>
+              <w:top w:type="dxa" w:w="20"/>
+              <w:left w:type="dxa" w:w="40"/>
+              <w:bottom w:type="dxa" w:w="20"/>
+              <w:right w:type="dxa" w:w="40"/>
+            </w:tcMar>
+            <w:vAlign w:val="center"/>
+          </w:tcPr>
+          <w:p>
+            <w:pPr>
+              <w:keepNext/>
+              <w:spacing w:after="0" w:line="200"/>
+              <w:jc w:val="left"/>
+            </w:pPr>
+            <w:r>
+              <w:rPr>
+                <w:rFonts w:ascii="Times New Roman" w:cs="Times New Roman" w:eastAsia="Times New Roman" w:hAnsi="Times New Roman"/>
+                <w:b w:val="false"/>
+                <w:bCs w:val="false"/>
+                <w:sz w:val="15"/>
+                <w:szCs w:val="15"/>
+              </w:rPr>
+              <w:t xml:space="preserve">0.7</w:t>
+            </w:r>
+          </w:p>
+        </w:tc>
+      </w:tr>
+      <w:tr>
+        <w:trPr>
+          <w:cantSplit/>
+        </w:trPr>
+        <w:tc>
+          <w:tcPr>
+            <w:tcW w:type="dxa" w:w="1100"/>
+            <w:tcBorders>
+              <w:top w:val="none" w:color="FFFFFF" w:sz="0"/>
+              <w:left w:val="none" w:color="FFFFFF" w:sz="0"/>
+              <w:bottom w:val="none" w:color="FFFFFF" w:sz="0"/>
+              <w:right w:val="none" w:color="FFFFFF" w:sz="0"/>
+            </w:tcBorders>
+            <w:tcMar>
+              <w:top w:type="dxa" w:w="20"/>
+              <w:left w:type="dxa" w:w="40"/>
+              <w:bottom w:type="dxa" w:w="20"/>
+              <w:right w:type="dxa" w:w="40"/>
+            </w:tcMar>
+            <w:vAlign w:val="center"/>
+          </w:tcPr>
+          <w:p>
+            <w:pPr>
+              <w:keepNext/>
+              <w:spacing w:after="0" w:line="200"/>
+              <w:jc w:val="left"/>
+            </w:pPr>
+            <w:r>
+              <w:rPr>
+                <w:rFonts w:ascii="Times New Roman" w:cs="Times New Roman" w:eastAsia="Times New Roman" w:hAnsi="Times New Roman"/>
+                <w:b w:val="false"/>
+                <w:bCs w:val="false"/>
+                <w:sz w:val="15"/>
+                <w:szCs w:val="15"/>
+              </w:rPr>
+              <w:t xml:space="preserve">2</w:t>
+            </w:r>
+          </w:p>
+        </w:tc>
+        <w:tc>
+          <w:tcPr>
+            <w:tcW w:type="dxa" w:w="1500"/>
+            <w:tcBorders>
+              <w:top w:val="none" w:color="FFFFFF" w:sz="0"/>
+              <w:left w:val="none" w:color="FFFFFF" w:sz="0"/>
+              <w:bottom w:val="none" w:color="FFFFFF" w:sz="0"/>
+              <w:right w:val="none" w:color="FFFFFF" w:sz="0"/>
+            </w:tcBorders>
+            <w:tcMar>
+              <w:top w:type="dxa" w:w="20"/>
+              <w:left w:type="dxa" w:w="40"/>
+              <w:bottom w:type="dxa" w:w="20"/>
+              <w:right w:type="dxa" w:w="40"/>
+            </w:tcMar>
+            <w:vAlign w:val="center"/>
+          </w:tcPr>
+          <w:p>
+            <w:pPr>
+              <w:keepNext/>
+              <w:spacing w:after="0" w:line="200"/>
+              <w:jc w:val="left"/>
+            </w:pPr>
+            <w:r>
+              <w:rPr>
+                <w:rFonts w:ascii="Times New Roman" w:cs="Times New Roman" w:eastAsia="Times New Roman" w:hAnsi="Times New Roman"/>
+                <w:b w:val="false"/>
+                <w:bCs w:val="false"/>
+                <w:sz w:val="15"/>
+                <w:szCs w:val="15"/>
+              </w:rPr>
+              <w:t xml:space="preserve">400</w:t>
+            </w:r>
+          </w:p>
+        </w:tc>
+        <w:tc>
+          <w:tcPr>
+            <w:tcW w:type="dxa" w:w="1200"/>
+            <w:tcBorders>
+              <w:top w:val="none" w:color="FFFFFF" w:sz="0"/>
+              <w:left w:val="none" w:color="FFFFFF" w:sz="0"/>
+              <w:bottom w:val="none" w:color="FFFFFF" w:sz="0"/>
+              <w:right w:val="none" w:color="FFFFFF" w:sz="0"/>
+            </w:tcBorders>
+            <w:tcMar>
+              <w:top w:type="dxa" w:w="20"/>
+              <w:left w:type="dxa" w:w="40"/>
+              <w:bottom w:type="dxa" w:w="20"/>
+              <w:right w:type="dxa" w:w="40"/>
+            </w:tcMar>
+            <w:vAlign w:val="center"/>
+          </w:tcPr>
+          <w:p>
+            <w:pPr>
+              <w:keepNext/>
+              <w:spacing w:after="0" w:line="200"/>
+              <w:jc w:val="left"/>
+            </w:pPr>
+            <w:r>
+              <w:rPr>
+                <w:rFonts w:ascii="Times New Roman" w:cs="Times New Roman" w:eastAsia="Times New Roman" w:hAnsi="Times New Roman"/>
+                <w:b w:val="false"/>
+                <w:bCs w:val="false"/>
+                <w:sz w:val="15"/>
+                <w:szCs w:val="15"/>
+              </w:rPr>
+              <w:t xml:space="preserve">706</w:t>
+            </w:r>
+          </w:p>
+        </w:tc>
+        <w:tc>
+          <w:tcPr>
+            <w:tcW w:type="dxa" w:w="1200"/>
+            <w:tcBorders>
+              <w:top w:val="none" w:color="FFFFFF" w:sz="0"/>
+              <w:left w:val="none" w:color="FFFFFF" w:sz="0"/>
+              <w:bottom w:val="none" w:color="FFFFFF" w:sz="0"/>
+              <w:right w:val="none" w:color="FFFFFF" w:sz="0"/>
+            </w:tcBorders>
+            <w:tcMar>
+              <w:top w:type="dxa" w:w="20"/>
+              <w:left w:type="dxa" w:w="40"/>
+              <w:bottom w:type="dxa" w:w="20"/>
+              <w:right w:type="dxa" w:w="40"/>
+            </w:tcMar>
+            <w:vAlign w:val="center"/>
+          </w:tcPr>
+          <w:p>
+            <w:pPr>
+              <w:keepNext/>
+              <w:spacing w:after="0" w:line="200"/>
+              <w:jc w:val="left"/>
+            </w:pPr>
+            <w:r>
+              <w:rPr>
+                <w:rFonts w:ascii="Times New Roman" w:cs="Times New Roman" w:eastAsia="Times New Roman" w:hAnsi="Times New Roman"/>
+                <w:b w:val="false"/>
+                <w:bCs w:val="false"/>
+                <w:sz w:val="15"/>
+                <w:szCs w:val="15"/>
+              </w:rPr>
+              <w:t xml:space="preserve">7172</w:t>
+            </w:r>
+          </w:p>
+        </w:tc>
+        <w:tc>
+          <w:tcPr>
+            <w:tcW w:type="dxa" w:w="1000"/>
+            <w:tcBorders>
+              <w:top w:val="none" w:color="FFFFFF" w:sz="0"/>
+              <w:left w:val="none" w:color="FFFFFF" w:sz="0"/>
+              <w:bottom w:val="none" w:color="FFFFFF" w:sz="0"/>
+              <w:right w:val="none" w:color="FFFFFF" w:sz="0"/>
+            </w:tcBorders>
+            <w:tcMar>
+              <w:top w:type="dxa" w:w="20"/>
+              <w:left w:type="dxa" w:w="40"/>
+              <w:bottom w:type="dxa" w:w="20"/>
+              <w:right w:type="dxa" w:w="40"/>
+            </w:tcMar>
+            <w:vAlign w:val="center"/>
+          </w:tcPr>
+          <w:p>
+            <w:pPr>
+              <w:keepNext/>
+              <w:spacing w:after="0" w:line="200"/>
+              <w:jc w:val="left"/>
+            </w:pPr>
+            <w:r>
+              <w:rPr>
+                <w:rFonts w:ascii="Times New Roman" w:cs="Times New Roman" w:eastAsia="Times New Roman" w:hAnsi="Times New Roman"/>
+                <w:b w:val="false"/>
+                <w:bCs w:val="false"/>
+                <w:sz w:val="15"/>
+                <w:szCs w:val="15"/>
+              </w:rPr>
+              <w:t xml:space="preserve">1.2</w:t>
+            </w:r>
+          </w:p>
+        </w:tc>
+      </w:tr>
+      <w:tr>
+        <w:trPr>
+          <w:cantSplit/>
+        </w:trPr>
+        <w:tc>
+          <w:tcPr>
+            <w:tcW w:type="dxa" w:w="1100"/>
+            <w:tcBorders>
+              <w:top w:val="none" w:color="FFFFFF" w:sz="0"/>
+              <w:left w:val="none" w:color="FFFFFF" w:sz="0"/>
+              <w:bottom w:val="single" w:color="000000" w:sz="4"/>
+              <w:right w:val="none" w:color="FFFFFF" w:sz="0"/>
+            </w:tcBorders>
+            <w:tcMar>
+              <w:top w:type="dxa" w:w="20"/>
+              <w:left w:type="dxa" w:w="40"/>
+              <w:bottom w:type="dxa" w:w="20"/>
+              <w:right w:type="dxa" w:w="40"/>
+            </w:tcMar>
+            <w:vAlign w:val="center"/>
+          </w:tcPr>
+          <w:p>
+            <w:pPr>
+              <w:keepNext/>
+              <w:spacing w:after="0" w:line="200"/>
+              <w:jc w:val="left"/>
+            </w:pPr>
+            <w:r>
+              <w:rPr>
+                <w:rFonts w:ascii="Times New Roman" w:cs="Times New Roman" w:eastAsia="Times New Roman" w:hAnsi="Times New Roman"/>
+                <w:b w:val="false"/>
+                <w:bCs w:val="false"/>
+                <w:sz w:val="15"/>
+                <w:szCs w:val="15"/>
+              </w:rPr>
+              <w:t xml:space="preserve">4</w:t>
+            </w:r>
+          </w:p>
+        </w:tc>
+        <w:tc>
+          <w:tcPr>
+            <w:tcW w:type="dxa" w:w="1500"/>
+            <w:tcBorders>
+              <w:top w:val="none" w:color="FFFFFF" w:sz="0"/>
+              <w:left w:val="none" w:color="FFFFFF" w:sz="0"/>
+              <w:bottom w:val="single" w:color="000000" w:sz="4"/>
+              <w:right w:val="none" w:color="FFFFFF" w:sz="0"/>
+            </w:tcBorders>
+            <w:tcMar>
+              <w:top w:type="dxa" w:w="20"/>
+              <w:left w:type="dxa" w:w="40"/>
+              <w:bottom w:type="dxa" w:w="20"/>
+              <w:right w:type="dxa" w:w="40"/>
+            </w:tcMar>
+            <w:vAlign w:val="center"/>
+          </w:tcPr>
+          <w:p>
+            <w:pPr>
+              <w:keepNext/>
+              <w:spacing w:after="0" w:line="200"/>
+              <w:jc w:val="left"/>
+            </w:pPr>
+            <w:r>
+              <w:rPr>
+                <w:rFonts w:ascii="Times New Roman" w:cs="Times New Roman" w:eastAsia="Times New Roman" w:hAnsi="Times New Roman"/>
+                <w:b w:val="false"/>
+                <w:bCs w:val="false"/>
+                <w:sz w:val="15"/>
+                <w:szCs w:val="15"/>
+              </w:rPr>
+              <w:t xml:space="preserve">400</w:t>
+            </w:r>
+          </w:p>
+        </w:tc>
+        <w:tc>
+          <w:tcPr>
+            <w:tcW w:type="dxa" w:w="1200"/>
+            <w:tcBorders>
+              <w:top w:val="none" w:color="FFFFFF" w:sz="0"/>
+              <w:left w:val="none" w:color="FFFFFF" w:sz="0"/>
+              <w:bottom w:val="single" w:color="000000" w:sz="4"/>
+              <w:right w:val="none" w:color="FFFFFF" w:sz="0"/>
+            </w:tcBorders>
+            <w:tcMar>
+              <w:top w:type="dxa" w:w="20"/>
+              <w:left w:type="dxa" w:w="40"/>
+              <w:bottom w:type="dxa" w:w="20"/>
+              <w:right w:type="dxa" w:w="40"/>
+            </w:tcMar>
+            <w:vAlign w:val="center"/>
+          </w:tcPr>
+          <w:p>
+            <w:pPr>
+              <w:keepNext/>
+              <w:spacing w:after="0" w:line="200"/>
+              <w:jc w:val="left"/>
+            </w:pPr>
+            <w:r>
+              <w:rPr>
+                <w:rFonts w:ascii="Times New Roman" w:cs="Times New Roman" w:eastAsia="Times New Roman" w:hAnsi="Times New Roman"/>
+                <w:b w:val="false"/>
+                <w:bCs w:val="false"/>
+                <w:sz w:val="15"/>
+                <w:szCs w:val="15"/>
+              </w:rPr>
+              <w:t xml:space="preserve">770</w:t>
+            </w:r>
+          </w:p>
+        </w:tc>
+        <w:tc>
+          <w:tcPr>
+            <w:tcW w:type="dxa" w:w="1200"/>
+            <w:tcBorders>
+              <w:top w:val="none" w:color="FFFFFF" w:sz="0"/>
+              <w:left w:val="none" w:color="FFFFFF" w:sz="0"/>
+              <w:bottom w:val="single" w:color="000000" w:sz="4"/>
+              <w:right w:val="none" w:color="FFFFFF" w:sz="0"/>
+            </w:tcBorders>
+            <w:tcMar>
+              <w:top w:type="dxa" w:w="20"/>
+              <w:left w:type="dxa" w:w="40"/>
+              <w:bottom w:type="dxa" w:w="20"/>
+              <w:right w:type="dxa" w:w="40"/>
+            </w:tcMar>
+            <w:vAlign w:val="center"/>
+          </w:tcPr>
+          <w:p>
+            <w:pPr>
+              <w:keepNext/>
+              <w:spacing w:after="0" w:line="200"/>
+              <w:jc w:val="left"/>
+            </w:pPr>
+            <w:r>
+              <w:rPr>
+                <w:rFonts w:ascii="Times New Roman" w:cs="Times New Roman" w:eastAsia="Times New Roman" w:hAnsi="Times New Roman"/>
+                <w:b w:val="false"/>
+                <w:bCs w:val="false"/>
+                <w:sz w:val="15"/>
+                <w:szCs w:val="15"/>
+              </w:rPr>
+              <w:t xml:space="preserve">436</w:t>
+            </w:r>
+          </w:p>
+        </w:tc>
+        <w:tc>
+          <w:tcPr>
+            <w:tcW w:type="dxa" w:w="1000"/>
+            <w:tcBorders>
+              <w:top w:val="none" w:color="FFFFFF" w:sz="0"/>
+              <w:left w:val="none" w:color="FFFFFF" w:sz="0"/>
+              <w:bottom w:val="single" w:color="000000" w:sz="4"/>
+              <w:right w:val="none" w:color="FFFFFF" w:sz="0"/>
+            </w:tcBorders>
+            <w:tcMar>
+              <w:top w:type="dxa" w:w="20"/>
+              <w:left w:type="dxa" w:w="40"/>
+              <w:bottom w:type="dxa" w:w="20"/>
+              <w:right w:type="dxa" w:w="40"/>
+            </w:tcMar>
+            <w:vAlign w:val="center"/>
+          </w:tcPr>
+          <w:p>
+            <w:pPr>
+              <w:keepNext/>
+              <w:spacing w:after="0" w:line="200"/>
+              <w:jc w:val="left"/>
+            </w:pPr>
+            <w:r>
+              <w:rPr>
+                <w:rFonts w:ascii="Times New Roman" w:cs="Times New Roman" w:eastAsia="Times New Roman" w:hAnsi="Times New Roman"/>
+                <w:b w:val="false"/>
+                <w:bCs w:val="false"/>
+                <w:sz w:val="15"/>
+                <w:szCs w:val="15"/>
+              </w:rPr>
+              <w:t xml:space="preserve">2.4</w:t>
+            </w:r>
+          </w:p>
+        </w:tc>
+      </w:tr>
+    </w:tbl>
+    <w:p>
+      <w:pPr>
+        <w:spacing w:after="80" w:before="20"/>
+        <w:jc w:val="both"/>
+      </w:pPr>
+      <w:r>
+        <w:rPr>
+          <w:rFonts w:ascii="Times New Roman" w:cs="Times New Roman" w:eastAsia="Times New Roman" w:hAnsi="Times New Roman"/>
+          <w:sz w:val="14"/>
+          <w:szCs w:val="14"/>
+        </w:rPr>
+        <w:t xml:space="preserve">Clean rate = highest offered rate with no failed request and P95 &lt; 50 ms; one VM; load generator on a separate VM; mean of the runs.</w:t>
+      </w:r>
+    </w:p>
+    <w:p>
+      <w:pPr>
+        <w:keepNext/>
+        <w:spacing w:after="20" w:before="40"/>
+        <w:jc w:val="center"/>
+      </w:pPr>
+      <w:r>
+        <w:drawing>
+          <wp:inline distT="0" distB="0" distL="0" distR="0">
+            <wp:extent cx="3067050" cy="1143000"/>
+            <wp:effectExtent t="0" r="0" b="0" l="0"/>
+            <wp:docPr id="1" name="fig10_scaling.png" descr="Fig. 10. Goodput (left) and P95 latency (right) versus offered request rate for 1, 2 and 4 PEP processes." title="Fig. 10. Goodput (left) and P95 latency (right) versus offered request rate for 1, 2 and 4 PEP processes."/>
+            <wp:cNvGraphicFramePr>
+              <a:graphicFrameLocks xmlns:a="http://schemas.openxmlformats.org/drawingml/2006/main" noChangeAspect="1"/>
+            </wp:cNvGraphicFramePr>
+            <a:graphic xmlns:a="http://schemas.openxmlformats.org/drawingml/2006/main">
+              <a:graphicData uri="http://schemas.openxmlformats.org/drawingml/2006/picture">
+                <pic:pic xmlns:pic="http://schemas.openxmlformats.org/drawingml/2006/picture">
+                  <pic:nvPicPr>
+                    <pic:cNvPr id="0" name="" descr=""/>
+                    <pic:cNvPicPr>
+                      <a:picLocks noChangeAspect="1" noChangeArrowheads="1"/>
+                    </pic:cNvPicPr>
+                  </pic:nvPicPr>
+                  <pic:blipFill>
+                    <a:blip r:embed="rId18" cstate="none"/>
+                    <a:srcRect/>
+                    <a:stretch>
+                      <a:fillRect/>
+                    </a:stretch>
+                  </pic:blipFill>
+                  <pic:spPr bwMode="auto">
+                    <a:xfrm>
+                      <a:off x="0" y="0"/>
+                      <a:ext cx="3067050" cy="1143000"/>
+                    </a:xfrm>
+                    <a:prstGeom prst="rect">
+                      <a:avLst/>
+                    </a:prstGeom>
+                  </pic:spPr>
+                </pic:pic>
+              </a:graphicData>
+            </a:graphic>
+          </wp:inline>
+        </w:drawing>
+      </w:r>
+    </w:p>
+    <w:p>
+      <w:pPr>
+        <w:spacing w:after="80"/>
+        <w:jc w:val="center"/>
+      </w:pPr>
+      <w:r>
+        <w:rPr>
+          <w:rFonts w:ascii="Times New Roman" w:cs="Times New Roman" w:eastAsia="Times New Roman" w:hAnsi="Times New Roman"/>
+          <w:sz w:val="16"/>
+          <w:szCs w:val="16"/>
+        </w:rPr>
+        <w:t xml:space="preserve">Fig. 10. Goodput (left) and P95 latency (right) versus offered request rate for 1, 2 and 4 PEP processes.</w:t>
       </w:r>
     </w:p>
     <w:p>
@@ -17276,7 +19702,7 @@
           <w:sz w:val="20"/>
           <w:szCs w:val="20"/>
         </w:rPr>
-        <w:t xml:space="preserve">K. Discussion and Limitations</w:t>
+        <w:t xml:space="preserve">K. Comparison with Baselines</w:t>
       </w:r>
     </w:p>
     <w:p>
@@ -17290,7 +19716,40 @@
           <w:sz w:val="20"/>
           <w:szCs w:val="20"/>
         </w:rPr>
-        <w:t xml:space="preserve">The key trade-off is bounded revocation staleness for latency. Limitations: (i) the seven VMs sit in one zone of one cloud provider, so inter-VM delay is that of a data-centre network plus the injected netem delays, not a plant network or a WAN, and absolute latencies and throughput are specific to these VM sizes; (ii) B1–B3 are simple re-implementations; Keycloak ran in development mode (single node, embedded H2 database) and OpenLDAP as a single server, both behind an emulated 40 ms WAN, so production-tuned or clustered deployments may behave differently, particularly for availability; (iii) the device population is emulated by a load generator with up to 200 devices at 1 request/s: no physical devices, industrial protocols, secure elements, larger populations or bursty and churn-heavy workloads were used; (iv) one plant authority key issues registrations and revocations, so authority compromise is out of scope; (v) the availability tests are limited: the E4 flood was partly rejected by Besu (an accepted rate of 90–200 tx/s) and E5 stops one validator once for 30 s, with no network partition or Byzantine validator; (vi) each experiment has five repetitions (three for the IAM tests and two for the flood sweep) on the same VMs, the revocation tests use 8 devices per run, and a single-process PEP saturates at roughly 250–290 req/s, so larger sites need several PEPs; and (vii) trust scores are voted values, not yet learned from data. Comparisons with published numbers are indicative only, since workloads and testbeds differ.</w:t>
+        <w:t xml:space="preserve">BC-ZTA is 0.2 ms slower than a ledger-free ABAC store at 50 devices but adds decentralised identity, shared policy and tamper-evident anchored audit that B2 lacks; against the centralised PKI-IAM it is 89% faster at 50 devices (with a 40 ms netem delay on the directory server) and removes the central directory; and against the synchronous blockchain it avoids ~1.4 s per decision at 50 devices and the ledger ceiling. Against real Keycloak and OpenLDAP services (Section VI-H) it is 8× and 7× faster at 100 devices, but a PEP-side cache gives similar mean latency at the cost of stale revocations, and a central directory with pushed revocations (Section VI-J) matches its latency and revokes faster. Its price is revocation latency: about 1.3 s with events (one block) instead of about 84 ms for a central store. A reported Ethereum-based framework pays about 25 ms extra per request even at small scale </w:t>
+      </w:r>
+      <w:r>
+        <w:rPr>
+          <w:rFonts w:ascii="Times New Roman" w:cs="Times New Roman" w:eastAsia="Times New Roman" w:hAnsi="Times New Roman"/>
+          <w:sz w:val="20"/>
+          <w:szCs w:val="20"/>
+        </w:rPr>
+        <w:t xml:space="preserve">[17]</w:t>
+      </w:r>
+      <w:r>
+        <w:rPr>
+          <w:rFonts w:ascii="Times New Roman" w:cs="Times New Roman" w:eastAsia="Times New Roman" w:hAnsi="Times New Roman"/>
+          <w:sz w:val="20"/>
+          <w:szCs w:val="20"/>
+        </w:rPr>
+        <w:t xml:space="preserve">, consistent with our finding that on-path consensus is the bottleneck.</w:t>
+      </w:r>
+    </w:p>
+    <w:p>
+      <w:pPr>
+        <w:keepNext/>
+        <w:spacing w:after="30" w:before="60"/>
+        <w:jc w:val="left"/>
+      </w:pPr>
+      <w:r>
+        <w:rPr>
+          <w:rFonts w:ascii="Times New Roman" w:cs="Times New Roman" w:eastAsia="Times New Roman" w:hAnsi="Times New Roman"/>
+          <w:i/>
+          <w:iCs/>
+          <w:sz w:val="20"/>
+          <w:szCs w:val="20"/>
+        </w:rPr>
+        <w:t xml:space="preserve">L. Discussion and Limitations</w:t>
       </w:r>
     </w:p>
     <w:p>
@@ -17304,7 +19763,21 @@
           <w:sz w:val="20"/>
           <w:szCs w:val="20"/>
         </w:rPr>
-        <w:t xml:space="preserve">Further limitations follow from the security analysis (Section IV-F). The nonce cache is per gateway and the signed request carries no gateway identifier, so a captured request can be replayed once at another gateway within Δ; the default read path trusts one ledger node (the quorum option is implemented but not part of the default measurements); audit completeness is not protected against a compromised gateway; the Merkle epoch proof shows enrolment, not freshness; and the device-side cost of signing and proof storage was not measured, so the claim of compatibility with constrained devices (D5) is an argument, not a result. Each request is signed individually, which is appropriate for access decisions but not for high-rate telemetry, where a session credential issued after one verified request would be used. All statistical statements rest on 2–5 repetitions with standard deviations or 95% confidence intervals and no hypothesis tests.</w:t>
+        <w:t xml:space="preserve">The key trade-off is bounded revocation staleness for latency. The push baseline of Section VI-J shows that this trade-off is not specific to the ledger: a trusted central operator obtains the same latency and a faster revocation, so the ledger has to be justified by who controls the identity state and who can verify the audit, not by speed. Limitations: (i) the seven VMs sit in one zone of one cloud provider, so inter-VM delay is that of a data-centre network plus the injected netem delays, not a plant network or a WAN, and absolute latencies and throughput are specific to these VM sizes; (ii) B1–B3 are simple re-implementations; Keycloak ran in development mode (single node, embedded H2 database) and OpenLDAP as a single server, both behind an emulated 40 ms WAN, so production-tuned or clustered deployments may behave differently, particularly for availability; (iii) the device population is emulated by a load generator with up to 200 devices at 1 request/s: no physical devices, industrial protocols, secure elements, larger populations or bursty and churn-heavy workloads were used; (iv) one plant authority key issues registrations and revocations, so authority compromise is out of scope; (v) the availability tests are limited: the E4 flood was partly rejected by Besu (an accepted rate of 90–200 tx/s) and E5 stops one validator once for 30 s and Section VI-J stops two for 40 s, with no network partition or Byzantine validator; (vi) each experiment has five repetitions (three for the IAM tests and two for the flood sweep) on the same VMs, the revocation tests use 8 devices per run, and a single-process PEP saturates at roughly 250–290 req/s, so larger sites need several PEPs (scale-out was measured on one host only); and (vii) trust scores are voted values, not yet learned from data. Comparisons with published numbers are indicative only, since workloads and testbeds differ.</w:t>
+      </w:r>
+    </w:p>
+    <w:p>
+      <w:pPr>
+        <w:spacing w:after="60" w:before="0" w:line="228"/>
+        <w:jc w:val="both"/>
+      </w:pPr>
+      <w:r>
+        <w:rPr>
+          <w:rFonts w:ascii="Times New Roman" w:cs="Times New Roman" w:eastAsia="Times New Roman" w:hAnsi="Times New Roman"/>
+          <w:sz w:val="20"/>
+          <w:szCs w:val="20"/>
+        </w:rPr>
+        <w:t xml:space="preserve">Further limitations follow from the security analysis (Section IV-F). The nonce cache is per gateway and the signed request carries no gateway identifier, so a captured request can be replayed once at another gateway within Δ; the default read path trusts one ledger node (the quorum option is implemented, and its cost is measured in Section VI-J, but it is not part of the default measurements); audit completeness is not protected against a compromised gateway; the Merkle epoch proof shows enrolment, not freshness; and the device-side cost of signing and proof storage was not measured, so the claim of compatibility with constrained devices (D5) is an argument, not a result. Each request is signed individually, which is appropriate for access decisions but not for high-rate telemetry, where a session credential issued after one verified request would be used. All statistical statements rest on 2–5 repetitions with standard deviations or 95% confidence intervals and no hypothesis tests.</w:t>
       </w:r>
     </w:p>
     <w:p>
@@ -17347,7 +19820,7 @@
           <w:sz w:val="20"/>
           <w:szCs w:val="20"/>
         </w:rPr>
-        <w:t xml:space="preserve">We presented BC-ZTA, a blockchain-assisted zero-trust architecture that keeps consensus off the per-request path through edge-cached, Merkle-verified state and asynchronous batched anchoring. Four Solidity contracts pass 15 unit tests, and measured gas shows batch anchoring is 68–1351× cheaper per record than per-event logging for batches of 50–1,000 records. In end-to-end tests on a seven-VM Google Cloud deployment with a four-validator Besu network, BC-ZTA decided in 5.4 ms on average at 50 devices and served 200 devices without failures with about one on-chain write per second, and kept deciding while one validator was stopped or the central IAM service was down, while the synchronous design needed 1.4 s at 50 devices and answered only 40% of the requests at 200 devices; the price is a revocation delay of about 1.3 s with event-driven invalidation. All forged, replayed, stale, unregistered, tampered and policy-violating requests were rejected. The evaluation used cloud VMs in a single zone with injected network delay and an emulated device population. Future work includes a multi-site Besu deployment with real network delay, physical devices and industrial protocols, clustered production IAM baselines, learning-based trust scoring and post-quantum signatures.</w:t>
+        <w:t xml:space="preserve">We presented BC-ZTA, a blockchain-assisted zero-trust architecture that keeps consensus off the per-request path through edge-cached, Merkle-verified state and asynchronous batched anchoring. Four Solidity contracts pass 15 unit tests, and measured gas shows batch anchoring is 68–1351× cheaper per record than per-event logging for batches of 50–1,000 records. In end-to-end tests on a seven-VM Google Cloud deployment with a four-validator Besu network, BC-ZTA decided in 5.4 ms on average at 50 devices and served 200 devices without failures with about one on-chain write per second, and kept deciding while one validator was stopped, while the synchronous design needed 1.4 s at 50 devices and answered only 40% of the requests at 200 devices; the price is a revocation delay of about 1.3 s with event-driven invalidation. A baseline with a central directory and pushed revocations, which we added to test whether the ledger is needed for speed, has the same latency and revokes in 109 ms; the case for the ledger therefore rests on removing any single operator’s control over identity state and on audit that third parties can verify, not on performance. A fail-closed bound of twice the cache lifetime, a read quorum of two validators, replicated gateways and the behaviour during a consensus halt (revocations wait for consensus, here 161 s on average) are evaluated in Section VI-J. All forged, replayed, stale, unregistered, tampered and policy-violating requests were rejected. The evaluation used cloud VMs in a single zone with injected network delay and an emulated device population. Future work includes a multi-site Besu deployment with real network delay, physical devices and industrial protocols, clustered production IAM baselines, learning-based trust scoring and post-quantum signatures.</w:t>
       </w:r>
     </w:p>
     <w:p>
@@ -17448,7 +19921,7 @@
         </w:rPr>
         <w:t xml:space="preserve">F. Federici, D. Martintoni, and V. Senni, “A zero-trust architecture for remote access in industrial IoT infrastructures,” Electronics, vol. 12, no. 3, Art. no. 566, 2023, </w:t>
       </w:r>
-      <w:hyperlink w:history="1" r:id="rIdik1qresgntvjx5yaqqfpt">
+      <w:hyperlink w:history="1" r:id="rId8ua9rhygqihtdgj8hefgs">
         <w:r>
           <w:rPr>
             <w:rFonts w:ascii="Times New Roman" w:cs="Times New Roman" w:eastAsia="Times New Roman" w:hAnsi="Times New Roman"/>
@@ -17486,7 +19959,7 @@
         </w:rPr>
         <w:t xml:space="preserve">C. Zanasi, S. Russo, and M. Colajanni, “Flexible zero trust architecture for the cybersecurity of industrial IoT infrastructures,” Ad Hoc Netw., vol. 156, Art. no. 103414, 2024, </w:t>
       </w:r>
-      <w:hyperlink w:history="1" r:id="rId-pb-oimqhurnfbkqbcexh">
+      <w:hyperlink w:history="1" r:id="rIdjnjbot_p479fbob19_fns">
         <w:r>
           <w:rPr>
             <w:rFonts w:ascii="Times New Roman" w:cs="Times New Roman" w:eastAsia="Times New Roman" w:hAnsi="Times New Roman"/>
@@ -17524,7 +19997,7 @@
         </w:rPr>
         <w:t xml:space="preserve">S. Rose, O. Borchert, S. Mitchell, and S. Connelly, “Zero trust architecture,” Nat. Inst. Standards Technol., Gaithersburg, MD, USA, Spec. Publ. 800-207, Aug. 2020, </w:t>
       </w:r>
-      <w:hyperlink w:history="1" r:id="rIdb6is-vorulockvmvurpbk">
+      <w:hyperlink w:history="1" r:id="rIdz7ftwptz2lf0xrqcrfhhr">
         <w:r>
           <w:rPr>
             <w:rFonts w:ascii="Times New Roman" w:cs="Times New Roman" w:eastAsia="Times New Roman" w:hAnsi="Times New Roman"/>
@@ -17562,7 +20035,7 @@
         </w:rPr>
         <w:t xml:space="preserve">M. L. Gambo and A. Almulhem, “Zero trust architecture: A systematic literature review,” J. Netw. Syst. Manage., vol. 34, Art. no. 25, 2026, </w:t>
       </w:r>
-      <w:hyperlink w:history="1" r:id="rIdsdky5m8ju1vzfa6xb07oh">
+      <w:hyperlink w:history="1" r:id="rIdzoa7k4v34dn_loubolbvb">
         <w:r>
           <w:rPr>
             <w:rFonts w:ascii="Times New Roman" w:cs="Times New Roman" w:eastAsia="Times New Roman" w:hAnsi="Times New Roman"/>
@@ -17600,7 +20073,7 @@
         </w:rPr>
         <w:t xml:space="preserve">S. Mushtaq, M. Mohsin, and M. M. Mushtaq, “A systematic literature review on the implementation and challenges of zero trust architecture across domains,” Sensors, vol. 25, no. 19, Art. no. 6118, 2025, </w:t>
       </w:r>
-      <w:hyperlink w:history="1" r:id="rIdeqvby30cny4xfyc3y6afv">
+      <w:hyperlink w:history="1" r:id="rIdk7zaugite5q0rhvb1vwzm">
         <w:r>
           <w:rPr>
             <w:rFonts w:ascii="Times New Roman" w:cs="Times New Roman" w:eastAsia="Times New Roman" w:hAnsi="Times New Roman"/>
@@ -17638,7 +20111,7 @@
         </w:rPr>
         <w:t xml:space="preserve">M. A. Azad, S. Abdullah, J. Arshad, H. Lallie, and Y. H. Ahmed, “Verify and trust: A multidimensional survey of zero-trust security in the age of IoT,” Internet Things, vol. 27, Art. no. 101227, 2024, </w:t>
       </w:r>
-      <w:hyperlink w:history="1" r:id="rIdwcyfxxksq52pjjlq2tm0w">
+      <w:hyperlink w:history="1" r:id="rIdqkektykcnbfoises6wd-6">
         <w:r>
           <w:rPr>
             <w:rFonts w:ascii="Times New Roman" w:cs="Times New Roman" w:eastAsia="Times New Roman" w:hAnsi="Times New Roman"/>
@@ -17676,7 +20149,7 @@
         </w:rPr>
         <w:t xml:space="preserve">S. Mthethwa, M. T. Dlamini, and E. Jembere, “Zero trust for NHIs based on robust identity and access management for a resilient IoT future,” Sensors, vol. 26, no. 8, Art. no. 2392, 2026, </w:t>
       </w:r>
-      <w:hyperlink w:history="1" r:id="rIdbralhjuchcmw-0iahnckm">
+      <w:hyperlink w:history="1" r:id="rIdywgchvkq3_bmoogk7wtea">
         <w:r>
           <w:rPr>
             <w:rFonts w:ascii="Times New Roman" w:cs="Times New Roman" w:eastAsia="Times New Roman" w:hAnsi="Times New Roman"/>
@@ -17714,7 +20187,7 @@
         </w:rPr>
         <w:t xml:space="preserve">M. Asim, N. Tariq, A. I. Awad, F. Waheed, S. Bukhari, A. Rafay, and H. H. Song, “Lightweight and privacy-aware decentralized identity management for Industrial Internet of Things applications,” Future Gener. Comput. Syst., vol. 186, Art. no. 108753, 2027 (online Aug. 2026), </w:t>
       </w:r>
-      <w:hyperlink w:history="1" r:id="rId6isbpwnbbruxzcuhrkpb7">
+      <w:hyperlink w:history="1" r:id="rIdadnqt8g0zhauhhe8j_bgw">
         <w:r>
           <w:rPr>
             <w:rFonts w:ascii="Times New Roman" w:cs="Times New Roman" w:eastAsia="Times New Roman" w:hAnsi="Times New Roman"/>
@@ -17752,7 +20225,7 @@
         </w:rPr>
         <w:t xml:space="preserve">E. B. Fernández and A. Brazhuk, “A critical analysis of zero trust architecture (ZTA),” Comput. Stand. Interfaces, vol. 89, Art. no. 103832, 2024, </w:t>
       </w:r>
-      <w:hyperlink w:history="1" r:id="rIdn_gaxpfm6rjyawdnfl5nf">
+      <w:hyperlink w:history="1" r:id="rIdoulusgzu7kw45n1lodi8c">
         <w:r>
           <w:rPr>
             <w:rFonts w:ascii="Times New Roman" w:cs="Times New Roman" w:eastAsia="Times New Roman" w:hAnsi="Times New Roman"/>
@@ -17790,7 +20263,7 @@
         </w:rPr>
         <w:t xml:space="preserve">Y.-W. Ma and P.-H. Chiu, “A novel risk-based access control engine in zero trust architecture for IoT network,” Int. J. Inf. Secur., vol. 24, Art. no. 124, 2025, </w:t>
       </w:r>
-      <w:hyperlink w:history="1" r:id="rIdskef7nzsnqvqymi1fzbsn">
+      <w:hyperlink w:history="1" r:id="rIdfm69hyy_y_52v_qgsnr82">
         <w:r>
           <w:rPr>
             <w:rFonts w:ascii="Times New Roman" w:cs="Times New Roman" w:eastAsia="Times New Roman" w:hAnsi="Times New Roman"/>
@@ -17828,7 +20301,7 @@
         </w:rPr>
         <w:t xml:space="preserve">M. A. Aleisa, “Blockchain-enabled zero trust architecture for privacy-preserving cybersecurity in IoT environments,” IEEE Access, vol. 13, pp. 18660–18676, 2025, </w:t>
       </w:r>
-      <w:hyperlink w:history="1" r:id="rIdalrg_c92_b1g8rblsuk_k">
+      <w:hyperlink w:history="1" r:id="rId1s9srgcycpqvkbcxxwvcl">
         <w:r>
           <w:rPr>
             <w:rFonts w:ascii="Times New Roman" w:cs="Times New Roman" w:eastAsia="Times New Roman" w:hAnsi="Times New Roman"/>
@@ -17866,7 +20339,7 @@
         </w:rPr>
         <w:t xml:space="preserve">S. Nie, J. Ren, R. Wu, P. Han, Z. Han, and W. Wan, “Zero-trust access control mechanism based on blockchain and inner-product encryption in the Internet of Things in a 6G environment,” Sensors, vol. 25, no. 2, Art. no. 550, 2025, </w:t>
       </w:r>
-      <w:hyperlink w:history="1" r:id="rIdthm6vsezllkqk2_cklcnx">
+      <w:hyperlink w:history="1" r:id="rIdqmerdwi-ftrv-kesgw_m0">
         <w:r>
           <w:rPr>
             <w:rFonts w:ascii="Times New Roman" w:cs="Times New Roman" w:eastAsia="Times New Roman" w:hAnsi="Times New Roman"/>
@@ -17904,7 +20377,7 @@
         </w:rPr>
         <w:t xml:space="preserve">G. Ali, S. Shah, M. Elaffendi, and N. Ahmad, “Blockchain-based access management framework for interoperable digital twins in industrial IoT,” Front. Blockchain, vol. 8, Art. no. 1693926, 2025, </w:t>
       </w:r>
-      <w:hyperlink w:history="1" r:id="rIdqumxl4-f0klrtushfcha7">
+      <w:hyperlink w:history="1" r:id="rIdos3928ixeidu2ymvfm7g_">
         <w:r>
           <w:rPr>
             <w:rFonts w:ascii="Times New Roman" w:cs="Times New Roman" w:eastAsia="Times New Roman" w:hAnsi="Times New Roman"/>
@@ -17942,7 +20415,7 @@
         </w:rPr>
         <w:t xml:space="preserve">M. Essaid and H. Ju, “Blockchain solutions for enhancing security and privacy in Industrial IoT,” Appl. Sci., vol. 15, no. 12, Art. no. 6835, 2025, </w:t>
       </w:r>
-      <w:hyperlink w:history="1" r:id="rIdybph3vt7mjjeldtr9qrq5">
+      <w:hyperlink w:history="1" r:id="rIde7n062mjjmigogeg7fnwi">
         <w:r>
           <w:rPr>
             <w:rFonts w:ascii="Times New Roman" w:cs="Times New Roman" w:eastAsia="Times New Roman" w:hAnsi="Times New Roman"/>
@@ -17980,7 +20453,7 @@
         </w:rPr>
         <w:t xml:space="preserve">D. Li, H. Li, N. Crespi, R. Minerva, M. Li, W. Liang, and K. C. Li, “Hyper-IIoT: A smart contract-inspired access control scheme for resource-constrained Industrial Internet of Things,” IEEE Trans. Sustain. Comput., vol. 10, no. 5, pp. 820–829, 2025, </w:t>
       </w:r>
-      <w:hyperlink w:history="1" r:id="rId6kyin3nw-9l4bgaxme3s2">
+      <w:hyperlink w:history="1" r:id="rIdkp1w84nekfahiaksumr0q">
         <w:r>
           <w:rPr>
             <w:rFonts w:ascii="Times New Roman" w:cs="Times New Roman" w:eastAsia="Times New Roman" w:hAnsi="Times New Roman"/>
@@ -18018,7 +20491,7 @@
         </w:rPr>
         <w:t xml:space="preserve">Z. Guo, “Blockchain-enhanced smart contracts for formal verification of IoT access control mechanisms,” Alexandria Eng. J., vol. 118, pp. 315–324, 2025, </w:t>
       </w:r>
-      <w:hyperlink w:history="1" r:id="rIdzodamhl4vfpt9f2uydz1r">
+      <w:hyperlink w:history="1" r:id="rIdepnyqxa_qmantsswvjjlo">
         <w:r>
           <w:rPr>
             <w:rFonts w:ascii="Times New Roman" w:cs="Times New Roman" w:eastAsia="Times New Roman" w:hAnsi="Times New Roman"/>
@@ -18056,7 +20529,7 @@
         </w:rPr>
         <w:t xml:space="preserve">A. Singh, V. Pareek, and A. Sharma, “Blockchain-enabled zero trust framework for securing FinTech ecosystems against insider threats and cyber attacks,” </w:t>
       </w:r>
-      <w:hyperlink w:history="1" r:id="rIdpt4hasj6kzma8p848igh5">
+      <w:hyperlink w:history="1" r:id="rIdrwvaiicz1burmcey7-9bk">
         <w:r>
           <w:rPr>
             <w:rFonts w:ascii="Times New Roman" w:cs="Times New Roman" w:eastAsia="Times New Roman" w:hAnsi="Times New Roman"/>
@@ -18094,7 +20567,7 @@
         </w:rPr>
         <w:t xml:space="preserve">M. M. Salim, M. Kim, S. K. Singh, and J. H. Park, “Zero-trust blockchain-enabled framework for scalable and secure IoT networks,” Future Gener. Comput. Syst., vol. 175, Art. no. 108093, 2026, </w:t>
       </w:r>
-      <w:hyperlink w:history="1" r:id="rIdsu9gtjbbrnvu-gksxbdnl">
+      <w:hyperlink w:history="1" r:id="rIdrnwnmmh2jgwyq14ynjm2y">
         <w:r>
           <w:rPr>
             <w:rFonts w:ascii="Times New Roman" w:cs="Times New Roman" w:eastAsia="Times New Roman" w:hAnsi="Times New Roman"/>
@@ -18132,7 +20605,7 @@
         </w:rPr>
         <w:t xml:space="preserve">A. Sharma, S. Rani, and W. Boulila, “Blockchain-based zero trust networks with federated transfer learning for IoT security in industry 5.0,” PLOS ONE, vol. 20, no. 6, Art. no. e0323241, 2025, </w:t>
       </w:r>
-      <w:hyperlink w:history="1" r:id="rIdi4w09rd1jfojw_pei4m2v">
+      <w:hyperlink w:history="1" r:id="rIdfycfv52la07tzofgmyu2s">
         <w:r>
           <w:rPr>
             <w:rFonts w:ascii="Times New Roman" w:cs="Times New Roman" w:eastAsia="Times New Roman" w:hAnsi="Times New Roman"/>
@@ -18170,7 +20643,7 @@
         </w:rPr>
         <w:t xml:space="preserve">S. Mishra, T. S. M. Aldafas, and N. S. Alshammari, “A zero-trust digital twin framework for privacy-preserving multi-dataset intrusion detection in industrial IoT with lightweight blockchain auditing,” Sci. Rep., vol. 16, Art. no. 15236, 2026, </w:t>
       </w:r>
-      <w:hyperlink w:history="1" r:id="rIdtxvsfj8s9ronafobelrof">
+      <w:hyperlink w:history="1" r:id="rIdsrvqgjkklhyrqefmo1v19">
         <w:r>
           <w:rPr>
             <w:rFonts w:ascii="Times New Roman" w:cs="Times New Roman" w:eastAsia="Times New Roman" w:hAnsi="Times New Roman"/>
@@ -18208,7 +20681,7 @@
         </w:rPr>
         <w:t xml:space="preserve">Z. Zhai, J. Liu, X. Liu, Y. Mao, X. Zhang, J. Ma, and C. Jin, “A lightweight authentication method for Industrial Internet of Things based on blockchain and Chebyshev chaotic maps,” Future Internet, vol. 17, no. 8, Art. no. 338, 2025, </w:t>
       </w:r>
-      <w:hyperlink w:history="1" r:id="rId04ghceeqpqv3np_ixgmuz">
+      <w:hyperlink w:history="1" r:id="rIdwtyvjxrijqby7tctre2ui">
         <w:r>
           <w:rPr>
             <w:rFonts w:ascii="Times New Roman" w:cs="Times New Roman" w:eastAsia="Times New Roman" w:hAnsi="Times New Roman"/>
@@ -18246,7 +20719,7 @@
         </w:rPr>
         <w:t xml:space="preserve">T. Ramírez-Gordillo, A. Maciá-Lillo, F. A. Pujol, N. García-D’Urso, J. Azorín-López, and H. Mora, “Decentralized identity management for Internet of Things (IoT) devices using IOTA blockchain technology,” Future Internet, vol. 17, no. 1, Art. no. 49, 2025, </w:t>
       </w:r>
-      <w:hyperlink w:history="1" r:id="rIdeopebolq40q_v7vr2wvi1">
+      <w:hyperlink w:history="1" r:id="rIdltlwaivln9ocztonsoiyc">
         <w:r>
           <w:rPr>
             <w:rFonts w:ascii="Times New Roman" w:cs="Times New Roman" w:eastAsia="Times New Roman" w:hAnsi="Times New Roman"/>
@@ -18284,7 +20757,7 @@
         </w:rPr>
         <w:t xml:space="preserve">S. I. R. Naqvi, Z. J. Bin, A. Mohsin, M. P. Akhter, and M. M. ur Rahman, “DBoT: Enhancing scalability and privacy in intelligent building spaces through a direct acyclic graph blockchain,” in Proc. 17th Int. Conf. Open Source Syst. Technol. (ICOSST), 2023, </w:t>
       </w:r>
-      <w:hyperlink w:history="1" r:id="rIdfquyjqwqvpcepciecuubu">
+      <w:hyperlink w:history="1" r:id="rIdly-aard4tgovcc2vwn5zt">
         <w:r>
           <w:rPr>
             <w:rFonts w:ascii="Times New Roman" w:cs="Times New Roman" w:eastAsia="Times New Roman" w:hAnsi="Times New Roman"/>
@@ -18322,7 +20795,7 @@
         </w:rPr>
         <w:t xml:space="preserve">R. Islam, R. Bose, S. Roy, A. A. Khan, S. Sutradhar, S. Das, F. Ali, and A. A. AlZubi, “Decentralized trust framework for smart cities: A blockchain-enabled cybersecurity and data integrity model,” Sci. Rep., vol. 15, Art. no. 23454, 2025, </w:t>
       </w:r>
-      <w:hyperlink w:history="1" r:id="rIdugiv57uroxvh3rzengpf7">
+      <w:hyperlink w:history="1" r:id="rIdkivg2erwgpbs-ieq5ga_c">
         <w:r>
           <w:rPr>
             <w:rFonts w:ascii="Times New Roman" w:cs="Times New Roman" w:eastAsia="Times New Roman" w:hAnsi="Times New Roman"/>
@@ -18360,7 +20833,7 @@
         </w:rPr>
         <w:t xml:space="preserve">P. Rani, “A zero-trust framework for securing next-generation Internet of Things network,” in New Trends and Applications in Internet of Things (IoT) and Big Data Analytics, vol. 2. Cham, Switzerland: Springer, 2026, pp. 213–225, </w:t>
       </w:r>
-      <w:hyperlink w:history="1" r:id="rIdtx9u-81vterap8kipbgno">
+      <w:hyperlink w:history="1" r:id="rIdpfeqb17zl3vj1ivkpsdtp">
         <w:r>
           <w:rPr>
             <w:rFonts w:ascii="Times New Roman" w:cs="Times New Roman" w:eastAsia="Times New Roman" w:hAnsi="Times New Roman"/>
@@ -18398,7 +20871,7 @@
         </w:rPr>
         <w:t xml:space="preserve">B. Chellaprabha, D. Manohari, and J. J. Justus, “Scalable and secure IoT architecture using trust-driven adaptive resource management and edge intelligence,” in Expert Applications and Security (NICE-TEAS 2025), Lecture Notes in Networks and Systems, vol. 1823. Cham, Switzerland: Springer, 2026, pp. 444–461, </w:t>
       </w:r>
-      <w:hyperlink w:history="1" r:id="rIdv-zkqtgxguyim6oxafrzr">
+      <w:hyperlink w:history="1" r:id="rIdcoe6wao1ycpdp47xx9kwe">
         <w:r>
           <w:rPr>
             <w:rFonts w:ascii="Times New Roman" w:cs="Times New Roman" w:eastAsia="Times New Roman" w:hAnsi="Times New Roman"/>
@@ -18436,7 +20909,7 @@
         </w:rPr>
         <w:t xml:space="preserve">K. Li et al., “Zero-trust foundation models: A new paradigm for secure and collaborative artificial intelligence for Internet of Things,” </w:t>
       </w:r>
-      <w:hyperlink w:history="1" r:id="rId3pbkogj4coud9rutwbqb0">
+      <w:hyperlink w:history="1" r:id="rId7eqgkcpbytpyampidx-kp">
         <w:r>
           <w:rPr>
             <w:rFonts w:ascii="Times New Roman" w:cs="Times New Roman" w:eastAsia="Times New Roman" w:hAnsi="Times New Roman"/>
@@ -18474,7 +20947,7 @@
         </w:rPr>
         <w:t xml:space="preserve">S. Ghasemshirazi, G. Shirvani, and M. A. Alipour, “Zero trust: Applications, challenges, and opportunities,” </w:t>
       </w:r>
-      <w:hyperlink w:history="1" r:id="rId_altkoyocqflu1not8opz">
+      <w:hyperlink w:history="1" r:id="rIda_mgns-0tzzh64qpegdli">
         <w:r>
           <w:rPr>
             <w:rFonts w:ascii="Times New Roman" w:cs="Times New Roman" w:eastAsia="Times New Roman" w:hAnsi="Times New Roman"/>
@@ -18512,7 +20985,7 @@
         </w:rPr>
         <w:t xml:space="preserve">A. K. Peepliwal et al., “A prototype model of zero-trust architecture blockchain with EigenTrust-based practical Byzantine fault tolerance protocol to manage decentralized clinical trials,” </w:t>
       </w:r>
-      <w:hyperlink w:history="1" r:id="rIdwwrl_c3hekligjrxhgdeo">
+      <w:hyperlink w:history="1" r:id="rIdkucbsnw-pvzun7ebb1tvk">
         <w:r>
           <w:rPr>
             <w:rFonts w:ascii="Times New Roman" w:cs="Times New Roman" w:eastAsia="Times New Roman" w:hAnsi="Times New Roman"/>
@@ -18550,7 +21023,7 @@
         </w:rPr>
         <w:t xml:space="preserve">A. Kulkarni, N. A. Hazari, and M. Y. Niamat, “A zero trust-based framework employing blockchain technology and ring oscillator physical unclonable functions for security of field programmable gate array supply chain,” IEEE Access, vol. 12, pp. 89322–89338, 2024. [Online]. Available: </w:t>
       </w:r>
-      <w:hyperlink w:history="1" r:id="rId52ie33p8jjwcnb5fgw7_q">
+      <w:hyperlink w:history="1" r:id="rIdgufo3f_kgibsai0egdp8l">
         <w:r>
           <w:rPr>
             <w:rFonts w:ascii="Times New Roman" w:cs="Times New Roman" w:eastAsia="Times New Roman" w:hAnsi="Times New Roman"/>
@@ -18588,7 +21061,7 @@
         </w:rPr>
         <w:t xml:space="preserve">D. Cooper, S. Santesson, S. Farrell, S. Boeyen, R. Housley, and W. Polk, “Internet X.509 public key infrastructure certificate and certificate revocation list (CRL) profile,” Internet Eng. Task Force, RFC 5280, May 2008. [Online]. Available: </w:t>
       </w:r>
-      <w:hyperlink w:history="1" r:id="rIdvkqtjb92jeczq4y15o9ur">
+      <w:hyperlink w:history="1" r:id="rId1ydngr-_kfxe0tsdzvhhm">
         <w:r>
           <w:rPr>
             <w:rFonts w:ascii="Times New Roman" w:cs="Times New Roman" w:eastAsia="Times New Roman" w:hAnsi="Times New Roman"/>
@@ -18626,7 +21099,7 @@
         </w:rPr>
         <w:t xml:space="preserve">S. Santesson, M. Myers, R. Ankney, A. Malpani, S. Galperin, and C. Adams, “X.509 Internet public key infrastructure online certificate status protocol—OCSP,” Internet Eng. Task Force, RFC 6960, Jun. 2013. [Online]. Available: </w:t>
       </w:r>
-      <w:hyperlink w:history="1" r:id="rIdbxrppsxydqgzvnt7vrkbj">
+      <w:hyperlink w:history="1" r:id="rIdcm2x2a3pgrrj1rzq3r4vl">
         <w:r>
           <w:rPr>
             <w:rFonts w:ascii="Times New Roman" w:cs="Times New Roman" w:eastAsia="Times New Roman" w:hAnsi="Times New Roman"/>
@@ -18664,7 +21137,7 @@
         </w:rPr>
         <w:t xml:space="preserve">D. Eastlake 3rd, “Transport layer security (TLS) extensions: Extension definitions,” Internet Eng. Task Force, RFC 6066, Jan. 2011. [Online]. Available: </w:t>
       </w:r>
-      <w:hyperlink w:history="1" r:id="rIdole-hyetyizacjne2cblj">
+      <w:hyperlink w:history="1" r:id="rId7h4dork2-w5fmvpxjvee7">
         <w:r>
           <w:rPr>
             <w:rFonts w:ascii="Times New Roman" w:cs="Times New Roman" w:eastAsia="Times New Roman" w:hAnsi="Times New Roman"/>
@@ -18702,7 +21175,7 @@
         </w:rPr>
         <w:t xml:space="preserve">B. Laurie, A. Langley, and E. Kasper, “Certificate transparency,” Internet Eng. Task Force, RFC 6962, Jun. 2013. [Online]. Available: </w:t>
       </w:r>
-      <w:hyperlink w:history="1" r:id="rIdopab6bjduktoi-vjzmo5r">
+      <w:hyperlink w:history="1" r:id="rIdh13qrxkibtndnxmvuhgpj">
         <w:r>
           <w:rPr>
             <w:rFonts w:ascii="Times New Roman" w:cs="Times New Roman" w:eastAsia="Times New Roman" w:hAnsi="Times New Roman"/>
@@ -18740,7 +21213,7 @@
         </w:rPr>
         <w:t xml:space="preserve">M. Sporny, D. Longley, M. Sabadello, D. Reed, O. Steele, and C. Allen, “Decentralized identifiers (DIDs) v1.0,” W3C Recommendation, Jul. 2022. [Online]. Available: https://www.w3.org/TR/did-core/ [Online]. Available: </w:t>
       </w:r>
-      <w:hyperlink w:history="1" r:id="rIddh-icl6jtfgxsoe7dpfma">
+      <w:hyperlink w:history="1" r:id="rIdqdoigtfxh_mxtnnzxij82">
         <w:r>
           <w:rPr>
             <w:rFonts w:ascii="Times New Roman" w:cs="Times New Roman" w:eastAsia="Times New Roman" w:hAnsi="Times New Roman"/>
@@ -18778,7 +21251,7 @@
         </w:rPr>
         <w:t xml:space="preserve">A. Ouaddah, A. Abou Elkalam, and A. Ait Ouahman, “FairAccess: A new blockchain-based access control framework for the Internet of Things,” Secur. Commun. Netw., vol. 9, no. 18, pp. 5943–5964, 2016, </w:t>
       </w:r>
-      <w:hyperlink w:history="1" r:id="rId-qccxyqyg58ocjsgv-igm">
+      <w:hyperlink w:history="1" r:id="rId_yqe_otbyqexe4zaatugy">
         <w:r>
           <w:rPr>
             <w:rFonts w:ascii="Times New Roman" w:cs="Times New Roman" w:eastAsia="Times New Roman" w:hAnsi="Times New Roman"/>
@@ -18816,7 +21289,7 @@
         </w:rPr>
         <w:t xml:space="preserve">O. Novo, “Blockchain meets IoT: An architecture for scalable access management in IoT,” IEEE Internet Things J., vol. 5, no. 2, Apr. 2018, </w:t>
       </w:r>
-      <w:hyperlink w:history="1" r:id="rIdno3zd3qj5zlglu393c-yw">
+      <w:hyperlink w:history="1" r:id="rIda2whz1oqlkztwe9xydbnq">
         <w:r>
           <w:rPr>
             <w:rFonts w:ascii="Times New Roman" w:cs="Times New Roman" w:eastAsia="Times New Roman" w:hAnsi="Times New Roman"/>
@@ -18854,7 +21327,7 @@
         </w:rPr>
         <w:t xml:space="preserve">E. Androulaki et al., “Hyperledger Fabric: A distributed operating system for permissioned blockchains,” in Proc. 13th EuroSys Conf., Porto, Portugal, Apr. 2018, Art. no. 30, </w:t>
       </w:r>
-      <w:hyperlink w:history="1" r:id="rIdt4upqtgthfwjclk0a1-yr">
+      <w:hyperlink w:history="1" r:id="rIdt5za5yaaq47no2s-lqict">
         <w:r>
           <w:rPr>
             <w:rFonts w:ascii="Times New Roman" w:cs="Times New Roman" w:eastAsia="Times New Roman" w:hAnsi="Times New Roman"/>
@@ -18892,7 +21365,7 @@
         </w:rPr>
         <w:t xml:space="preserve">H. Moniz, “The Istanbul BFT consensus algorithm,” </w:t>
       </w:r>
-      <w:hyperlink w:history="1" r:id="rIdmihtuplka6dlzmjowestd">
+      <w:hyperlink w:history="1" r:id="rIdqibtl2e_fmma-mf9gnm-o">
         <w:r>
           <w:rPr>
             <w:rFonts w:ascii="Times New Roman" w:cs="Times New Roman" w:eastAsia="Times New Roman" w:hAnsi="Times New Roman"/>
@@ -18930,7 +21403,7 @@
         </w:rPr>
         <w:t xml:space="preserve">M. Castro and B. Liskov, “Practical Byzantine fault tolerance,” in Proc. 3rd USENIX Symp. Oper. Syst. Design Implement. (OSDI), New Orleans, LA, USA, Feb. 1999, pp. 173–186. [Online]. Available: </w:t>
       </w:r>
-      <w:hyperlink w:history="1" r:id="rIddsjc12kywmyo8xq7gquju">
+      <w:hyperlink w:history="1" r:id="rIdz2kj5oy5twuojgkdybaoc">
         <w:r>
           <w:rPr>
             <w:rFonts w:ascii="Times New Roman" w:cs="Times New Roman" w:eastAsia="Times New Roman" w:hAnsi="Times New Roman"/>
@@ -18968,7 +21441,7 @@
         </w:rPr>
         <w:t xml:space="preserve">M. Dahlmanns, J. Lohmöller, I. B. Fink, J. Pennekamp, K. Wehrle, and M. Henze, “Easing the conscience with OPC UA: An Internet-wide study on insecure deployments,” in Proc. ACM Internet Meas. Conf. (IMC), Virtual Event, Oct. 2020, pp. 101–110, </w:t>
       </w:r>
-      <w:hyperlink w:history="1" r:id="rIddvrnszb9lipbodsxgroal">
+      <w:hyperlink w:history="1" r:id="rId9fmdg1d4sn2gpytzabnwe">
         <w:r>
           <w:rPr>
             <w:rFonts w:ascii="Times New Roman" w:cs="Times New Roman" w:eastAsia="Times New Roman" w:hAnsi="Times New Roman"/>
@@ -19006,7 +21479,7 @@
         </w:rPr>
         <w:t xml:space="preserve">B. Blanchet, “Modeling and verifying security protocols with the applied pi calculus and ProVerif,” Found. Trends Privacy Secur., vol. 1, no. 1–2, pp. 1–135, 2016, </w:t>
       </w:r>
-      <w:hyperlink w:history="1" r:id="rIdb-s0o6wdxqs-k4suqtiki">
+      <w:hyperlink w:history="1" r:id="rIde4mhj7dohreeor0gejjcg">
         <w:r>
           <w:rPr>
             <w:rFonts w:ascii="Times New Roman" w:cs="Times New Roman" w:eastAsia="Times New Roman" w:hAnsi="Times New Roman"/>
@@ -19044,7 +21517,7 @@
         </w:rPr>
         <w:t xml:space="preserve">J. Richer, Ed., “OAuth 2.0 token introspection,” Internet Eng. Task Force, RFC 7662, Oct. 2015. [Online]. Available: </w:t>
       </w:r>
-      <w:hyperlink w:history="1" r:id="rIdobuguhk9ps4c-hemp-oid">
+      <w:hyperlink w:history="1" r:id="rIdcrhrpcjqoyfmlbepulvgy">
         <w:r>
           <w:rPr>
             <w:rFonts w:ascii="Times New Roman" w:cs="Times New Roman" w:eastAsia="Times New Roman" w:hAnsi="Times New Roman"/>
@@ -19082,7 +21555,7 @@
         </w:rPr>
         <w:t xml:space="preserve">J. Sermersheim, Ed., “Lightweight Directory Access Protocol (LDAP): The protocol,” Internet Eng. Task Force, RFC 4511, Jun. 2006. [Online]. Available: </w:t>
       </w:r>
-      <w:hyperlink w:history="1" r:id="rId_tcjopmugmm_ockmfgp6o">
+      <w:hyperlink w:history="1" r:id="rIda80u8gphe1iaty_teuqek">
         <w:r>
           <w:rPr>
             <w:rFonts w:ascii="Times New Roman" w:cs="Times New Roman" w:eastAsia="Times New Roman" w:hAnsi="Times New Roman"/>

</xml_diff>

<commit_message>
Paper v3.1: clean P4 consensus-halt repeat (single restart): 108 s after submit, 73 s after restart
Co-Authored-By: Claude Sonnet 5.5 <noreply@anthropic.com>
Claude-Session: https://claude.ai/code/session_013MWEbKStV7gCMmHJrttV1T
</commit_message>
<xml_diff>
--- a/paper/paper.docx
+++ b/paper/paper.docx
@@ -18838,7 +18838,7 @@
           <w:sz w:val="20"/>
           <w:szCs w:val="20"/>
         </w:rPr>
-        <w:t xml:space="preserve">To test the consensus assumption we stopped two of the four validators for 40 s (IBFT 2.0 needs three, so block production halts) while 50 devices were served and a device was revoked 5 s after the stop. The PEP kept answering: 100% of the requests were granted during the halt, as the cache and the still-reachable node serve the last committed state. The revoked device, however, stayed accepted until consensus resumed and the transaction was mined: enforcement came 126.2 s after the validators were restarted and 161.1 s after submission (3 runs). The staleness bound of BC-ZTA therefore runs from finalisation of the revocation, not from its submission, and a consensus halt is a window in which revocations cannot take effect; a central directory is not affected by this particular failure. The delay is much longer than the halt itself (40 s): block production stayed frozen for 126 s after the validators were restarted. This is consistent with the round-change rule of IBFT 2.0, in which the timeout of a round doubles after each failed round (base 4 s in our configuration), so the surviving and the restarted validators needed one long round to agree again; shorter base timeouts or supervised automatic restarts of validators would reduce it, and an operator that needs bounded revocation latency during a halt must additionally enforce revocations at the PEP by a short-lived local deny list.</w:t>
+        <w:t xml:space="preserve">To test the consensus assumption we stopped two of the four validators for 40 s (IBFT 2.0 needs three, so block production halts) while 50 devices were served and a device was revoked 5 s after the stop. The PEP kept answering: 100% of the requests were granted during the halt, as the cache and the still-reachable node serve the last committed state. The revoked device, however, stayed accepted until consensus resumed and the transaction was mined: enforcement came 73.4 s after the validators were restarted and 108.4 s after submission (3 runs). The staleness bound of BC-ZTA therefore runs from finalisation of the revocation, not from its submission, and a consensus halt is a window in which revocations cannot take effect; a central directory is not affected by this particular failure. The delay is much longer than the halt itself (40 s): block production stayed frozen for 73 s after the validators were restarted. This is consistent with the round-change rule of IBFT 2.0, in which the timeout of a round doubles after each failed round (base 4 s in our configuration), so the surviving and the restarted validators needed one long round to agree again; shorter base timeouts or supervised automatic restarts of validators would reduce it, and an operator that needs bounded revocation latency during a halt must additionally enforce revocations at the PEP by a short-lived local deny list.</w:t>
       </w:r>
     </w:p>
     <w:p>
@@ -19820,7 +19820,7 @@
           <w:sz w:val="20"/>
           <w:szCs w:val="20"/>
         </w:rPr>
-        <w:t xml:space="preserve">We presented BC-ZTA, a blockchain-assisted zero-trust architecture that keeps consensus off the per-request path through edge-cached, Merkle-verified state and asynchronous batched anchoring. Four Solidity contracts pass 15 unit tests, and measured gas shows batch anchoring is 68–1351× cheaper per record than per-event logging for batches of 50–1,000 records. In end-to-end tests on a seven-VM Google Cloud deployment with a four-validator Besu network, BC-ZTA decided in 5.4 ms on average at 50 devices and served 200 devices without failures with about one on-chain write per second, and kept deciding while one validator was stopped, while the synchronous design needed 1.4 s at 50 devices and answered only 40% of the requests at 200 devices; the price is a revocation delay of about 1.3 s with event-driven invalidation. A baseline with a central directory and pushed revocations, which we added to test whether the ledger is needed for speed, has the same latency and revokes in 109 ms; the case for the ledger therefore rests on removing any single operator’s control over identity state and on audit that third parties can verify, not on performance. A fail-closed bound of twice the cache lifetime, a read quorum of two validators, replicated gateways and the behaviour during a consensus halt (revocations wait for consensus, here 161 s on average) are evaluated in Section VI-J. All forged, replayed, stale, unregistered, tampered and policy-violating requests were rejected. The evaluation used cloud VMs in a single zone with injected network delay and an emulated device population. Future work includes a multi-site Besu deployment with real network delay, physical devices and industrial protocols, clustered production IAM baselines, learning-based trust scoring and post-quantum signatures.</w:t>
+        <w:t xml:space="preserve">We presented BC-ZTA, a blockchain-assisted zero-trust architecture that keeps consensus off the per-request path through edge-cached, Merkle-verified state and asynchronous batched anchoring. Four Solidity contracts pass 15 unit tests, and measured gas shows batch anchoring is 68–1351× cheaper per record than per-event logging for batches of 50–1,000 records. In end-to-end tests on a seven-VM Google Cloud deployment with a four-validator Besu network, BC-ZTA decided in 5.4 ms on average at 50 devices and served 200 devices without failures with about one on-chain write per second, and kept deciding while one validator was stopped, while the synchronous design needed 1.4 s at 50 devices and answered only 40% of the requests at 200 devices; the price is a revocation delay of about 1.3 s with event-driven invalidation. A baseline with a central directory and pushed revocations, which we added to test whether the ledger is needed for speed, has the same latency and revokes in 109 ms; the case for the ledger therefore rests on removing any single operator’s control over identity state and on audit that third parties can verify, not on performance. A fail-closed bound of twice the cache lifetime, a read quorum of two validators, replicated gateways and the behaviour during a consensus halt (revocations wait for consensus, here 108 s on average) are evaluated in Section VI-J. All forged, replayed, stale, unregistered, tampered and policy-violating requests were rejected. The evaluation used cloud VMs in a single zone with injected network delay and an emulated device population. Future work includes a multi-site Besu deployment with real network delay, physical devices and industrial protocols, clustered production IAM baselines, learning-based trust scoring and post-quantum signatures.</w:t>
       </w:r>
     </w:p>
     <w:p>
@@ -19921,7 +19921,7 @@
         </w:rPr>
         <w:t xml:space="preserve">F. Federici, D. Martintoni, and V. Senni, “A zero-trust architecture for remote access in industrial IoT infrastructures,” Electronics, vol. 12, no. 3, Art. no. 566, 2023, </w:t>
       </w:r>
-      <w:hyperlink w:history="1" r:id="rId8ua9rhygqihtdgj8hefgs">
+      <w:hyperlink w:history="1" r:id="rIdw8inwerq6teambwsxzsyv">
         <w:r>
           <w:rPr>
             <w:rFonts w:ascii="Times New Roman" w:cs="Times New Roman" w:eastAsia="Times New Roman" w:hAnsi="Times New Roman"/>
@@ -19959,7 +19959,7 @@
         </w:rPr>
         <w:t xml:space="preserve">C. Zanasi, S. Russo, and M. Colajanni, “Flexible zero trust architecture for the cybersecurity of industrial IoT infrastructures,” Ad Hoc Netw., vol. 156, Art. no. 103414, 2024, </w:t>
       </w:r>
-      <w:hyperlink w:history="1" r:id="rIdjnjbot_p479fbob19_fns">
+      <w:hyperlink w:history="1" r:id="rIdesggkcyaqzhvdkugpuctz">
         <w:r>
           <w:rPr>
             <w:rFonts w:ascii="Times New Roman" w:cs="Times New Roman" w:eastAsia="Times New Roman" w:hAnsi="Times New Roman"/>
@@ -19997,7 +19997,7 @@
         </w:rPr>
         <w:t xml:space="preserve">S. Rose, O. Borchert, S. Mitchell, and S. Connelly, “Zero trust architecture,” Nat. Inst. Standards Technol., Gaithersburg, MD, USA, Spec. Publ. 800-207, Aug. 2020, </w:t>
       </w:r>
-      <w:hyperlink w:history="1" r:id="rIdz7ftwptz2lf0xrqcrfhhr">
+      <w:hyperlink w:history="1" r:id="rIdmsy7mtibg4yoqevpd8kxn">
         <w:r>
           <w:rPr>
             <w:rFonts w:ascii="Times New Roman" w:cs="Times New Roman" w:eastAsia="Times New Roman" w:hAnsi="Times New Roman"/>
@@ -20035,7 +20035,7 @@
         </w:rPr>
         <w:t xml:space="preserve">M. L. Gambo and A. Almulhem, “Zero trust architecture: A systematic literature review,” J. Netw. Syst. Manage., vol. 34, Art. no. 25, 2026, </w:t>
       </w:r>
-      <w:hyperlink w:history="1" r:id="rIdzoa7k4v34dn_loubolbvb">
+      <w:hyperlink w:history="1" r:id="rIdseqkvnbk6p0fptojfs17z">
         <w:r>
           <w:rPr>
             <w:rFonts w:ascii="Times New Roman" w:cs="Times New Roman" w:eastAsia="Times New Roman" w:hAnsi="Times New Roman"/>
@@ -20073,7 +20073,7 @@
         </w:rPr>
         <w:t xml:space="preserve">S. Mushtaq, M. Mohsin, and M. M. Mushtaq, “A systematic literature review on the implementation and challenges of zero trust architecture across domains,” Sensors, vol. 25, no. 19, Art. no. 6118, 2025, </w:t>
       </w:r>
-      <w:hyperlink w:history="1" r:id="rIdk7zaugite5q0rhvb1vwzm">
+      <w:hyperlink w:history="1" r:id="rIdwfeihte1xo-cx2pyk7b2v">
         <w:r>
           <w:rPr>
             <w:rFonts w:ascii="Times New Roman" w:cs="Times New Roman" w:eastAsia="Times New Roman" w:hAnsi="Times New Roman"/>
@@ -20111,7 +20111,7 @@
         </w:rPr>
         <w:t xml:space="preserve">M. A. Azad, S. Abdullah, J. Arshad, H. Lallie, and Y. H. Ahmed, “Verify and trust: A multidimensional survey of zero-trust security in the age of IoT,” Internet Things, vol. 27, Art. no. 101227, 2024, </w:t>
       </w:r>
-      <w:hyperlink w:history="1" r:id="rIdqkektykcnbfoises6wd-6">
+      <w:hyperlink w:history="1" r:id="rIdqzwnlj90vsm61wmf-xmui">
         <w:r>
           <w:rPr>
             <w:rFonts w:ascii="Times New Roman" w:cs="Times New Roman" w:eastAsia="Times New Roman" w:hAnsi="Times New Roman"/>
@@ -20149,7 +20149,7 @@
         </w:rPr>
         <w:t xml:space="preserve">S. Mthethwa, M. T. Dlamini, and E. Jembere, “Zero trust for NHIs based on robust identity and access management for a resilient IoT future,” Sensors, vol. 26, no. 8, Art. no. 2392, 2026, </w:t>
       </w:r>
-      <w:hyperlink w:history="1" r:id="rIdywgchvkq3_bmoogk7wtea">
+      <w:hyperlink w:history="1" r:id="rIdngrvf_s3jku5x5eunhflk">
         <w:r>
           <w:rPr>
             <w:rFonts w:ascii="Times New Roman" w:cs="Times New Roman" w:eastAsia="Times New Roman" w:hAnsi="Times New Roman"/>
@@ -20187,7 +20187,7 @@
         </w:rPr>
         <w:t xml:space="preserve">M. Asim, N. Tariq, A. I. Awad, F. Waheed, S. Bukhari, A. Rafay, and H. H. Song, “Lightweight and privacy-aware decentralized identity management for Industrial Internet of Things applications,” Future Gener. Comput. Syst., vol. 186, Art. no. 108753, 2027 (online Aug. 2026), </w:t>
       </w:r>
-      <w:hyperlink w:history="1" r:id="rIdadnqt8g0zhauhhe8j_bgw">
+      <w:hyperlink w:history="1" r:id="rIdcfcizhxlprd5y0fynpy6c">
         <w:r>
           <w:rPr>
             <w:rFonts w:ascii="Times New Roman" w:cs="Times New Roman" w:eastAsia="Times New Roman" w:hAnsi="Times New Roman"/>
@@ -20225,7 +20225,7 @@
         </w:rPr>
         <w:t xml:space="preserve">E. B. Fernández and A. Brazhuk, “A critical analysis of zero trust architecture (ZTA),” Comput. Stand. Interfaces, vol. 89, Art. no. 103832, 2024, </w:t>
       </w:r>
-      <w:hyperlink w:history="1" r:id="rIdoulusgzu7kw45n1lodi8c">
+      <w:hyperlink w:history="1" r:id="rIde_nhjdq1ooto3qxnbb6-a">
         <w:r>
           <w:rPr>
             <w:rFonts w:ascii="Times New Roman" w:cs="Times New Roman" w:eastAsia="Times New Roman" w:hAnsi="Times New Roman"/>
@@ -20263,7 +20263,7 @@
         </w:rPr>
         <w:t xml:space="preserve">Y.-W. Ma and P.-H. Chiu, “A novel risk-based access control engine in zero trust architecture for IoT network,” Int. J. Inf. Secur., vol. 24, Art. no. 124, 2025, </w:t>
       </w:r>
-      <w:hyperlink w:history="1" r:id="rIdfm69hyy_y_52v_qgsnr82">
+      <w:hyperlink w:history="1" r:id="rIddypsgv7gy0e8oxvuj718o">
         <w:r>
           <w:rPr>
             <w:rFonts w:ascii="Times New Roman" w:cs="Times New Roman" w:eastAsia="Times New Roman" w:hAnsi="Times New Roman"/>
@@ -20301,7 +20301,7 @@
         </w:rPr>
         <w:t xml:space="preserve">M. A. Aleisa, “Blockchain-enabled zero trust architecture for privacy-preserving cybersecurity in IoT environments,” IEEE Access, vol. 13, pp. 18660–18676, 2025, </w:t>
       </w:r>
-      <w:hyperlink w:history="1" r:id="rId1s9srgcycpqvkbcxxwvcl">
+      <w:hyperlink w:history="1" r:id="rIdoa55o6jlqwdetlrbq2ssw">
         <w:r>
           <w:rPr>
             <w:rFonts w:ascii="Times New Roman" w:cs="Times New Roman" w:eastAsia="Times New Roman" w:hAnsi="Times New Roman"/>
@@ -20339,7 +20339,7 @@
         </w:rPr>
         <w:t xml:space="preserve">S. Nie, J. Ren, R. Wu, P. Han, Z. Han, and W. Wan, “Zero-trust access control mechanism based on blockchain and inner-product encryption in the Internet of Things in a 6G environment,” Sensors, vol. 25, no. 2, Art. no. 550, 2025, </w:t>
       </w:r>
-      <w:hyperlink w:history="1" r:id="rIdqmerdwi-ftrv-kesgw_m0">
+      <w:hyperlink w:history="1" r:id="rIdrpm8kitnxi5whwf0lccto">
         <w:r>
           <w:rPr>
             <w:rFonts w:ascii="Times New Roman" w:cs="Times New Roman" w:eastAsia="Times New Roman" w:hAnsi="Times New Roman"/>
@@ -20377,7 +20377,7 @@
         </w:rPr>
         <w:t xml:space="preserve">G. Ali, S. Shah, M. Elaffendi, and N. Ahmad, “Blockchain-based access management framework for interoperable digital twins in industrial IoT,” Front. Blockchain, vol. 8, Art. no. 1693926, 2025, </w:t>
       </w:r>
-      <w:hyperlink w:history="1" r:id="rIdos3928ixeidu2ymvfm7g_">
+      <w:hyperlink w:history="1" r:id="rId8oplao1tue3idekhuuf_6">
         <w:r>
           <w:rPr>
             <w:rFonts w:ascii="Times New Roman" w:cs="Times New Roman" w:eastAsia="Times New Roman" w:hAnsi="Times New Roman"/>
@@ -20415,7 +20415,7 @@
         </w:rPr>
         <w:t xml:space="preserve">M. Essaid and H. Ju, “Blockchain solutions for enhancing security and privacy in Industrial IoT,” Appl. Sci., vol. 15, no. 12, Art. no. 6835, 2025, </w:t>
       </w:r>
-      <w:hyperlink w:history="1" r:id="rIde7n062mjjmigogeg7fnwi">
+      <w:hyperlink w:history="1" r:id="rIdffchaoplyvvi5ceolmame">
         <w:r>
           <w:rPr>
             <w:rFonts w:ascii="Times New Roman" w:cs="Times New Roman" w:eastAsia="Times New Roman" w:hAnsi="Times New Roman"/>
@@ -20453,7 +20453,7 @@
         </w:rPr>
         <w:t xml:space="preserve">D. Li, H. Li, N. Crespi, R. Minerva, M. Li, W. Liang, and K. C. Li, “Hyper-IIoT: A smart contract-inspired access control scheme for resource-constrained Industrial Internet of Things,” IEEE Trans. Sustain. Comput., vol. 10, no. 5, pp. 820–829, 2025, </w:t>
       </w:r>
-      <w:hyperlink w:history="1" r:id="rIdkp1w84nekfahiaksumr0q">
+      <w:hyperlink w:history="1" r:id="rIdjbqff21pa6pwire4vjocp">
         <w:r>
           <w:rPr>
             <w:rFonts w:ascii="Times New Roman" w:cs="Times New Roman" w:eastAsia="Times New Roman" w:hAnsi="Times New Roman"/>
@@ -20491,7 +20491,7 @@
         </w:rPr>
         <w:t xml:space="preserve">Z. Guo, “Blockchain-enhanced smart contracts for formal verification of IoT access control mechanisms,” Alexandria Eng. J., vol. 118, pp. 315–324, 2025, </w:t>
       </w:r>
-      <w:hyperlink w:history="1" r:id="rIdepnyqxa_qmantsswvjjlo">
+      <w:hyperlink w:history="1" r:id="rIdvzkxquofz1m7fogfmkh-x">
         <w:r>
           <w:rPr>
             <w:rFonts w:ascii="Times New Roman" w:cs="Times New Roman" w:eastAsia="Times New Roman" w:hAnsi="Times New Roman"/>
@@ -20529,7 +20529,7 @@
         </w:rPr>
         <w:t xml:space="preserve">A. Singh, V. Pareek, and A. Sharma, “Blockchain-enabled zero trust framework for securing FinTech ecosystems against insider threats and cyber attacks,” </w:t>
       </w:r>
-      <w:hyperlink w:history="1" r:id="rIdrwvaiicz1burmcey7-9bk">
+      <w:hyperlink w:history="1" r:id="rIdydasspqcfbqnng_32p-n9">
         <w:r>
           <w:rPr>
             <w:rFonts w:ascii="Times New Roman" w:cs="Times New Roman" w:eastAsia="Times New Roman" w:hAnsi="Times New Roman"/>
@@ -20567,7 +20567,7 @@
         </w:rPr>
         <w:t xml:space="preserve">M. M. Salim, M. Kim, S. K. Singh, and J. H. Park, “Zero-trust blockchain-enabled framework for scalable and secure IoT networks,” Future Gener. Comput. Syst., vol. 175, Art. no. 108093, 2026, </w:t>
       </w:r>
-      <w:hyperlink w:history="1" r:id="rIdrnwnmmh2jgwyq14ynjm2y">
+      <w:hyperlink w:history="1" r:id="rIdr6ug447lhqwjtjujbmaea">
         <w:r>
           <w:rPr>
             <w:rFonts w:ascii="Times New Roman" w:cs="Times New Roman" w:eastAsia="Times New Roman" w:hAnsi="Times New Roman"/>
@@ -20605,7 +20605,7 @@
         </w:rPr>
         <w:t xml:space="preserve">A. Sharma, S. Rani, and W. Boulila, “Blockchain-based zero trust networks with federated transfer learning for IoT security in industry 5.0,” PLOS ONE, vol. 20, no. 6, Art. no. e0323241, 2025, </w:t>
       </w:r>
-      <w:hyperlink w:history="1" r:id="rIdfycfv52la07tzofgmyu2s">
+      <w:hyperlink w:history="1" r:id="rIdrn21krgeaiuooagyghufc">
         <w:r>
           <w:rPr>
             <w:rFonts w:ascii="Times New Roman" w:cs="Times New Roman" w:eastAsia="Times New Roman" w:hAnsi="Times New Roman"/>
@@ -20643,7 +20643,7 @@
         </w:rPr>
         <w:t xml:space="preserve">S. Mishra, T. S. M. Aldafas, and N. S. Alshammari, “A zero-trust digital twin framework for privacy-preserving multi-dataset intrusion detection in industrial IoT with lightweight blockchain auditing,” Sci. Rep., vol. 16, Art. no. 15236, 2026, </w:t>
       </w:r>
-      <w:hyperlink w:history="1" r:id="rIdsrvqgjkklhyrqefmo1v19">
+      <w:hyperlink w:history="1" r:id="rId8czgxczk6nz_u3wpc0pmm">
         <w:r>
           <w:rPr>
             <w:rFonts w:ascii="Times New Roman" w:cs="Times New Roman" w:eastAsia="Times New Roman" w:hAnsi="Times New Roman"/>
@@ -20681,7 +20681,7 @@
         </w:rPr>
         <w:t xml:space="preserve">Z. Zhai, J. Liu, X. Liu, Y. Mao, X. Zhang, J. Ma, and C. Jin, “A lightweight authentication method for Industrial Internet of Things based on blockchain and Chebyshev chaotic maps,” Future Internet, vol. 17, no. 8, Art. no. 338, 2025, </w:t>
       </w:r>
-      <w:hyperlink w:history="1" r:id="rIdwtyvjxrijqby7tctre2ui">
+      <w:hyperlink w:history="1" r:id="rId8rlce3tmhuhf0hhfmowi0">
         <w:r>
           <w:rPr>
             <w:rFonts w:ascii="Times New Roman" w:cs="Times New Roman" w:eastAsia="Times New Roman" w:hAnsi="Times New Roman"/>
@@ -20719,7 +20719,7 @@
         </w:rPr>
         <w:t xml:space="preserve">T. Ramírez-Gordillo, A. Maciá-Lillo, F. A. Pujol, N. García-D’Urso, J. Azorín-López, and H. Mora, “Decentralized identity management for Internet of Things (IoT) devices using IOTA blockchain technology,” Future Internet, vol. 17, no. 1, Art. no. 49, 2025, </w:t>
       </w:r>
-      <w:hyperlink w:history="1" r:id="rIdltlwaivln9ocztonsoiyc">
+      <w:hyperlink w:history="1" r:id="rIdtdvgpou-n7mouqjvdhypc">
         <w:r>
           <w:rPr>
             <w:rFonts w:ascii="Times New Roman" w:cs="Times New Roman" w:eastAsia="Times New Roman" w:hAnsi="Times New Roman"/>
@@ -20757,7 +20757,7 @@
         </w:rPr>
         <w:t xml:space="preserve">S. I. R. Naqvi, Z. J. Bin, A. Mohsin, M. P. Akhter, and M. M. ur Rahman, “DBoT: Enhancing scalability and privacy in intelligent building spaces through a direct acyclic graph blockchain,” in Proc. 17th Int. Conf. Open Source Syst. Technol. (ICOSST), 2023, </w:t>
       </w:r>
-      <w:hyperlink w:history="1" r:id="rIdly-aard4tgovcc2vwn5zt">
+      <w:hyperlink w:history="1" r:id="rIdl3pfdw5dufrch8rw1jbow">
         <w:r>
           <w:rPr>
             <w:rFonts w:ascii="Times New Roman" w:cs="Times New Roman" w:eastAsia="Times New Roman" w:hAnsi="Times New Roman"/>
@@ -20795,7 +20795,7 @@
         </w:rPr>
         <w:t xml:space="preserve">R. Islam, R. Bose, S. Roy, A. A. Khan, S. Sutradhar, S. Das, F. Ali, and A. A. AlZubi, “Decentralized trust framework for smart cities: A blockchain-enabled cybersecurity and data integrity model,” Sci. Rep., vol. 15, Art. no. 23454, 2025, </w:t>
       </w:r>
-      <w:hyperlink w:history="1" r:id="rIdkivg2erwgpbs-ieq5ga_c">
+      <w:hyperlink w:history="1" r:id="rIdyx7m8loxehmygo5ejgyji">
         <w:r>
           <w:rPr>
             <w:rFonts w:ascii="Times New Roman" w:cs="Times New Roman" w:eastAsia="Times New Roman" w:hAnsi="Times New Roman"/>
@@ -20833,7 +20833,7 @@
         </w:rPr>
         <w:t xml:space="preserve">P. Rani, “A zero-trust framework for securing next-generation Internet of Things network,” in New Trends and Applications in Internet of Things (IoT) and Big Data Analytics, vol. 2. Cham, Switzerland: Springer, 2026, pp. 213–225, </w:t>
       </w:r>
-      <w:hyperlink w:history="1" r:id="rIdpfeqb17zl3vj1ivkpsdtp">
+      <w:hyperlink w:history="1" r:id="rIdli66wsnowgwprftf_jzqc">
         <w:r>
           <w:rPr>
             <w:rFonts w:ascii="Times New Roman" w:cs="Times New Roman" w:eastAsia="Times New Roman" w:hAnsi="Times New Roman"/>
@@ -20871,7 +20871,7 @@
         </w:rPr>
         <w:t xml:space="preserve">B. Chellaprabha, D. Manohari, and J. J. Justus, “Scalable and secure IoT architecture using trust-driven adaptive resource management and edge intelligence,” in Expert Applications and Security (NICE-TEAS 2025), Lecture Notes in Networks and Systems, vol. 1823. Cham, Switzerland: Springer, 2026, pp. 444–461, </w:t>
       </w:r>
-      <w:hyperlink w:history="1" r:id="rIdcoe6wao1ycpdp47xx9kwe">
+      <w:hyperlink w:history="1" r:id="rId69e34f6_hch9gmfzgmndt">
         <w:r>
           <w:rPr>
             <w:rFonts w:ascii="Times New Roman" w:cs="Times New Roman" w:eastAsia="Times New Roman" w:hAnsi="Times New Roman"/>
@@ -20909,7 +20909,7 @@
         </w:rPr>
         <w:t xml:space="preserve">K. Li et al., “Zero-trust foundation models: A new paradigm for secure and collaborative artificial intelligence for Internet of Things,” </w:t>
       </w:r>
-      <w:hyperlink w:history="1" r:id="rId7eqgkcpbytpyampidx-kp">
+      <w:hyperlink w:history="1" r:id="rIdzimvaxlrxiqupcmodu5c_">
         <w:r>
           <w:rPr>
             <w:rFonts w:ascii="Times New Roman" w:cs="Times New Roman" w:eastAsia="Times New Roman" w:hAnsi="Times New Roman"/>
@@ -20947,7 +20947,7 @@
         </w:rPr>
         <w:t xml:space="preserve">S. Ghasemshirazi, G. Shirvani, and M. A. Alipour, “Zero trust: Applications, challenges, and opportunities,” </w:t>
       </w:r>
-      <w:hyperlink w:history="1" r:id="rIda_mgns-0tzzh64qpegdli">
+      <w:hyperlink w:history="1" r:id="rIdta9_cph6rbhm-nqxd9yl7">
         <w:r>
           <w:rPr>
             <w:rFonts w:ascii="Times New Roman" w:cs="Times New Roman" w:eastAsia="Times New Roman" w:hAnsi="Times New Roman"/>
@@ -20985,7 +20985,7 @@
         </w:rPr>
         <w:t xml:space="preserve">A. K. Peepliwal et al., “A prototype model of zero-trust architecture blockchain with EigenTrust-based practical Byzantine fault tolerance protocol to manage decentralized clinical trials,” </w:t>
       </w:r>
-      <w:hyperlink w:history="1" r:id="rIdkucbsnw-pvzun7ebb1tvk">
+      <w:hyperlink w:history="1" r:id="rIdhe_3hn12yksnxxh6k6ff2">
         <w:r>
           <w:rPr>
             <w:rFonts w:ascii="Times New Roman" w:cs="Times New Roman" w:eastAsia="Times New Roman" w:hAnsi="Times New Roman"/>
@@ -21023,7 +21023,7 @@
         </w:rPr>
         <w:t xml:space="preserve">A. Kulkarni, N. A. Hazari, and M. Y. Niamat, “A zero trust-based framework employing blockchain technology and ring oscillator physical unclonable functions for security of field programmable gate array supply chain,” IEEE Access, vol. 12, pp. 89322–89338, 2024. [Online]. Available: </w:t>
       </w:r>
-      <w:hyperlink w:history="1" r:id="rIdgufo3f_kgibsai0egdp8l">
+      <w:hyperlink w:history="1" r:id="rIdft_ilgp87_iif_tomx-ma">
         <w:r>
           <w:rPr>
             <w:rFonts w:ascii="Times New Roman" w:cs="Times New Roman" w:eastAsia="Times New Roman" w:hAnsi="Times New Roman"/>
@@ -21061,7 +21061,7 @@
         </w:rPr>
         <w:t xml:space="preserve">D. Cooper, S. Santesson, S. Farrell, S. Boeyen, R. Housley, and W. Polk, “Internet X.509 public key infrastructure certificate and certificate revocation list (CRL) profile,” Internet Eng. Task Force, RFC 5280, May 2008. [Online]. Available: </w:t>
       </w:r>
-      <w:hyperlink w:history="1" r:id="rId1ydngr-_kfxe0tsdzvhhm">
+      <w:hyperlink w:history="1" r:id="rIdvdcfypgxd5mmam3m55rlz">
         <w:r>
           <w:rPr>
             <w:rFonts w:ascii="Times New Roman" w:cs="Times New Roman" w:eastAsia="Times New Roman" w:hAnsi="Times New Roman"/>
@@ -21099,7 +21099,7 @@
         </w:rPr>
         <w:t xml:space="preserve">S. Santesson, M. Myers, R. Ankney, A. Malpani, S. Galperin, and C. Adams, “X.509 Internet public key infrastructure online certificate status protocol—OCSP,” Internet Eng. Task Force, RFC 6960, Jun. 2013. [Online]. Available: </w:t>
       </w:r>
-      <w:hyperlink w:history="1" r:id="rIdcm2x2a3pgrrj1rzq3r4vl">
+      <w:hyperlink w:history="1" r:id="rIdm6m0s07zt44xmwoaxyin0">
         <w:r>
           <w:rPr>
             <w:rFonts w:ascii="Times New Roman" w:cs="Times New Roman" w:eastAsia="Times New Roman" w:hAnsi="Times New Roman"/>
@@ -21137,7 +21137,7 @@
         </w:rPr>
         <w:t xml:space="preserve">D. Eastlake 3rd, “Transport layer security (TLS) extensions: Extension definitions,” Internet Eng. Task Force, RFC 6066, Jan. 2011. [Online]. Available: </w:t>
       </w:r>
-      <w:hyperlink w:history="1" r:id="rId7h4dork2-w5fmvpxjvee7">
+      <w:hyperlink w:history="1" r:id="rIdwydlwxzl7jzsmkurz8mp4">
         <w:r>
           <w:rPr>
             <w:rFonts w:ascii="Times New Roman" w:cs="Times New Roman" w:eastAsia="Times New Roman" w:hAnsi="Times New Roman"/>
@@ -21175,7 +21175,7 @@
         </w:rPr>
         <w:t xml:space="preserve">B. Laurie, A. Langley, and E. Kasper, “Certificate transparency,” Internet Eng. Task Force, RFC 6962, Jun. 2013. [Online]. Available: </w:t>
       </w:r>
-      <w:hyperlink w:history="1" r:id="rIdh13qrxkibtndnxmvuhgpj">
+      <w:hyperlink w:history="1" r:id="rIdgrjqq-syjz444nlwtfa7h">
         <w:r>
           <w:rPr>
             <w:rFonts w:ascii="Times New Roman" w:cs="Times New Roman" w:eastAsia="Times New Roman" w:hAnsi="Times New Roman"/>
@@ -21213,7 +21213,7 @@
         </w:rPr>
         <w:t xml:space="preserve">M. Sporny, D. Longley, M. Sabadello, D. Reed, O. Steele, and C. Allen, “Decentralized identifiers (DIDs) v1.0,” W3C Recommendation, Jul. 2022. [Online]. Available: https://www.w3.org/TR/did-core/ [Online]. Available: </w:t>
       </w:r>
-      <w:hyperlink w:history="1" r:id="rIdqdoigtfxh_mxtnnzxij82">
+      <w:hyperlink w:history="1" r:id="rIdsrv7qub_upgoobm0akljf">
         <w:r>
           <w:rPr>
             <w:rFonts w:ascii="Times New Roman" w:cs="Times New Roman" w:eastAsia="Times New Roman" w:hAnsi="Times New Roman"/>
@@ -21251,7 +21251,7 @@
         </w:rPr>
         <w:t xml:space="preserve">A. Ouaddah, A. Abou Elkalam, and A. Ait Ouahman, “FairAccess: A new blockchain-based access control framework for the Internet of Things,” Secur. Commun. Netw., vol. 9, no. 18, pp. 5943–5964, 2016, </w:t>
       </w:r>
-      <w:hyperlink w:history="1" r:id="rId_yqe_otbyqexe4zaatugy">
+      <w:hyperlink w:history="1" r:id="rIdbdewnqxnedom7lvkxolyv">
         <w:r>
           <w:rPr>
             <w:rFonts w:ascii="Times New Roman" w:cs="Times New Roman" w:eastAsia="Times New Roman" w:hAnsi="Times New Roman"/>
@@ -21289,7 +21289,7 @@
         </w:rPr>
         <w:t xml:space="preserve">O. Novo, “Blockchain meets IoT: An architecture for scalable access management in IoT,” IEEE Internet Things J., vol. 5, no. 2, Apr. 2018, </w:t>
       </w:r>
-      <w:hyperlink w:history="1" r:id="rIda2whz1oqlkztwe9xydbnq">
+      <w:hyperlink w:history="1" r:id="rId-skcwbtk2j_p-sgmcuvye">
         <w:r>
           <w:rPr>
             <w:rFonts w:ascii="Times New Roman" w:cs="Times New Roman" w:eastAsia="Times New Roman" w:hAnsi="Times New Roman"/>
@@ -21327,7 +21327,7 @@
         </w:rPr>
         <w:t xml:space="preserve">E. Androulaki et al., “Hyperledger Fabric: A distributed operating system for permissioned blockchains,” in Proc. 13th EuroSys Conf., Porto, Portugal, Apr. 2018, Art. no. 30, </w:t>
       </w:r>
-      <w:hyperlink w:history="1" r:id="rIdt5za5yaaq47no2s-lqict">
+      <w:hyperlink w:history="1" r:id="rIdb8butzurwjpztdygik-85">
         <w:r>
           <w:rPr>
             <w:rFonts w:ascii="Times New Roman" w:cs="Times New Roman" w:eastAsia="Times New Roman" w:hAnsi="Times New Roman"/>
@@ -21365,7 +21365,7 @@
         </w:rPr>
         <w:t xml:space="preserve">H. Moniz, “The Istanbul BFT consensus algorithm,” </w:t>
       </w:r>
-      <w:hyperlink w:history="1" r:id="rIdqibtl2e_fmma-mf9gnm-o">
+      <w:hyperlink w:history="1" r:id="rId_q0rdrvvdcho9o6vudxix">
         <w:r>
           <w:rPr>
             <w:rFonts w:ascii="Times New Roman" w:cs="Times New Roman" w:eastAsia="Times New Roman" w:hAnsi="Times New Roman"/>
@@ -21403,7 +21403,7 @@
         </w:rPr>
         <w:t xml:space="preserve">M. Castro and B. Liskov, “Practical Byzantine fault tolerance,” in Proc. 3rd USENIX Symp. Oper. Syst. Design Implement. (OSDI), New Orleans, LA, USA, Feb. 1999, pp. 173–186. [Online]. Available: </w:t>
       </w:r>
-      <w:hyperlink w:history="1" r:id="rIdz2kj5oy5twuojgkdybaoc">
+      <w:hyperlink w:history="1" r:id="rId0pvrfvy7j0sbfgg1_svcg">
         <w:r>
           <w:rPr>
             <w:rFonts w:ascii="Times New Roman" w:cs="Times New Roman" w:eastAsia="Times New Roman" w:hAnsi="Times New Roman"/>
@@ -21441,7 +21441,7 @@
         </w:rPr>
         <w:t xml:space="preserve">M. Dahlmanns, J. Lohmöller, I. B. Fink, J. Pennekamp, K. Wehrle, and M. Henze, “Easing the conscience with OPC UA: An Internet-wide study on insecure deployments,” in Proc. ACM Internet Meas. Conf. (IMC), Virtual Event, Oct. 2020, pp. 101–110, </w:t>
       </w:r>
-      <w:hyperlink w:history="1" r:id="rId9fmdg1d4sn2gpytzabnwe">
+      <w:hyperlink w:history="1" r:id="rIdfzjlqkiuaviqfphhtlhmv">
         <w:r>
           <w:rPr>
             <w:rFonts w:ascii="Times New Roman" w:cs="Times New Roman" w:eastAsia="Times New Roman" w:hAnsi="Times New Roman"/>
@@ -21479,7 +21479,7 @@
         </w:rPr>
         <w:t xml:space="preserve">B. Blanchet, “Modeling and verifying security protocols with the applied pi calculus and ProVerif,” Found. Trends Privacy Secur., vol. 1, no. 1–2, pp. 1–135, 2016, </w:t>
       </w:r>
-      <w:hyperlink w:history="1" r:id="rIde4mhj7dohreeor0gejjcg">
+      <w:hyperlink w:history="1" r:id="rIdjb_w6lac7yee1vaahqolk">
         <w:r>
           <w:rPr>
             <w:rFonts w:ascii="Times New Roman" w:cs="Times New Roman" w:eastAsia="Times New Roman" w:hAnsi="Times New Roman"/>
@@ -21517,7 +21517,7 @@
         </w:rPr>
         <w:t xml:space="preserve">J. Richer, Ed., “OAuth 2.0 token introspection,” Internet Eng. Task Force, RFC 7662, Oct. 2015. [Online]. Available: </w:t>
       </w:r>
-      <w:hyperlink w:history="1" r:id="rIdcrhrpcjqoyfmlbepulvgy">
+      <w:hyperlink w:history="1" r:id="rIdfzft13sdueah6uvv4rvoi">
         <w:r>
           <w:rPr>
             <w:rFonts w:ascii="Times New Roman" w:cs="Times New Roman" w:eastAsia="Times New Roman" w:hAnsi="Times New Roman"/>
@@ -21555,7 +21555,7 @@
         </w:rPr>
         <w:t xml:space="preserve">J. Sermersheim, Ed., “Lightweight Directory Access Protocol (LDAP): The protocol,” Internet Eng. Task Force, RFC 4511, Jun. 2006. [Online]. Available: </w:t>
       </w:r>
-      <w:hyperlink w:history="1" r:id="rIda80u8gphe1iaty_teuqek">
+      <w:hyperlink w:history="1" r:id="rIdv3emmnsjfs35yr9ugdvp5">
         <w:r>
           <w:rPr>
             <w:rFonts w:ascii="Times New Roman" w:cs="Times New Roman" w:eastAsia="Times New Roman" w:hAnsi="Times New Roman"/>

</xml_diff>